<commit_message>
Link mental distress to state labor-market conditions and rebuild empirical editorial
</commit_message>
<xml_diff>
--- a/manuscript/Job_seeking_as_a_psychiatric_exposure.docx
+++ b/manuscript/Job_seeking_as_a_psychiatric_exposure.docx
@@ -15,7 +15,7 @@
         <w:pStyle w:val="Subtitle"/>
       </w:pPr>
       <w:r>
-        <w:t>A public health position from the hiring industry</w:t>
+        <w:t>Labor-market conditions, mental distress, and the responsibilities of the hiring industry</w:t>
       </w:r>
     </w:p>
     <w:p>
@@ -53,7 +53,7 @@
         <w:rPr>
           <w:sz w:val="20"/>
         </w:rPr>
-        <w:t>Article type: Position paper with an empirical illustration</w:t>
+        <w:t>Article type: Empirical editorial / position paper</w:t>
       </w:r>
     </w:p>
     <w:p>
@@ -65,8 +65,11 @@
       </w:r>
     </w:p>
     <w:p>
+      <w:pPr>
+        <w:spacing w:after="100"/>
+      </w:pPr>
       <w:r>
-        <w:t>The health consequences of unemployment are well established, but unemployment status does not describe what people encounter while trying to obtain work. We argue that the organization of job seeking should be treated as a potential psychiatric exposure: a set of conditions that may contribute to anxiety and depressive symptoms through financial insecurity, repeated social evaluation, uncertainty, and loss of control. This perspective places responsibility on employers and hiring platforms as well as on public policy. To establish the public health relevance of the population, we analyzed public National Health Interview Survey data from 2022 and 2025. Among 26,281 adults aged 18‑64, moderate or severe anxiety or depressive symptoms were present in 17.3% of those classified as unemployed, laid off, or looking for work and 8.2% of those classified as employed. The adjusted prevalence ratio was 1.92 (95% confidence interval, 1.58‑2.33). These cross-sectional data establish a burden; they cannot identify harm caused by job seeking or any hiring practice. We propose measuring the conditions of search directly, testing changes to vacancy information, communication, assessment demands, and access to review, and evaluating mental health alongside hiring outcomes. Industry participation should make hiring practices observable and open to independent evaluation. It should not give employers access to applicants’ mental health records. A public health approach asks whether systems can reduce avoidable harm while people seek a livelihood.</w:t>
+        <w:t>The conditions under which people seek work deserve attention as potential psychiatric exposures. A low unemployment rate can coexist with limited hiring, prolonged searches, and uncertainty about whether advertised opportunities will lead to employment. We bring together research on labor-market shocks, job-search experiences, industry surveys, preprints, and reporting, and estimate associations between mental-health burden and market conditions. We linked Behavioral Risk Factor Surveillance System records to state hiring, vacancy, and unemployment measures. The primary analysis included 193,060 adults aged 18–64 who reported being out of work in 607 state-years, 2013–2024. Survey-weighted regressions compared changes within states, accounting for national year effects and demographic composition. A one-percentage-point lower hiring rate was associated with -0.80 percentage points in frequent mental distress (95% confidence interval, -2.05 to 0.45), conditional on unemployment. Doubling unemployed people per opening was associated with 1.71 percentage points more distress (-0.01 to 3.44) in a separate model. Hiring estimates changed direction with lagged exposure; neither main interval excluded zero. These results do not establish that slow hiring causes illness. They show why unemployment status, access to opportunities, and the experience of searching must be measured separately. Employers and platforms should make recruitment conditions observable, enable independent evaluation, and test whether reducing avoidable uncertainty improves mental health. Industry testimony and surveys help identify exposures; representative health data and stronger research designs are needed to estimate their consequences.</w:t>
       </w:r>
     </w:p>
     <w:p>
@@ -77,7 +80,7 @@
         <w:rPr>
           <w:sz w:val="20"/>
         </w:rPr>
-        <w:t>Keywords: job seeking; unemployment; mental health; hiring; public health; structural exposure</w:t>
+        <w:t>Keywords: job seeking; labor market; mental distress; hiring; structural exposure; public health</w:t>
       </w:r>
     </w:p>
     <w:p>
@@ -90,32 +93,27 @@
         <w:pStyle w:val="Heading1"/>
       </w:pPr>
       <w:r>
-        <w:t>The public health question</w:t>
+        <w:t>The health question is about access to work</w:t>
       </w:r>
     </w:p>
     <w:p>
       <w:r>
-        <w:t>Looking for work is an encounter with institutions that control access to income, security, and social participation. An applicant can invest time, complete assessments, and attend interviews without knowing whether a vacancy is funded, when a decision will be made, or whether the application remains under consideration. Each event may appear minor to the organization that produces it. For the person seeking work, repeated uncertainty and evaluation can become a sustained condition of daily life. The question is whether the way hiring is organized contributes to psychiatric symptoms, beyond the consequences of having no job.</w:t>
+        <w:t>For a person trying to obtain a job, the relevant labor market is the one they can enter. An unemployment rate describes how many people are without work and seeking it under a particular statistical definition. It does not describe how often employers hire, how many plausible opportunities an applicant encounters, or how long a search remains unresolved. Associated Press reporting in late 2025 illustrated this distinction through job seekers facing canceled recruitment and long searches during a period of low unemployment and slow hiring. [1] These experiences raise a public health question: when access to work becomes prolonged, uncertain, and difficult to influence, does the environment contribute to mental illness?</w:t>
       </w:r>
     </w:p>
     <w:p>
       <w:r>
-        <w:t>This question extends an established literature. A meta-analysis found poorer mental health among unemployed people and evidence of change following unemployment and reemployment, while also recognizing health selection into employment. [1] More directly, a daily diary study of unemployed job seekers in China found evidence that search activity and distress influenced one another; negative search experiences helped account for the association from searching to distress. [2] Neither finding establishes that every job search is harmful. Together they justify investigating the environment in which searching takes place.</w:t>
+        <w:t>We argue that job seeking should be studied as an encounter with a potentially harmful environment. The exposure includes the availability of suitable work, competition for that work, the demands of applying, and the information employers provide. Its effects may operate through financial insecurity, repeated rejection, diminished control, and uncertainty about the future. This definition includes people searching while employed. It also distinguishes active searching from simply being out of work.</w:t>
       </w:r>
     </w:p>
     <w:p>
       <w:r>
-        <w:t>We define a psychiatric exposure here as a condition or repeated experience that may alter the probability or severity of psychiatric symptoms. The term does not imply a new diagnosis, nor does it classify understandable disappointment as illness. The proposed exposure is the organization of access to work: the rules, information, demands, and decisions encountered during a search. Unemployment status, search activity, and hiring conditions are related but distinct. A person may search while employed, be unemployed without actively searching, or be unable to search because of illness or caregiving.</w:t>
+        <w:t>“Psychiatric exposure” names a research question about conditions that may contribute to symptoms or disorders. It is not a diagnosis or a claim that disappointment is itself illness. The term “psychological recession” is useful only if it directs attention to measurable burdens that conventional economic summaries miss.</w:t>
       </w:r>
     </w:p>
     <w:p>
       <w:r>
-        <w:t>Our position is that avoidable psychiatric harm during job seeking is a public health concern and a responsibility of the hiring industry. “Structural” refers to conditions shared across applicants and shaped by organizational or policy choices, rather than to an applicant’s resilience alone. The social causes of illness often operate through access to resources and control over important circumstances. [3] Applying that perspective to hiring directs attention to who designs the process, who bears its costs, and who can change it.</w:t>
-      </w:r>
-    </w:p>
-    <w:p>
-      <w:r>
-        <w:t>We use “psychological recession” as a framing phrase for the burden people may experience while trying to secure work, including when aggregate economic indicators appear favorable. It is not a diagnostic category, an index with a validated cutoff, or a claim that mental health follows a particular business cycle. The contribution is a testable public health position: access to employment should be evaluated partly by its consequences for the people who must navigate it.</w:t>
+        <w:t>Our industry perspective matters because recruitment systems are designed and maintained by identifiable organizations. Those organizations determine whether applications receive a response, whether assessments require substantial unpaid time, and whether a posting accurately describes a current opportunity. Responsibility for these conditions cannot rest entirely on applicants’ coping skills. At the same time, industry familiarity is not evidence of causation. We therefore combine a focused review of different kinds of evidence with a reproducible analysis relating mental-health burden to actual labor-market measures.</w:t>
       </w:r>
     </w:p>
     <w:p>
@@ -123,32 +121,76 @@
         <w:pStyle w:val="Heading1"/>
       </w:pPr>
       <w:r>
-        <w:t>What the evidence does and does not establish</w:t>
+        <w:t>What the existing evidence tells us</w:t>
+      </w:r>
+    </w:p>
+    <w:p>
+      <w:pPr>
+        <w:pStyle w:val="Heading2"/>
+      </w:pPr>
+      <w:r>
+        <w:t>Labor demand can matter beyond employment status</w:t>
       </w:r>
     </w:p>
     <w:p>
       <w:r>
-        <w:t>Several pathways make this position plausible. First, searching takes place within material constraints. In a longitudinal study after job loss, financial strain and diminished personal control were linked to depression and poorer functioning. [4] A four-wave study of job seekers in three countries likewise associated perceived unemployment insurance generosity with better mental health through lower time pressure and financial strain. [5] These studies support attention to resources and control. They do not show that better application design can compensate for inadequate income or a shortage of suitable jobs.</w:t>
+        <w:t>The association between unemployment and poor mental health is well established, including evidence of change following unemployment and reemployment. Health also affects entry to and exit from employment. [2] The more specific question is whether the opportunities available in a labor market alter this burden. Charles and DeCicca studied working-age men in 58 large US metropolitan areas and found that worsening conditions were associated with poorer mental health in groups with weaker employment prospects, including less-educated and Black men. [3]</w:t>
       </w:r>
     </w:p>
     <w:p>
       <w:r>
-        <w:t>Second, selection exposes applicants to judgments about their competence and value. Research on applicant reactions links perceptions of selection procedures with attitudes toward organizations and aspects of self-perception. [6] This literature is relevant to the experience of hiring, but organizational satisfaction is not a psychiatric outcome. Studies of rejection also complicate simple remedies: specific performance feedback has sometimes reduced well-being among rejected applicants. [7] A prompt, accurate closure notice and an unsolicited personal evaluation are different interventions. Their effects should be tested separately.</w:t>
+        <w:t>A study of Spain’s construction collapse provides a more direct link between demand for labor and health. Farré and colleagues used pre-crisis industry composition and the subsequent contraction to estimate the consequences of job losses in exposed labor markets. Their findings linked the shock to worse mental health in a setting where reemployment was difficult. [4] The design depends on assumptions about the instrument and the pathways from the construction shock to health. It nevertheless addresses a structural change in opportunity, rather than attributing all differences between employed and unemployed people to joblessness itself.</w:t>
       </w:r>
     </w:p>
     <w:p>
       <w:r>
-        <w:t>Third, health can influence the search itself. Symptoms may affect effort, concentration, and persistence, and employers may discriminate against applicants with a history of mental health problems. In a Norwegian correspondence experiment, otherwise comparable applicants who disclosed such a history received fewer favorable responses. [8] This finding supports a possible feedback process between health and exclusion; it does not estimate the size of that process in the United States. It also warns against using applicants’ symptom scores to rank, route, or exclude them.</w:t>
+        <w:t>The expected relationship is not uniformly negative. Clark’s panel study found that unemployed people reported better well-being when unemployment was more common in their reference groups, particularly among men. [5] Reduced stigma may coexist with worse employment prospects. In US BRFSS data, Gagné and colleagues found that the associations of short- and long-duration out-of-work status with distress among young adults varied over time. [6] A credible account must allow for these differences instead of assuming one psychological response to every downturn.</w:t>
+      </w:r>
+    </w:p>
+    <w:p>
+      <w:pPr>
+        <w:pStyle w:val="Heading2"/>
+      </w:pPr>
+      <w:r>
+        <w:t>Search experiences offer plausible pathways</w:t>
       </w:r>
     </w:p>
     <w:p>
       <w:r>
-        <w:t>Finally, harm is not inevitable. A randomized job-search workshop study found improvements in reemployment and mental health at two years. [9] That evidence demonstrates that support during unemployment can matter. It does not validate particular job-board features, and it should not shift all responsibility onto applicants to cope better. The unresolved question is how much burden could be prevented by changing the conditions they encounter.</w:t>
+        <w:t>A daily diary study of unemployed people in China linked job searching and psychological distress in both directions; negative search experiences helped explain the association from searching to distress. [7] Longitudinal research after job loss also linked financial strain and diminished personal control to depression and impaired functioning. [8] In a study across three countries, perceived unemployment-insurance generosity was associated with mental health through financial strain and time pressure. [9] Together, these findings make the conditions of searching relevant to prevention. They do not show that an improved application process can compensate for a shortage of suitable jobs or inadequate income.</w:t>
       </w:r>
     </w:p>
     <w:p>
       <w:r>
-        <w:t>Our industry perspective is useful because employers, recruitment firms, and platforms can document and alter those conditions. It also creates a competing interest: organizations may prefer explanations that preserve their own practices. The appropriate response is explicit disclosure, public methods, independent evaluation, and publication of unfavorable results. Insider knowledge should generate specific questions, not substitute for evidence.</w:t>
+        <w:t>There is also a possible feedback loop. A Norwegian correspondence experiment found fewer positive employer responses when applications disclosed a history of mental health problems. [10] Poor mental health can therefore be both an outcome of difficult access to work and a source of further exclusion. The mechanism is not captured by counting vacancies alone. A 2026 Upjohn working paper, using Survey of Household Economics and Decisionmaking data, relates labor-market tightness to job changes and job quality. [11] It offers evidence about opportunity and the quality of work obtained, not a psychiatric effect estimate.</w:t>
+      </w:r>
+    </w:p>
+    <w:p>
+      <w:pPr>
+        <w:pStyle w:val="Heading2"/>
+      </w:pPr>
+      <w:r>
+        <w:t>Industry surveys and reporting identify experiences worth measuring</w:t>
+      </w:r>
+    </w:p>
+    <w:p>
+      <w:r>
+        <w:t>Grey literature is essential for identifying features of contemporary recruitment that health surveys seldom ask about. It must also be read at the level of its actual questions and denominators. Resume Genius surveyed 1,000 active US job seekers in August 2024, with 500 employed and 500 unemployed respondents. Seventy-two percent reported that searching had negatively affected their mental health at some point in their lives. [12] The outcome is a lifetime, self-attributed experience in an online sample; it is not the prevalence of current depression or anxiety. Forbes subsequently reported the same survey. [13] The two publications represent one source of participants, not independent confirmation.</w:t>
+      </w:r>
+    </w:p>
+    <w:p>
+      <w:r>
+        <w:t>Greenhouse’s 2024 report summary described a survey of 2,500 workers across the United States, United Kingdom, and Germany and reported heightened anxiety among US respondents, alongside post-interview nonresponse. [14] The multinational sample total should not be used as the denominator for the US anxiety statistic. The public summary also does not establish whether nonresponse or a suspected “ghost job” caused clinical symptoms. Huntr’s reports provide application and search-process information from platform users, but user selection, incomplete searches, and self-reported events limit population claims. The Q1 2026 report itself cautions that applicants’ perceptions of AI rejection do not verify employers’ use of automatic rejection. [15]</w:t>
+      </w:r>
+    </w:p>
+    <w:p>
+      <w:r>
+        <w:t>A Federal Reserve qualitative study adds a different form of evidence: 63 participants in 11 focus groups held in late 2025 described financial pressure, unstable work, and barriers to obtaining better employment. [16] Such accounts help identify mechanisms and the language people use to describe their experience. They cannot supply a population prevalence or isolate the contribution of hiring from housing costs, caregiving, and other pressures.</w:t>
+      </w:r>
+    </w:p>
+    <w:p>
+      <w:r>
+        <w:t>Preprints warrant the same scrutiny. Ng’s ghost-jobs preprint classified Glassdoor interview reviews using text models. The often-quoted 21% refers to classifier-positive reviews in a selected sample, not a probability sample of all advertised vacancies. Employer intent was not independently verified, and psychiatric outcomes were not measured. [17] It is useful as exploratory measurement work. Those data cannot establish the population prevalence of nonexistent vacancies.</w:t>
       </w:r>
     </w:p>
     <w:p>
@@ -156,7 +198,7 @@
         <w:pStyle w:val="Heading1"/>
       </w:pPr>
       <w:r>
-        <w:t>An empirical illustration using public data</w:t>
+        <w:t>Linking public mental-health data to market conditions</w:t>
       </w:r>
     </w:p>
     <w:p>
@@ -164,17 +206,32 @@
         <w:pStyle w:val="Heading2"/>
       </w:pPr>
       <w:r>
-        <w:t>Data and population</w:t>
+        <w:t>Sources and population</w:t>
       </w:r>
     </w:p>
     <w:p>
       <w:r>
-        <w:t>We used the 2022 and 2025 National Health Interview Survey (NHIS) Sample Adult public-use files, obtained from the National Center for Health Statistics (NCHS). NHIS samples the civilian noninstitutionalized United States population. Both years contain the same employment recodes and the eight-item Patient Health Questionnaire (PHQ-8) and seven-item Generalized Anxiety Disorder scale (GAD-7). [10, 11] These are two survey snapshots, not a panel following the same people. We selected them for compatible measures, not to represent every intervening year.</w:t>
+        <w:t>We linked public annual records from the Behavioral Risk Factor Surveillance System (BRFSS) to state labor-market data from the Bureau of Labor Statistics (BLS). BRFSS provides the respondent’s state, survey year, employment category, demographic characteristics, survey weight, and number of days in the past month when mental health was not good. We used 2013 onward to maintain the EMPLOY1 employment-status series, after the major 2011 survey-weighting and cellphone changes. [18] The primary population was adults aged 18–64 reporting that they were out of work for less than one year or for at least one year. These categories do not verify active search, willingness to accept work, or exposure to a particular job board. Employed and self-employed adults were analyzed separately for context.</w:t>
       </w:r>
     </w:p>
     <w:p>
       <w:r>
-        <w:t>The analysis included adults aged 18‑64. The comparison was between the NHIS category “Unemployed, laid off, looking for work” (EMPWHYNOT_A = 1) and the employed recode (EMPWRKLSW1_A = 1). The latter includes certain temporary absences, seasonal or contract work within the previous year, and unpaid work in a family business. Other reasons for not working were excluded. For readability, we refer to the first category as the unemployment/search group. It is broader than verified active job seeking and supplies no information about applications, rejection, or hiring platforms. Employed respondents may also be searching.</w:t>
+        <w:t>The primary period was 2013–2024. The available files omitted New Jersey in 2019, Florida in 2021, Kentucky and Pennsylvania in 2023, and Tennessee in 2024. No missing state-year was imputed. We excluded respondents missing the outcome, age, sex, education, race/ethnicity, or a positive survey weight. The final out-of-work analysis included 193,060 respondents in 607 state-years across all 50 states and the District of Columbia. The corresponding employed analysis included 2,223,024 respondents. The technical note reports the sample flow.</w:t>
+      </w:r>
+    </w:p>
+    <w:p>
+      <w:r>
+        <w:t>Frequent mental distress was defined as 14 or more mentally unhealthy days in the previous 30 days, following CDC’s surveillance definition. [19] We also analyzed the reported number of days, from zero to 30. Neither measure is a clinician-confirmed disorder. The BRFSS question includes stress, depression, and problems with emotions; it does not identify their source.</w:t>
+      </w:r>
+    </w:p>
+    <w:p>
+      <w:r>
+        <w:t>The primary market exposure was the mean of the 12 monthly state hires rates from the Job Openings and Labor Turnover Survey (JOLTS), measured as hires per 100 payroll employees. We used the seasonally adjusted series and expressed results for a one-percentage-point lower rate. This measures employment entry activity, including job-to-job movement; it is not an unemployed person’s probability of finding a job. State JOLTS estimates combine survey information with modeled administrative inputs. [20] We adjusted the primary model for the published annual-average unemployment rate from Local Area Unemployment Statistics (LAUS). [21] Separate models used the mean monthly unemployed-persons-per-opening ratio, expressed per doubling, and the mean job-opening rate, expressed per one-percentage-point decrease. The ratio captures relative scarcity; neither measure identifies whether openings match a particular applicant’s occupation or location.</w:t>
+      </w:r>
+    </w:p>
+    <w:p>
+      <w:r>
+        <w:t>We downloaded 2025 BRFSS and market data as well. However, October 2025 unemployment data were not collected during the federal shutdown. BLS’s 2025 unemployment averages cover 11 months and are not strictly comparable with earlier annual averages. [22] We therefore kept 2025 out of the complete-year primary analysis and evaluated a separately labeled extension through 2025. We did not fill the missing October competition ratio or treat an 11-month ratio as a complete annual measure.</w:t>
       </w:r>
     </w:p>
     <w:p>
@@ -182,50 +239,40 @@
         <w:pStyle w:val="Heading2"/>
       </w:pPr>
       <w:r>
-        <w:t>Outcomes and regression</w:t>
+        <w:t>Regression approach</w:t>
       </w:r>
     </w:p>
     <w:p>
       <w:r>
-        <w:t>The primary outcome was moderate or severe depressive or anxiety symptoms in the previous two weeks: a PHQ-8 or GAD-7 score of at least 10, using the NCHS severity recodes PHQCAT_A and GADCAT_A. [12, 13] Both recodes had to be observed. These measures describe symptom severity, not clinician-confirmed diagnoses. We also analyzed the two outcomes separately using the same sample.</w:t>
+        <w:t>The primary survey-weighted linear probability regression estimated absolute differences in distress. State fixed effects accounted for persistent differences between states; year fixed effects accounted for changes shared nationally. Additional terms included age group, sex as released in each survey, four education categories, and five race/ethnicity categories. In plain language, the model asks whether distress changed when a state’s hiring conditions changed relative to the national pattern, among respondents with the same measured demographic characteristics. It does not attribute the national rise in distress to the national hiring trend.</w:t>
       </w:r>
     </w:p>
     <w:p>
       <w:r>
-        <w:t>We calculated survey-weighted prevalence and fitted modified Poisson regressions with a log link to estimate prevalence ratios. [14] In plain language, the adjusted ratio compares symptom prevalence between the two employment categories after accounting for specified demographic differences. The model was log(expected outcome) = intercept + employment category + year + age group + sex + race and Hispanic origin + education + region. A prevalence ratio is obtained by exponentiating the employment-category coefficient.</w:t>
+        <w:t>The primary hiring coefficient was estimated conditional on unemployment. That is a narrower association than the total health effect of a labor-demand shock, because unemployment may itself be part of that effect. We therefore also estimated hiring without unemployment adjustment. Income and unemployment duration were not adjustment variables in the primary model because they may lie on relevant pathways or reflect health selection. Analyses of the two out-of-work duration groups were reported separately.</w:t>
       </w:r>
     </w:p>
     <w:p>
       <w:r>
-        <w:t>Age groups were 18‑29, 30‑44, 45‑54, and 55‑64. Race and Hispanic origin were grouped as Hispanic, non-Hispanic White, Black, Asian, and other non-Hispanic groups. Education was less than high school, high school or GED, some college or associate degree, and bachelor’s degree or higher. Sex used the two public-file categories, and region used the four Census regions. We did not adjust for current income or financial strain, which could be consequences of unemployment, while recognizing that earlier financial resources may confound the association.</w:t>
+        <w:t>We clustered uncertainty by state to allow observations within a state to be related across respondents and years, using a small-sample correction and a t distribution with 50 degrees of freedom for the 51-state models. This is a state-clustered analysis using survey weights, not a full BRFSS sampling-design variance calculation. It does not propagate uncertainty in BLS’s modeled state estimates. The analysis plan was recorded before fitting these linked models; it was not externally preregistered. All specified checks are reported. The technical note provides the equation and additional implementation detail.</w:t>
+      </w:r>
+    </w:p>
+    <w:p>
+      <w:pPr>
+        <w:pStyle w:val="Heading1"/>
+      </w:pPr>
+      <w:r>
+        <w:t>What the linked analysis found</w:t>
       </w:r>
     </w:p>
     <w:p>
       <w:r>
-        <w:t>Pooled weights were WTFA_A divided by two. We retained the released PSTRAT and PPSU identifiers, including all sampled design units with zero contributions outside the analysis population. Following the NCHS instructions, public-use strata were not relabeled for the 2025 redesign. [11] Confidence intervals used a Taylor-linearized, stratum-centered cluster sandwich variance; prevalence intervals used a logit transformation. We used a conventional t approximation with primary sampling units minus strata as degrees of freedom (1,133 pooled). NCHS cautions that this is a rule of thumb, not an exact NHIS degrees-of-freedom calculation. [11]</w:t>
+        <w:t>Among complete-case respondents in the participating states, weighted frequent mental distress was 21.2% in the out-of-work group in 2013 and 28.5% in 2024. The corresponding employed estimates were 8.6% and 14.9%. These are descriptive annual estimates with changing state coverage and respondent composition; they are not a causal comparison between employment groups or an explanation of the time trend.</w:t>
       </w:r>
     </w:p>
     <w:p>
       <w:r>
-        <w:t>The exploratory analysis plan was written before fitting these models and was not preregistered. Sensitivity analyses required complete responses to all 15 symptom items, narrowed the employed comparator to work in the previous week or temporary absence, and excluded respondents reporting disability. We also bounded prevalence by assigning every missing symptom outcome first to absence and then to presence of symptoms. An employment-category-by-year interaction examined whether the association differed between the two snapshots. The public repository contains frozen source files, checksums, all coding decisions, model coefficients, and executable checks. [15]</w:t>
-      </w:r>
-    </w:p>
-    <w:p>
-      <w:pPr>
-        <w:pStyle w:val="Heading2"/>
-      </w:pPr>
-      <w:r>
-        <w:t>Results</w:t>
-      </w:r>
-    </w:p>
-    <w:p>
-      <w:r>
-        <w:t>The original files contained 27,651 sample adults in 2022 and 24,215 in 2025. Among adults aged 18‑64, 26,487 met the employment criteria. We excluded 85 with missing symptom outcomes and a further 121 with missing covariates. The final sample contained 26,281 adults: 14,080 in 2022 and 12,201 in 2025, including 796 in the unemployment/search group and 25,485 in the employed group. The corresponding unemployment/search counts were 407 and 389 by year.</w:t>
-      </w:r>
-    </w:p>
-    <w:p>
-      <w:r>
-        <w:t>Pooled symptom prevalence was 17.3% (95% confidence interval [CI], 14.2‑20.9) in the unemployment/search group and 8.2% (95% CI, 7.8‑8.6) in the employed group (Figure 1). The unadjusted prevalence ratio was 2.11 (95% CI, 1.73‑2.57); the adjusted ratio was 1.92 (95% CI, 1.58‑2.33). Thus, measured symptoms were nearly twice as prevalent after demographic adjustment. This is an association with a broad employment category, not the estimated causal effect of a job search.</w:t>
+        <w:t>The primary hiring estimate was -0.80 percentage points in distress for a one-percentage-point lower hiring rate (95% confidence interval, -2.05 to 0.45). The unemployment coefficient in the same model was 0.46 percentage points per one-percentage-point higher unemployment (-0.12 to 1.05). Neither interval excluded zero. The estimate for doubling unemployed people per opening was positive, 1.71 percentage points (-0.01 to 3.44), but remained imprecise. The job-opening-rate estimate was also uncertain. Table 1 reports all three exposure definitions with their confidence intervals.</w:t>
       </w:r>
     </w:p>
     <w:p>
@@ -233,76 +280,7 @@
         <w:pStyle w:val="Caption"/>
       </w:pPr>
       <w:r>
-        <w:t>Figure 1. Symptom burden by employment category</w:t>
-      </w:r>
-    </w:p>
-    <w:p>
-      <w:pPr>
-        <w:keepNext/>
-        <w:spacing w:after="60"/>
-      </w:pPr>
-      <w:r>
-        <w:drawing>
-          <wp:inline xmlns:a="http://schemas.openxmlformats.org/drawingml/2006/main" xmlns:pic="http://schemas.openxmlformats.org/drawingml/2006/picture">
-            <wp:extent cx="5943600" cy="2514600"/>
-            <wp:docPr id="1" name="Picture 1" descr="Weighted prevalence was 17.3 percent in the unemployment/search category and 8.2 percent in the employed category. Whiskers show 95 percent confidence intervals."/>
-            <wp:cNvGraphicFramePr>
-              <a:graphicFrameLocks noChangeAspect="1"/>
-            </wp:cNvGraphicFramePr>
-            <a:graphic>
-              <a:graphicData uri="http://schemas.openxmlformats.org/drawingml/2006/picture">
-                <pic:pic>
-                  <pic:nvPicPr>
-                    <pic:cNvPr id="0" name="figure1.png"/>
-                    <pic:cNvPicPr/>
-                  </pic:nvPicPr>
-                  <pic:blipFill>
-                    <a:blip r:embed="rId10"/>
-                    <a:stretch>
-                      <a:fillRect/>
-                    </a:stretch>
-                  </pic:blipFill>
-                  <pic:spPr>
-                    <a:xfrm>
-                      <a:off x="0" y="0"/>
-                      <a:ext cx="5943600" cy="2514600"/>
-                    </a:xfrm>
-                    <a:prstGeom prst="rect"/>
-                  </pic:spPr>
-                </pic:pic>
-              </a:graphicData>
-            </a:graphic>
-          </wp:inline>
-        </w:drawing>
-      </w:r>
-    </w:p>
-    <w:p>
-      <w:pPr>
-        <w:spacing w:line="252" w:lineRule="auto" w:after="180"/>
-      </w:pPr>
-      <w:r>
-        <w:rPr>
-          <w:sz w:val="20"/>
-        </w:rPr>
-        <w:t>Points show pooled survey-weighted prevalence; whiskers show 95% confidence intervals. Adults aged 18‑64 in the 2022 and 2025 NHIS, complete-case sample (n = 26,281). The unemployment/search category is not a verified measure of active searching. Symptoms are PHQ-8 or GAD-7 scores of at least 10, not clinical diagnoses.</w:t>
-      </w:r>
-    </w:p>
-    <w:p>
-      <w:r>
-        <w:t>Associations were present for depressive and anxiety symptoms separately and remained under the sensitivity restrictions (Table 1). Excluding adults with disability attenuated the estimate to 1.70 (95% CI, 1.34‑2.16). That attenuation is consistent with the importance of health selection, but the restriction neither measures prior mental health nor resolves reverse causation. Across the full employment-eligible population, the extreme bounds for missing outcomes were 17.2%–17.5% in the unemployment/search group and 8.2%–8.6% in the employed group. These bounds address item nonresponse, not survey nonparticipation or missing confounders.</w:t>
-      </w:r>
-    </w:p>
-    <w:p>
-      <w:r>
-        <w:t>In 2022, prevalence was 15.7% in the unemployment/search group and 8.2% in the employed group; in 2025, it was 18.6% and 8.3%, respectively. The ratio of the year-specific adjusted prevalence ratios was 1.15 (95% CI, 0.79‑1.68; interaction p = 0.462). The data did not provide clear evidence that the association changed. They cannot establish a worsening trajectory between the two years.</w:t>
-      </w:r>
-    </w:p>
-    <w:p>
-      <w:pPr>
-        <w:pStyle w:val="Caption"/>
-      </w:pPr>
-      <w:r>
-        <w:t>Table 1. Prevalence ratios and sensitivity analyses</w:t>
+        <w:t>Table 1. Labor-market conditions and frequent mental distress</w:t>
       </w:r>
     </w:p>
     <w:tbl>
@@ -328,8 +306,8 @@
       </w:tblPr>
       <w:tblGrid>
         <w:gridCol w:w="4896"/>
-        <w:gridCol w:w="1152"/>
-        <w:gridCol w:w="3312"/>
+        <w:gridCol w:w="1944"/>
+        <w:gridCol w:w="2520"/>
       </w:tblGrid>
       <w:tr>
         <w:trPr>
@@ -352,13 +330,13 @@
                 <w:b/>
                 <w:sz w:val="21"/>
               </w:rPr>
-              <w:t>Analysis</w:t>
+              <w:t>Change in market condition</w:t>
             </w:r>
           </w:p>
         </w:tc>
         <w:tc>
           <w:tcPr>
-            <w:tcW w:type="dxa" w:w="1152"/>
+            <w:tcW w:type="dxa" w:w="1944"/>
             <w:vAlign w:val="center"/>
             <w:shd w:fill="EDF0F2"/>
           </w:tcPr>
@@ -372,13 +350,13 @@
                 <w:b/>
                 <w:sz w:val="21"/>
               </w:rPr>
-              <w:t>Sample n</w:t>
+              <w:t>Distress difference, pp</w:t>
             </w:r>
           </w:p>
         </w:tc>
         <w:tc>
           <w:tcPr>
-            <w:tcW w:type="dxa" w:w="3312"/>
+            <w:tcW w:type="dxa" w:w="2520"/>
             <w:vAlign w:val="center"/>
             <w:shd w:fill="EDF0F2"/>
           </w:tcPr>
@@ -392,379 +370,7 @@
                 <w:b/>
                 <w:sz w:val="21"/>
               </w:rPr>
-              <w:t>Prevalence ratio (95% CI)</w:t>
-            </w:r>
-          </w:p>
-        </w:tc>
-      </w:tr>
-      <w:tr>
-        <w:trPr>
-          <w:cantSplit/>
-        </w:trPr>
-        <w:tc>
-          <w:tcPr>
-            <w:tcW w:type="dxa" w:w="4896"/>
-            <w:vAlign w:val="center"/>
-          </w:tcPr>
-          <w:p>
-            <w:pPr>
-              <w:keepNext/>
-              <w:spacing w:after="0" w:before="0" w:line="252" w:lineRule="auto"/>
-            </w:pPr>
-            <w:r>
-              <w:rPr>
-                <w:b w:val="0"/>
-                <w:sz w:val="21"/>
-              </w:rPr>
-              <w:t>Primary outcome, unadjusted</w:t>
-            </w:r>
-          </w:p>
-        </w:tc>
-        <w:tc>
-          <w:tcPr>
-            <w:tcW w:type="dxa" w:w="1152"/>
-            <w:vAlign w:val="center"/>
-          </w:tcPr>
-          <w:p>
-            <w:pPr>
-              <w:keepNext/>
-              <w:spacing w:after="0" w:before="0" w:line="252" w:lineRule="auto"/>
-            </w:pPr>
-            <w:r>
-              <w:rPr>
-                <w:b w:val="0"/>
-                <w:sz w:val="21"/>
-              </w:rPr>
-              <w:t>26,281</w:t>
-            </w:r>
-          </w:p>
-        </w:tc>
-        <w:tc>
-          <w:tcPr>
-            <w:tcW w:type="dxa" w:w="3312"/>
-            <w:vAlign w:val="center"/>
-          </w:tcPr>
-          <w:p>
-            <w:pPr>
-              <w:keepNext/>
-              <w:spacing w:after="0" w:before="0" w:line="252" w:lineRule="auto"/>
-            </w:pPr>
-            <w:r>
-              <w:rPr>
-                <w:b w:val="0"/>
-                <w:sz w:val="21"/>
-              </w:rPr>
-              <w:t>2.11 (1.73–2.57)</w:t>
-            </w:r>
-          </w:p>
-        </w:tc>
-      </w:tr>
-      <w:tr>
-        <w:trPr>
-          <w:cantSplit/>
-        </w:trPr>
-        <w:tc>
-          <w:tcPr>
-            <w:tcW w:type="dxa" w:w="4896"/>
-            <w:vAlign w:val="center"/>
-          </w:tcPr>
-          <w:p>
-            <w:pPr>
-              <w:keepNext/>
-              <w:spacing w:after="0" w:before="0" w:line="252" w:lineRule="auto"/>
-            </w:pPr>
-            <w:r>
-              <w:rPr>
-                <w:b w:val="0"/>
-                <w:sz w:val="21"/>
-              </w:rPr>
-              <w:t>Primary outcome, adjusted</w:t>
-            </w:r>
-          </w:p>
-        </w:tc>
-        <w:tc>
-          <w:tcPr>
-            <w:tcW w:type="dxa" w:w="1152"/>
-            <w:vAlign w:val="center"/>
-          </w:tcPr>
-          <w:p>
-            <w:pPr>
-              <w:keepNext/>
-              <w:spacing w:after="0" w:before="0" w:line="252" w:lineRule="auto"/>
-            </w:pPr>
-            <w:r>
-              <w:rPr>
-                <w:b w:val="0"/>
-                <w:sz w:val="21"/>
-              </w:rPr>
-              <w:t>26,281</w:t>
-            </w:r>
-          </w:p>
-        </w:tc>
-        <w:tc>
-          <w:tcPr>
-            <w:tcW w:type="dxa" w:w="3312"/>
-            <w:vAlign w:val="center"/>
-          </w:tcPr>
-          <w:p>
-            <w:pPr>
-              <w:keepNext/>
-              <w:spacing w:after="0" w:before="0" w:line="252" w:lineRule="auto"/>
-            </w:pPr>
-            <w:r>
-              <w:rPr>
-                <w:b w:val="0"/>
-                <w:sz w:val="21"/>
-              </w:rPr>
-              <w:t>1.92 (1.58–2.33)</w:t>
-            </w:r>
-          </w:p>
-        </w:tc>
-      </w:tr>
-      <w:tr>
-        <w:trPr>
-          <w:cantSplit/>
-        </w:trPr>
-        <w:tc>
-          <w:tcPr>
-            <w:tcW w:type="dxa" w:w="4896"/>
-            <w:vAlign w:val="center"/>
-          </w:tcPr>
-          <w:p>
-            <w:pPr>
-              <w:keepNext/>
-              <w:spacing w:after="0" w:before="0" w:line="252" w:lineRule="auto"/>
-            </w:pPr>
-            <w:r>
-              <w:rPr>
-                <w:b w:val="0"/>
-                <w:sz w:val="21"/>
-              </w:rPr>
-              <w:t>Depressive symptoms, adjusted</w:t>
-            </w:r>
-          </w:p>
-        </w:tc>
-        <w:tc>
-          <w:tcPr>
-            <w:tcW w:type="dxa" w:w="1152"/>
-            <w:vAlign w:val="center"/>
-          </w:tcPr>
-          <w:p>
-            <w:pPr>
-              <w:keepNext/>
-              <w:spacing w:after="0" w:before="0" w:line="252" w:lineRule="auto"/>
-            </w:pPr>
-            <w:r>
-              <w:rPr>
-                <w:b w:val="0"/>
-                <w:sz w:val="21"/>
-              </w:rPr>
-              <w:t>26,281</w:t>
-            </w:r>
-          </w:p>
-        </w:tc>
-        <w:tc>
-          <w:tcPr>
-            <w:tcW w:type="dxa" w:w="3312"/>
-            <w:vAlign w:val="center"/>
-          </w:tcPr>
-          <w:p>
-            <w:pPr>
-              <w:keepNext/>
-              <w:spacing w:after="0" w:before="0" w:line="252" w:lineRule="auto"/>
-            </w:pPr>
-            <w:r>
-              <w:rPr>
-                <w:b w:val="0"/>
-                <w:sz w:val="21"/>
-              </w:rPr>
-              <w:t>2.18 (1.75–2.71)</w:t>
-            </w:r>
-          </w:p>
-        </w:tc>
-      </w:tr>
-      <w:tr>
-        <w:trPr>
-          <w:cantSplit/>
-        </w:trPr>
-        <w:tc>
-          <w:tcPr>
-            <w:tcW w:type="dxa" w:w="4896"/>
-            <w:vAlign w:val="center"/>
-          </w:tcPr>
-          <w:p>
-            <w:pPr>
-              <w:keepNext/>
-              <w:spacing w:after="0" w:before="0" w:line="252" w:lineRule="auto"/>
-            </w:pPr>
-            <w:r>
-              <w:rPr>
-                <w:b w:val="0"/>
-                <w:sz w:val="21"/>
-              </w:rPr>
-              <w:t>Anxiety symptoms, adjusted</w:t>
-            </w:r>
-          </w:p>
-        </w:tc>
-        <w:tc>
-          <w:tcPr>
-            <w:tcW w:type="dxa" w:w="1152"/>
-            <w:vAlign w:val="center"/>
-          </w:tcPr>
-          <w:p>
-            <w:pPr>
-              <w:keepNext/>
-              <w:spacing w:after="0" w:before="0" w:line="252" w:lineRule="auto"/>
-            </w:pPr>
-            <w:r>
-              <w:rPr>
-                <w:b w:val="0"/>
-                <w:sz w:val="21"/>
-              </w:rPr>
-              <w:t>26,281</w:t>
-            </w:r>
-          </w:p>
-        </w:tc>
-        <w:tc>
-          <w:tcPr>
-            <w:tcW w:type="dxa" w:w="3312"/>
-            <w:vAlign w:val="center"/>
-          </w:tcPr>
-          <w:p>
-            <w:pPr>
-              <w:keepNext/>
-              <w:spacing w:after="0" w:before="0" w:line="252" w:lineRule="auto"/>
-            </w:pPr>
-            <w:r>
-              <w:rPr>
-                <w:b w:val="0"/>
-                <w:sz w:val="21"/>
-              </w:rPr>
-              <w:t>1.99 (1.58–2.52)</w:t>
-            </w:r>
-          </w:p>
-        </w:tc>
-      </w:tr>
-      <w:tr>
-        <w:trPr>
-          <w:cantSplit/>
-        </w:trPr>
-        <w:tc>
-          <w:tcPr>
-            <w:tcW w:type="dxa" w:w="4896"/>
-            <w:vAlign w:val="center"/>
-          </w:tcPr>
-          <w:p>
-            <w:pPr>
-              <w:keepNext/>
-              <w:spacing w:after="0" w:before="0" w:line="252" w:lineRule="auto"/>
-            </w:pPr>
-            <w:r>
-              <w:rPr>
-                <w:b w:val="0"/>
-                <w:sz w:val="21"/>
-              </w:rPr>
-              <w:t>All symptom items complete, adjusted</w:t>
-            </w:r>
-          </w:p>
-        </w:tc>
-        <w:tc>
-          <w:tcPr>
-            <w:tcW w:type="dxa" w:w="1152"/>
-            <w:vAlign w:val="center"/>
-          </w:tcPr>
-          <w:p>
-            <w:pPr>
-              <w:keepNext/>
-              <w:spacing w:after="0" w:before="0" w:line="252" w:lineRule="auto"/>
-            </w:pPr>
-            <w:r>
-              <w:rPr>
-                <w:b w:val="0"/>
-                <w:sz w:val="21"/>
-              </w:rPr>
-              <w:t>26,170</w:t>
-            </w:r>
-          </w:p>
-        </w:tc>
-        <w:tc>
-          <w:tcPr>
-            <w:tcW w:type="dxa" w:w="3312"/>
-            <w:vAlign w:val="center"/>
-          </w:tcPr>
-          <w:p>
-            <w:pPr>
-              <w:keepNext/>
-              <w:spacing w:after="0" w:before="0" w:line="252" w:lineRule="auto"/>
-            </w:pPr>
-            <w:r>
-              <w:rPr>
-                <w:b w:val="0"/>
-                <w:sz w:val="21"/>
-              </w:rPr>
-              <w:t>1.91 (1.57–2.32)</w:t>
-            </w:r>
-          </w:p>
-        </w:tc>
-      </w:tr>
-      <w:tr>
-        <w:trPr>
-          <w:cantSplit/>
-        </w:trPr>
-        <w:tc>
-          <w:tcPr>
-            <w:tcW w:type="dxa" w:w="4896"/>
-            <w:vAlign w:val="center"/>
-          </w:tcPr>
-          <w:p>
-            <w:pPr>
-              <w:keepNext/>
-              <w:spacing w:after="0" w:before="0" w:line="252" w:lineRule="auto"/>
-            </w:pPr>
-            <w:r>
-              <w:rPr>
-                <w:b w:val="0"/>
-                <w:sz w:val="21"/>
-              </w:rPr>
-              <w:t>Narrower employed comparator, adjusted</w:t>
-            </w:r>
-          </w:p>
-        </w:tc>
-        <w:tc>
-          <w:tcPr>
-            <w:tcW w:type="dxa" w:w="1152"/>
-            <w:vAlign w:val="center"/>
-          </w:tcPr>
-          <w:p>
-            <w:pPr>
-              <w:keepNext/>
-              <w:spacing w:after="0" w:before="0" w:line="252" w:lineRule="auto"/>
-            </w:pPr>
-            <w:r>
-              <w:rPr>
-                <w:b w:val="0"/>
-                <w:sz w:val="21"/>
-              </w:rPr>
-              <w:t>26,042</w:t>
-            </w:r>
-          </w:p>
-        </w:tc>
-        <w:tc>
-          <w:tcPr>
-            <w:tcW w:type="dxa" w:w="3312"/>
-            <w:vAlign w:val="center"/>
-          </w:tcPr>
-          <w:p>
-            <w:pPr>
-              <w:keepNext/>
-              <w:spacing w:after="0" w:before="0" w:line="252" w:lineRule="auto"/>
-            </w:pPr>
-            <w:r>
-              <w:rPr>
-                <w:b w:val="0"/>
-                <w:sz w:val="21"/>
-              </w:rPr>
-              <w:t>1.90 (1.56–2.31)</w:t>
+              <w:t>95% confidence interval</w:t>
             </w:r>
           </w:p>
         </w:tc>
@@ -788,13 +394,13 @@
                 <w:b w:val="0"/>
                 <w:sz w:val="21"/>
               </w:rPr>
-              <w:t>Adults without disability, adjusted</w:t>
+              <w:t>1-point lower hiring rate (primary)</w:t>
             </w:r>
           </w:p>
         </w:tc>
         <w:tc>
           <w:tcPr>
-            <w:tcW w:type="dxa" w:w="1152"/>
+            <w:tcW w:type="dxa" w:w="1944"/>
             <w:vAlign w:val="center"/>
           </w:tcPr>
           <w:p>
@@ -807,13 +413,13 @@
                 <w:b w:val="0"/>
                 <w:sz w:val="21"/>
               </w:rPr>
-              <w:t>25,313</w:t>
+              <w:t>-0.80</w:t>
             </w:r>
           </w:p>
         </w:tc>
         <w:tc>
           <w:tcPr>
-            <w:tcW w:type="dxa" w:w="3312"/>
+            <w:tcW w:type="dxa" w:w="2520"/>
             <w:vAlign w:val="center"/>
           </w:tcPr>
           <w:p>
@@ -826,7 +432,193 @@
                 <w:b w:val="0"/>
                 <w:sz w:val="21"/>
               </w:rPr>
-              <w:t>1.70 (1.34–2.16)</w:t>
+              <w:t>-2.05 to 0.45</w:t>
+            </w:r>
+          </w:p>
+        </w:tc>
+      </w:tr>
+      <w:tr>
+        <w:trPr>
+          <w:cantSplit/>
+        </w:trPr>
+        <w:tc>
+          <w:tcPr>
+            <w:tcW w:type="dxa" w:w="4896"/>
+            <w:vAlign w:val="center"/>
+          </w:tcPr>
+          <w:p>
+            <w:pPr>
+              <w:keepNext w:val="0"/>
+              <w:spacing w:after="0" w:before="0" w:line="252" w:lineRule="auto"/>
+            </w:pPr>
+            <w:r>
+              <w:rPr>
+                <w:b w:val="0"/>
+                <w:sz w:val="21"/>
+              </w:rPr>
+              <w:t>1-point higher unemployment rate (same model)</w:t>
+            </w:r>
+          </w:p>
+        </w:tc>
+        <w:tc>
+          <w:tcPr>
+            <w:tcW w:type="dxa" w:w="1944"/>
+            <w:vAlign w:val="center"/>
+          </w:tcPr>
+          <w:p>
+            <w:pPr>
+              <w:keepNext w:val="0"/>
+              <w:spacing w:after="0" w:before="0" w:line="252" w:lineRule="auto"/>
+            </w:pPr>
+            <w:r>
+              <w:rPr>
+                <w:b w:val="0"/>
+                <w:sz w:val="21"/>
+              </w:rPr>
+              <w:t>0.46</w:t>
+            </w:r>
+          </w:p>
+        </w:tc>
+        <w:tc>
+          <w:tcPr>
+            <w:tcW w:type="dxa" w:w="2520"/>
+            <w:vAlign w:val="center"/>
+          </w:tcPr>
+          <w:p>
+            <w:pPr>
+              <w:keepNext w:val="0"/>
+              <w:spacing w:after="0" w:before="0" w:line="252" w:lineRule="auto"/>
+            </w:pPr>
+            <w:r>
+              <w:rPr>
+                <w:b w:val="0"/>
+                <w:sz w:val="21"/>
+              </w:rPr>
+              <w:t>-0.12 to 1.05</w:t>
+            </w:r>
+          </w:p>
+        </w:tc>
+      </w:tr>
+      <w:tr>
+        <w:trPr>
+          <w:cantSplit/>
+        </w:trPr>
+        <w:tc>
+          <w:tcPr>
+            <w:tcW w:type="dxa" w:w="4896"/>
+            <w:vAlign w:val="center"/>
+          </w:tcPr>
+          <w:p>
+            <w:pPr>
+              <w:keepNext w:val="0"/>
+              <w:spacing w:after="0" w:before="0" w:line="252" w:lineRule="auto"/>
+            </w:pPr>
+            <w:r>
+              <w:rPr>
+                <w:b w:val="0"/>
+                <w:sz w:val="21"/>
+              </w:rPr>
+              <w:t>Doubling unemployed people per opening (separate model)</w:t>
+            </w:r>
+          </w:p>
+        </w:tc>
+        <w:tc>
+          <w:tcPr>
+            <w:tcW w:type="dxa" w:w="1944"/>
+            <w:vAlign w:val="center"/>
+          </w:tcPr>
+          <w:p>
+            <w:pPr>
+              <w:keepNext w:val="0"/>
+              <w:spacing w:after="0" w:before="0" w:line="252" w:lineRule="auto"/>
+            </w:pPr>
+            <w:r>
+              <w:rPr>
+                <w:b w:val="0"/>
+                <w:sz w:val="21"/>
+              </w:rPr>
+              <w:t>1.71</w:t>
+            </w:r>
+          </w:p>
+        </w:tc>
+        <w:tc>
+          <w:tcPr>
+            <w:tcW w:type="dxa" w:w="2520"/>
+            <w:vAlign w:val="center"/>
+          </w:tcPr>
+          <w:p>
+            <w:pPr>
+              <w:keepNext w:val="0"/>
+              <w:spacing w:after="0" w:before="0" w:line="252" w:lineRule="auto"/>
+            </w:pPr>
+            <w:r>
+              <w:rPr>
+                <w:b w:val="0"/>
+                <w:sz w:val="21"/>
+              </w:rPr>
+              <w:t>-0.01 to 3.44</w:t>
+            </w:r>
+          </w:p>
+        </w:tc>
+      </w:tr>
+      <w:tr>
+        <w:trPr>
+          <w:cantSplit/>
+        </w:trPr>
+        <w:tc>
+          <w:tcPr>
+            <w:tcW w:type="dxa" w:w="4896"/>
+            <w:vAlign w:val="center"/>
+          </w:tcPr>
+          <w:p>
+            <w:pPr>
+              <w:keepNext w:val="0"/>
+              <w:spacing w:after="0" w:before="0" w:line="252" w:lineRule="auto"/>
+            </w:pPr>
+            <w:r>
+              <w:rPr>
+                <w:b w:val="0"/>
+                <w:sz w:val="21"/>
+              </w:rPr>
+              <w:t>1-point lower job-opening rate (separate model)</w:t>
+            </w:r>
+          </w:p>
+        </w:tc>
+        <w:tc>
+          <w:tcPr>
+            <w:tcW w:type="dxa" w:w="1944"/>
+            <w:vAlign w:val="center"/>
+          </w:tcPr>
+          <w:p>
+            <w:pPr>
+              <w:keepNext w:val="0"/>
+              <w:spacing w:after="0" w:before="0" w:line="252" w:lineRule="auto"/>
+            </w:pPr>
+            <w:r>
+              <w:rPr>
+                <w:b w:val="0"/>
+                <w:sz w:val="21"/>
+              </w:rPr>
+              <w:t>0.13</w:t>
+            </w:r>
+          </w:p>
+        </w:tc>
+        <w:tc>
+          <w:tcPr>
+            <w:tcW w:type="dxa" w:w="2520"/>
+            <w:vAlign w:val="center"/>
+          </w:tcPr>
+          <w:p>
+            <w:pPr>
+              <w:keepNext w:val="0"/>
+              <w:spacing w:after="0" w:before="0" w:line="252" w:lineRule="auto"/>
+            </w:pPr>
+            <w:r>
+              <w:rPr>
+                <w:b w:val="0"/>
+                <w:sz w:val="21"/>
+              </w:rPr>
+              <w:t>-0.76 to 1.02</w:t>
             </w:r>
           </w:p>
         </w:tc>
@@ -840,7 +632,196 @@
         <w:rPr>
           <w:sz w:val="20"/>
         </w:rPr>
-        <w:t>Each ratio compares the unemployment/search group with the employed group. Primary outcome: moderate or severe anxiety or depressive symptoms. Adjusted models include year, age group, sex, race and Hispanic origin, education, and Census region. The narrower comparator requires work last week or temporary absence from a job. Disability exclusion uses DISAB3_A = 2. Sample sizes are unweighted; all estimates account for survey weights, strata, and clustering.</w:t>
+        <w:t>Out-of-work adults aged 18–64, 2013–2024; n = 193,060 in 607 state-years. pp = percentage points. All models include state, year, and demographic terms. Hiring and unemployment appear jointly in the primary model; other exposures are fitted separately. Exposure changes have different units, so coefficient magnitudes should not be ranked as equivalent effects. Confidence intervals are clustered by state.</w:t>
+      </w:r>
+    </w:p>
+    <w:p>
+      <w:r>
+        <w:t>The hiring results were not consistent with a simple claim that lower hiring produces more distress. Using the previous year’s conditions changed the direction of the hiring estimate to 0.92 percentage points (-0.50 to 2.34). Excluding 2020–2021, adding state-specific trends, using equal state-year weights, restricting to continuously observed states, and extending through 2025 did not produce a clear positive hiring association. Figure 1 and the technical note show these checks. The recent-out-of-work subgroup had an inverse estimate, while the longer-duration subgroup had an uncertain positive estimate. These exploratory differences do not establish that slower hiring protects health or that duration modifies a causal effect.</w:t>
+      </w:r>
+    </w:p>
+    <w:p>
+      <w:r>
+        <w:t>The separate employed analysis gave a hiring estimate near zero. A post hoc logistic-model check, prompted by a small number of out-of-range linear-model predictions, also gave an uncertain hiring association: -0.65 percentage points (-1.88 to 0.59). Independent calculations from the uncollapsed out-of-work records reproduced the main regression coefficients and state-clustered covariance.</w:t>
+      </w:r>
+    </w:p>
+    <w:p>
+      <w:pPr>
+        <w:pStyle w:val="Caption"/>
+      </w:pPr>
+      <w:r>
+        <w:t>Figure 1. Hiring estimates across model specifications</w:t>
+      </w:r>
+    </w:p>
+    <w:p>
+      <w:pPr>
+        <w:keepNext/>
+        <w:spacing w:after="60"/>
+      </w:pPr>
+      <w:r>
+        <w:drawing>
+          <wp:inline xmlns:a="http://schemas.openxmlformats.org/drawingml/2006/main" xmlns:pic="http://schemas.openxmlformats.org/drawingml/2006/picture">
+            <wp:extent cx="5943600" cy="3157538"/>
+            <wp:docPr id="1" name="Picture 1" descr="Hiring coefficients and 95% confidence intervals for the main model and five sensitivity checks. Intervals cross zero; the lagged estimate has the opposite direction from the same-year estimate."/>
+            <wp:cNvGraphicFramePr>
+              <a:graphicFrameLocks noChangeAspect="1"/>
+            </wp:cNvGraphicFramePr>
+            <a:graphic>
+              <a:graphicData uri="http://schemas.openxmlformats.org/drawingml/2006/picture">
+                <pic:pic>
+                  <pic:nvPicPr>
+                    <pic:cNvPr id="0" name="figure1.png"/>
+                    <pic:cNvPicPr/>
+                  </pic:nvPicPr>
+                  <pic:blipFill>
+                    <a:blip r:embed="rId10"/>
+                    <a:stretch>
+                      <a:fillRect/>
+                    </a:stretch>
+                  </pic:blipFill>
+                  <pic:spPr>
+                    <a:xfrm>
+                      <a:off x="0" y="0"/>
+                      <a:ext cx="5943600" cy="3157538"/>
+                    </a:xfrm>
+                    <a:prstGeom prst="rect"/>
+                  </pic:spPr>
+                </pic:pic>
+              </a:graphicData>
+            </a:graphic>
+          </wp:inline>
+        </w:drawing>
+      </w:r>
+    </w:p>
+    <w:p>
+      <w:pPr>
+        <w:spacing w:line="252" w:lineRule="auto" w:after="180"/>
+      </w:pPr>
+      <w:r>
+        <w:rPr>
+          <w:sz w:val="20"/>
+        </w:rPr>
+        <w:t>Each point is an adjusted association with frequent mental distress per one-percentage-point lower state hiring rate. Lines show 95% confidence intervals. Positive values indicate more distress; negative values indicate less. The previous-year model uses lagged hiring and unemployment. The 2025 extension uses the published 11-month unemployment input and has different state coverage. These observational estimates are not effects of an intervention.</w:t>
+      </w:r>
+    </w:p>
+    <w:p>
+      <w:pPr>
+        <w:pStyle w:val="Heading1"/>
+      </w:pPr>
+      <w:r>
+        <w:t>How to interpret a mixed result</w:t>
+      </w:r>
+    </w:p>
+    <w:p>
+      <w:r>
+        <w:t>The analysis directly relates a measured health burden to measured market conditions. It does not provide strong evidence for a general same-year relationship between slower state hiring and greater distress among people currently out of work. The competition estimate is compatible with a meaningful increase as well as almost no difference. It should motivate replication, not a claim that a threshold has been crossed.</w:t>
+      </w:r>
+    </w:p>
+    <w:p>
+      <w:r>
+        <w:t>There are substantive reasons the exposures need not behave alike. Hiring counts include workers moving between jobs, people returning to the labor force, and seasonal turnover. Openings describe a stock of opportunities, while the unemployed-to-openings ratio also reflects the number of people competing for work. Applicant experiences depend on suitable vacancies, eligibility, pay, distance, and the way recruitment proceeds. A single statewide rate cannot represent all of these conditions.</w:t>
+      </w:r>
+    </w:p>
+    <w:p>
+      <w:r>
+        <w:t>Selection is especially important. A contraction can bring previously employed people into the out-of-work group and change its average health, even if some individuals become worse off. Conversely, people with better health may leave that group more quickly when opportunities improve. Conditioning on current employment status can therefore obscure or reverse an association that would appear in longitudinal follow-up. Annual surveys cannot distinguish those processes here. The inverse subgroup estimate reinforces the need for longitudinal follow-up.</w:t>
+      </w:r>
+    </w:p>
+    <w:p>
+      <w:r>
+        <w:t>Other limitations remain. State residence may poorly describe a remote or cross-border search. Survey nonresponse, missing covariates, changes in who reports symptoms, state policies, industry composition, and living costs may confound associations. State and year effects do not remove changing state-specific confounding. Annual exposure averages overlap the outcome’s recall period and sometimes include months after an interview; they establish no clear temporal order. Some interviews occur after the nominal survey year. Lagging exposure improves ordering only partially because prior residence and search histories are unknown. BLS modeling and rounding add measurement uncertainty. These limitations constrain both positive and null findings.</w:t>
+      </w:r>
+    </w:p>
+    <w:p>
+      <w:r>
+        <w:t>The literature review is focused and narrative, not a systematic review or a meta-analysis. We searched academic and institutional sources alongside industry reports, preprints, and popular reporting, tracing quantitative claims back to their original source. The repository records source type, review depth, claim support, and limitations. Abstract-only review is identified. Industry questionnaires and selected platform samples describe experiences that representative surveys omit, but their percentages are not interchangeable with clinical screening or BRFSS distress measures.</w:t>
+      </w:r>
+    </w:p>
+    <w:p>
+      <w:pPr>
+        <w:pStyle w:val="Heading1"/>
+      </w:pPr>
+      <w:r>
+        <w:t>What an industry response should make possible</w:t>
+      </w:r>
+    </w:p>
+    <w:p>
+      <w:r>
+        <w:t>The strongest implication is a measurement and accountability agenda tied to testable interventions. Recruitment systems should record whether a position is funded and actively being filled, when an application changes status, when communication ends, and how much time an applicant is asked to invest. These records would make it possible to distinguish scarce opportunities from inaccurate information, prolonged silence, and burdensome procedures. Public reporting should use clear denominators, follow incomplete searches, and describe which applicants are missing from the data.</w:t>
+      </w:r>
+    </w:p>
+    <w:p>
+      <w:r>
+        <w:t>The next study should recruit people when they begin a search, including employed searchers, measure symptoms before substantial exposure, and follow them through offers, withdrawals, reemployment, or continued searching. With consent, weekly or monthly symptom assessments could be linked to the relevant geographic and occupational market, application events, financial strain, and perceived control. Validated symptom measures should sit alongside the practical outcomes applicants value: income, job quality, time spent searching, and the ability to leave harmful work. This design would separate baseline health from changes during a search and distinguish market conditions from platform experiences.</w:t>
+      </w:r>
+    </w:p>
+    <w:p>
+      <w:r>
+        <w:t>A regression framework can relate repeated symptom scores to prior market conditions and recruitment events, with person and time effects and prespecified adjustment for changing circumstances. A structural equation model would be useful only if financial strain, control, and symptoms were measured in an ordered sequence and its causal assumptions were defensible.</w:t>
+      </w:r>
+    </w:p>
+    <w:p>
+      <w:r>
+        <w:t>Employers and platforms can also randomize feasible changes: accurate vacancy-status notices, predictable communication, reduced duplicate assessments, or compensation for substantial tasks. Independent evaluators should examine mental health together with employment outcomes and access, including whether an apparently helpful change excludes applicants or shifts burdens elsewhere. Trial evidence from the JOBS program shows that job-search support can improve employment and mental-health outcomes. [23] It does not establish the effectiveness of these proposed recruitment-system changes; those require their own evaluation.</w:t>
+      </w:r>
+    </w:p>
+    <w:p>
+      <w:r>
+        <w:t>The institutional response should extend beyond interfaces. Income protection and access to care may matter more than the wording of an application email. Industry partners can contribute knowledge and event data, but they should not control publication, suppress unfavorable findings, or obtain identifiable applicant mental-health records for hiring decisions. The aim is to identify preventable exposures while preserving a fair route into work.</w:t>
+      </w:r>
+    </w:p>
+    <w:p>
+      <w:pPr>
+        <w:pStyle w:val="Heading1"/>
+      </w:pPr>
+      <w:r>
+        <w:t>Conclusion</w:t>
+      </w:r>
+    </w:p>
+    <w:p>
+      <w:r>
+        <w:t>Job seeking places people in an environment that governs access to income, security, and social participation. Existing research gives reason to examine that environment as a potential psychiatric exposure. Our linked public-data analysis finds an uncertain association with competition for openings and no consistent association with lower hiring rates. These findings support more direct measurement and longitudinal evaluation of the search environment. A public health approach should evaluate what hiring systems require of people and whether changing those requirements reduces harm.</w:t>
+      </w:r>
+    </w:p>
+    <w:p>
+      <w:pPr>
+        <w:pStyle w:val="Heading1"/>
+      </w:pPr>
+      <w:r>
+        <w:t>Declarations</w:t>
+      </w:r>
+    </w:p>
+    <w:p>
+      <w:r>
+        <w:t>Competing interests: Jacob E. Thomas is affiliated with Results Generation, a recruitment-marketing firm. This industry relationship is relevant to the argument. The views expressed are his own. The empirical analysis used no proprietary applicant records or employer analytics.</w:t>
+      </w:r>
+    </w:p>
+    <w:p>
+      <w:r>
+        <w:t>Funding: No external funding supported this work.</w:t>
+      </w:r>
+    </w:p>
+    <w:p>
+      <w:r>
+        <w:t>Ethics: This was a secondary analysis of deidentified, publicly released records. No participants were recruited and no restricted records were accessed.</w:t>
+      </w:r>
+    </w:p>
+    <w:p>
+      <w:r>
+        <w:t>Data and code: The public source URLs, download checksums, variable definitions, analysis decision log, derived inputs, code, generated results, and reference audit are available in the PsychologicalRecession repository. [24] The main analysis can be rebuilt from the included inputs; a separate command rebuilds those inputs from the official source files. All essential methods, results, figures, and references are included in this document.</w:t>
+      </w:r>
+    </w:p>
+    <w:p>
+      <w:r>
+        <w:br w:type="page"/>
+      </w:r>
+    </w:p>
+    <w:p>
+      <w:pPr>
+        <w:pStyle w:val="Heading1"/>
+      </w:pPr>
+      <w:r>
+        <w:t>Technical note</w:t>
       </w:r>
     </w:p>
     <w:p>
@@ -848,38 +829,7 @@
         <w:pStyle w:val="Heading2"/>
       </w:pPr>
       <w:r>
-        <w:t>Interpretation</w:t>
-      </w:r>
-    </w:p>
-    <w:p>
-      <w:r>
-        <w:t>This illustration establishes why the population merits attention. It does not establish the proposed mechanism. The excess prevalence could reflect the consequences of job loss, prior illness, financial disadvantage, selection into employment, hiring conditions, or combinations of these processes. Adjustment for observed demographics cannot separate them. The point of presenting the analysis is to connect a substantial, reproducible symptom burden to a sharper research and industry agenda, rather than to relabel an employment coefficient as structural harm.</w:t>
-      </w:r>
-    </w:p>
-    <w:p>
-      <w:pPr>
-        <w:pStyle w:val="Heading1"/>
-      </w:pPr>
-      <w:r>
-        <w:t>What the hiring industry can change</w:t>
-      </w:r>
-    </w:p>
-    <w:p>
-      <w:r>
-        <w:t>The industry can make exposure visible before claiming to make it safer. A useful starting point is to record whether a posting represents a current vacancy, how long applicants wait at each stage, which demands are imposed, and when the process ends. These records describe organizational practices. They should be assessed alongside applicant reports of uncertainty, financial strain, and symptoms, without treating those reports as interchangeable measures.</w:t>
-      </w:r>
-    </w:p>
-    <w:p>
-      <w:r>
-        <w:t>Table 2 sets out four priorities. Each specifies a modifiable practice and an observable measure. The recommendations are proposals for evaluation, not established psychiatric treatments. A reduction in processing time, for example, would not automatically mean better mental health if it came with rushed decisions, inaccessible assessments, or more frequent rejection. Operational improvements and health outcomes both need measurement.</w:t>
-      </w:r>
-    </w:p>
-    <w:p>
-      <w:pPr>
-        <w:pStyle w:val="Caption"/>
-      </w:pPr>
-      <w:r>
-        <w:t>Table 2. Hiring practices that can be measured and changed</w:t>
+        <w:t>Sample and coding</w:t>
       </w:r>
     </w:p>
     <w:tbl>
@@ -904,9 +854,8 @@
         </w:tblCellMar>
       </w:tblPr>
       <w:tblGrid>
-        <w:gridCol w:w="1584"/>
-        <w:gridCol w:w="3816"/>
-        <w:gridCol w:w="3960"/>
+        <w:gridCol w:w="6768"/>
+        <w:gridCol w:w="2592"/>
       </w:tblGrid>
       <w:tr>
         <w:trPr>
@@ -915,7 +864,7 @@
         </w:trPr>
         <w:tc>
           <w:tcPr>
-            <w:tcW w:type="dxa" w:w="1584"/>
+            <w:tcW w:type="dxa" w:w="6768"/>
             <w:vAlign w:val="center"/>
             <w:shd w:fill="EDF0F2"/>
           </w:tcPr>
@@ -929,13 +878,13 @@
                 <w:b/>
                 <w:sz w:val="21"/>
               </w:rPr>
-              <w:t>Priority</w:t>
+              <w:t>Sequential sample definition</w:t>
             </w:r>
           </w:p>
         </w:tc>
         <w:tc>
           <w:tcPr>
-            <w:tcW w:type="dxa" w:w="3816"/>
+            <w:tcW w:type="dxa" w:w="2592"/>
             <w:vAlign w:val="center"/>
             <w:shd w:fill="EDF0F2"/>
           </w:tcPr>
@@ -949,13 +898,449 @@
                 <w:b/>
                 <w:sz w:val="21"/>
               </w:rPr>
-              <w:t>Observable measure</w:t>
+              <w:t>Respondents</w:t>
+            </w:r>
+          </w:p>
+        </w:tc>
+      </w:tr>
+      <w:tr>
+        <w:trPr>
+          <w:cantSplit/>
+        </w:trPr>
+        <w:tc>
+          <w:tcPr>
+            <w:tcW w:type="dxa" w:w="6768"/>
+            <w:vAlign w:val="center"/>
+          </w:tcPr>
+          <w:p>
+            <w:pPr>
+              <w:keepNext w:val="0"/>
+              <w:spacing w:after="0" w:before="0" w:line="252" w:lineRule="auto"/>
+            </w:pPr>
+            <w:r>
+              <w:rPr>
+                <w:b w:val="0"/>
+                <w:sz w:val="21"/>
+              </w:rPr>
+              <w:t>All public records, 2013–2024</w:t>
             </w:r>
           </w:p>
         </w:tc>
         <w:tc>
           <w:tcPr>
-            <w:tcW w:type="dxa" w:w="3960"/>
+            <w:tcW w:type="dxa" w:w="2592"/>
+            <w:vAlign w:val="center"/>
+          </w:tcPr>
+          <w:p>
+            <w:pPr>
+              <w:keepNext w:val="0"/>
+              <w:spacing w:after="0" w:before="0" w:line="252" w:lineRule="auto"/>
+            </w:pPr>
+            <w:r>
+              <w:rPr>
+                <w:b w:val="0"/>
+                <w:sz w:val="21"/>
+              </w:rPr>
+              <w:t>5,366,692</w:t>
+            </w:r>
+          </w:p>
+        </w:tc>
+      </w:tr>
+      <w:tr>
+        <w:trPr>
+          <w:cantSplit/>
+        </w:trPr>
+        <w:tc>
+          <w:tcPr>
+            <w:tcW w:type="dxa" w:w="6768"/>
+            <w:vAlign w:val="center"/>
+          </w:tcPr>
+          <w:p>
+            <w:pPr>
+              <w:keepNext w:val="0"/>
+              <w:spacing w:after="0" w:before="0" w:line="252" w:lineRule="auto"/>
+            </w:pPr>
+            <w:r>
+              <w:rPr>
+                <w:b w:val="0"/>
+                <w:sz w:val="21"/>
+              </w:rPr>
+              <w:t>50 states and District of Columbia</w:t>
+            </w:r>
+          </w:p>
+        </w:tc>
+        <w:tc>
+          <w:tcPr>
+            <w:tcW w:type="dxa" w:w="2592"/>
+            <w:vAlign w:val="center"/>
+          </w:tcPr>
+          <w:p>
+            <w:pPr>
+              <w:keepNext w:val="0"/>
+              <w:spacing w:after="0" w:before="0" w:line="252" w:lineRule="auto"/>
+            </w:pPr>
+            <w:r>
+              <w:rPr>
+                <w:b w:val="0"/>
+                <w:sz w:val="21"/>
+              </w:rPr>
+              <w:t>5,274,607</w:t>
+            </w:r>
+          </w:p>
+        </w:tc>
+      </w:tr>
+      <w:tr>
+        <w:trPr>
+          <w:cantSplit/>
+        </w:trPr>
+        <w:tc>
+          <w:tcPr>
+            <w:tcW w:type="dxa" w:w="6768"/>
+            <w:vAlign w:val="center"/>
+          </w:tcPr>
+          <w:p>
+            <w:pPr>
+              <w:keepNext w:val="0"/>
+              <w:spacing w:after="0" w:before="0" w:line="252" w:lineRule="auto"/>
+            </w:pPr>
+            <w:r>
+              <w:rPr>
+                <w:b w:val="0"/>
+                <w:sz w:val="21"/>
+              </w:rPr>
+              <w:t>Age 18–64</w:t>
+            </w:r>
+          </w:p>
+        </w:tc>
+        <w:tc>
+          <w:tcPr>
+            <w:tcW w:type="dxa" w:w="2592"/>
+            <w:vAlign w:val="center"/>
+          </w:tcPr>
+          <w:p>
+            <w:pPr>
+              <w:keepNext w:val="0"/>
+              <w:spacing w:after="0" w:before="0" w:line="252" w:lineRule="auto"/>
+            </w:pPr>
+            <w:r>
+              <w:rPr>
+                <w:b w:val="0"/>
+                <w:sz w:val="21"/>
+              </w:rPr>
+              <w:t>3,326,804</w:t>
+            </w:r>
+          </w:p>
+        </w:tc>
+      </w:tr>
+      <w:tr>
+        <w:trPr>
+          <w:cantSplit/>
+        </w:trPr>
+        <w:tc>
+          <w:tcPr>
+            <w:tcW w:type="dxa" w:w="6768"/>
+            <w:vAlign w:val="center"/>
+          </w:tcPr>
+          <w:p>
+            <w:pPr>
+              <w:keepNext w:val="0"/>
+              <w:spacing w:after="0" w:before="0" w:line="252" w:lineRule="auto"/>
+            </w:pPr>
+            <w:r>
+              <w:rPr>
+                <w:b w:val="0"/>
+                <w:sz w:val="21"/>
+              </w:rPr>
+              <w:t>Employed, self-employed, or out of work</w:t>
+            </w:r>
+          </w:p>
+        </w:tc>
+        <w:tc>
+          <w:tcPr>
+            <w:tcW w:type="dxa" w:w="2592"/>
+            <w:vAlign w:val="center"/>
+          </w:tcPr>
+          <w:p>
+            <w:pPr>
+              <w:keepNext w:val="0"/>
+              <w:spacing w:after="0" w:before="0" w:line="252" w:lineRule="auto"/>
+            </w:pPr>
+            <w:r>
+              <w:rPr>
+                <w:b w:val="0"/>
+                <w:sz w:val="21"/>
+              </w:rPr>
+              <w:t>2,488,550</w:t>
+            </w:r>
+          </w:p>
+        </w:tc>
+      </w:tr>
+      <w:tr>
+        <w:trPr>
+          <w:cantSplit/>
+        </w:trPr>
+        <w:tc>
+          <w:tcPr>
+            <w:tcW w:type="dxa" w:w="6768"/>
+            <w:vAlign w:val="center"/>
+          </w:tcPr>
+          <w:p>
+            <w:pPr>
+              <w:keepNext w:val="0"/>
+              <w:spacing w:after="0" w:before="0" w:line="252" w:lineRule="auto"/>
+            </w:pPr>
+            <w:r>
+              <w:rPr>
+                <w:b w:val="0"/>
+                <w:sz w:val="21"/>
+              </w:rPr>
+              <w:t>Valid mental-health-days response</w:t>
+            </w:r>
+          </w:p>
+        </w:tc>
+        <w:tc>
+          <w:tcPr>
+            <w:tcW w:type="dxa" w:w="2592"/>
+            <w:vAlign w:val="center"/>
+          </w:tcPr>
+          <w:p>
+            <w:pPr>
+              <w:keepNext w:val="0"/>
+              <w:spacing w:after="0" w:before="0" w:line="252" w:lineRule="auto"/>
+            </w:pPr>
+            <w:r>
+              <w:rPr>
+                <w:b w:val="0"/>
+                <w:sz w:val="21"/>
+              </w:rPr>
+              <w:t>2,458,252</w:t>
+            </w:r>
+          </w:p>
+        </w:tc>
+      </w:tr>
+      <w:tr>
+        <w:trPr>
+          <w:cantSplit/>
+        </w:trPr>
+        <w:tc>
+          <w:tcPr>
+            <w:tcW w:type="dxa" w:w="6768"/>
+            <w:vAlign w:val="center"/>
+          </w:tcPr>
+          <w:p>
+            <w:pPr>
+              <w:keepNext w:val="0"/>
+              <w:spacing w:after="0" w:before="0" w:line="252" w:lineRule="auto"/>
+            </w:pPr>
+            <w:r>
+              <w:rPr>
+                <w:b w:val="0"/>
+                <w:sz w:val="21"/>
+              </w:rPr>
+              <w:t>Complete demographics and positive weight</w:t>
+            </w:r>
+          </w:p>
+        </w:tc>
+        <w:tc>
+          <w:tcPr>
+            <w:tcW w:type="dxa" w:w="2592"/>
+            <w:vAlign w:val="center"/>
+          </w:tcPr>
+          <w:p>
+            <w:pPr>
+              <w:keepNext w:val="0"/>
+              <w:spacing w:after="0" w:before="0" w:line="252" w:lineRule="auto"/>
+            </w:pPr>
+            <w:r>
+              <w:rPr>
+                <w:b w:val="0"/>
+                <w:sz w:val="21"/>
+              </w:rPr>
+              <w:t>2,416,084</w:t>
+            </w:r>
+          </w:p>
+        </w:tc>
+      </w:tr>
+      <w:tr>
+        <w:trPr>
+          <w:cantSplit/>
+        </w:trPr>
+        <w:tc>
+          <w:tcPr>
+            <w:tcW w:type="dxa" w:w="6768"/>
+            <w:vAlign w:val="center"/>
+          </w:tcPr>
+          <w:p>
+            <w:pPr>
+              <w:keepNext w:val="0"/>
+              <w:spacing w:after="0" w:before="0" w:line="252" w:lineRule="auto"/>
+            </w:pPr>
+            <w:r>
+              <w:rPr>
+                <w:b w:val="0"/>
+                <w:sz w:val="21"/>
+              </w:rPr>
+              <w:t>Out of work: primary analysis</w:t>
+            </w:r>
+          </w:p>
+        </w:tc>
+        <w:tc>
+          <w:tcPr>
+            <w:tcW w:type="dxa" w:w="2592"/>
+            <w:vAlign w:val="center"/>
+          </w:tcPr>
+          <w:p>
+            <w:pPr>
+              <w:keepNext w:val="0"/>
+              <w:spacing w:after="0" w:before="0" w:line="252" w:lineRule="auto"/>
+            </w:pPr>
+            <w:r>
+              <w:rPr>
+                <w:b w:val="0"/>
+                <w:sz w:val="21"/>
+              </w:rPr>
+              <w:t>193,060</w:t>
+            </w:r>
+          </w:p>
+        </w:tc>
+      </w:tr>
+      <w:tr>
+        <w:trPr>
+          <w:cantSplit/>
+        </w:trPr>
+        <w:tc>
+          <w:tcPr>
+            <w:tcW w:type="dxa" w:w="6768"/>
+            <w:vAlign w:val="center"/>
+          </w:tcPr>
+          <w:p>
+            <w:pPr>
+              <w:keepNext w:val="0"/>
+              <w:spacing w:after="0" w:before="0" w:line="252" w:lineRule="auto"/>
+            </w:pPr>
+            <w:r>
+              <w:rPr>
+                <w:b w:val="0"/>
+                <w:sz w:val="21"/>
+              </w:rPr>
+              <w:t>Employed: contextual analysis</w:t>
+            </w:r>
+          </w:p>
+        </w:tc>
+        <w:tc>
+          <w:tcPr>
+            <w:tcW w:type="dxa" w:w="2592"/>
+            <w:vAlign w:val="center"/>
+          </w:tcPr>
+          <w:p>
+            <w:pPr>
+              <w:keepNext w:val="0"/>
+              <w:spacing w:after="0" w:before="0" w:line="252" w:lineRule="auto"/>
+            </w:pPr>
+            <w:r>
+              <w:rPr>
+                <w:b w:val="0"/>
+                <w:sz w:val="21"/>
+              </w:rPr>
+              <w:t>2,223,024</w:t>
+            </w:r>
+          </w:p>
+        </w:tc>
+      </w:tr>
+    </w:tbl>
+    <w:p>
+      <w:pPr>
+        <w:spacing w:line="252" w:lineRule="auto" w:after="180"/>
+      </w:pPr>
+      <w:r>
+        <w:rPr>
+          <w:sz w:val="20"/>
+        </w:rPr>
+        <w:t>The final two rows partition the complete sample. Counts represent different respondents in repeated annual cross-sections. Year-specific counts, missing states, and the 2025 extension are supplied in the reproducibility files.</w:t>
+      </w:r>
+    </w:p>
+    <w:p>
+      <w:r>
+        <w:t>The out-of-work population is EMPLOY1=3 or 4; employed is EMPLOY1=1 or 2. Age groups are 18–24 and five-year bands from 25–29 to 60–64. MENTHLTH=88 is recoded to zero; 77, 99, and blanks are missing. Education is grouped as less than high school, high school, some college, and college graduate. Race/ethnicity uses the common five-category output of _RACEGR3, or _RACEGR4 in 2022. These broad categories are adjustment variables, not explanations of inherent group differences. Sex uses SEX in 2013–2017, SEX1 in 2018, and the calculated _SEX thereafter; question and derivation changes limit exact harmonization. Final weights are _LLCPWT. No diagnosis, active-search variable, or industry-specific search exposure is inferred from these codes.</w:t>
+      </w:r>
+    </w:p>
+    <w:p>
+      <w:pPr>
+        <w:pStyle w:val="Heading2"/>
+      </w:pPr>
+      <w:r>
+        <w:t>Estimand and uncertainty</w:t>
+      </w:r>
+    </w:p>
+    <w:p>
+      <w:pPr>
+        <w:jc w:val="center"/>
+      </w:pPr>
+      <w:r>
+        <w:rPr>
+          <w:rFonts w:ascii="Cambria" w:hAnsi="Cambria"/>
+          <w:sz w:val="22"/>
+        </w:rPr>
+        <w:t>Pr(Y = 1) = a(state) + g(year) + b × (−H) + c × U + X′d</w:t>
+      </w:r>
+    </w:p>
+    <w:p>
+      <w:r>
+        <w:t>Here Y is the indicator of frequent mental distress; H is the state survey-year hiring rate; U is the published annual unemployment rate; X contains the demographic categories; a and g represent state and year effects. The coefficient b describes a one-percentage-point lower hiring rate, holding the included variables fixed. Reported percentage-point differences equal 100 times the corresponding probability-scale coefficient. The competition and opening-rate regressions replace the two market terms with their respective single exposure. All models retain demographic, state, and year terms.</w:t>
+      </w:r>
+    </w:p>
+    <w:p>
+      <w:r>
+        <w:t>We solved weighted least squares using cross-products from identical respondent profiles; this preserves the individual-level coefficient estimates and state score contributions exactly. Standard errors use the state-cluster sandwich with correction G/(G−1) × (N−1)/(N−K), where G is the number of states, N the original respondent count, and K the number of fitted coefficients. Intervals use the t distribution with G−1 degrees of freedom. The complete-state check has 46 clusters; other main checks have 51. No multiplicity-adjusted discovery claim is made. The estimates and intervals, including unfavorable and null results, should be read together.</w:t>
+      </w:r>
+    </w:p>
+    <w:p>
+      <w:r>
+        <w:t>Annual JOLTS measures require all 12 months; the competition ratio is log base two of the annual mean monthly ratio. This is not the ratio of two annual totals. Primary data include 607 of 612 possible state-years. No state-year had to be dropped for a missing BLS primary exposure. The remaining hiring-rate variation after adjustment has a weighted standard deviation of 0.24 percentage points: a one-point contrast is substantially larger than a typical residual difference. Estimates should not be extrapolated to large policy shifts.</w:t>
+      </w:r>
+    </w:p>
+    <w:p>
+      <w:pPr>
+        <w:pStyle w:val="Heading2"/>
+      </w:pPr>
+      <w:r>
+        <w:t>Full set of hiring checks</w:t>
+      </w:r>
+    </w:p>
+    <w:tbl>
+      <w:tblPr>
+        <w:tblW w:type="auto" w:w="0"/>
+        <w:jc w:val="center"/>
+        <w:tblLayout w:type="fixed"/>
+        <w:tblLook w:firstColumn="1" w:firstRow="1" w:lastColumn="0" w:lastRow="0" w:noHBand="0" w:noVBand="1" w:val="04A0"/>
+        <w:tblBorders>
+          <w:top w:val="single" w:sz="4" w:color="CFD5D9"/>
+          <w:left w:val="single" w:sz="4" w:color="CFD5D9"/>
+          <w:bottom w:val="single" w:sz="4" w:color="CFD5D9"/>
+          <w:right w:val="single" w:sz="4" w:color="CFD5D9"/>
+          <w:insideH w:val="single" w:sz="4" w:color="CFD5D9"/>
+          <w:insideV w:val="single" w:sz="4" w:color="CFD5D9"/>
+        </w:tblBorders>
+        <w:tblCellMar>
+          <w:top w:w="90" w:type="dxa"/>
+          <w:bottom w:w="90" w:type="dxa"/>
+          <w:left w:w="100" w:type="dxa"/>
+          <w:right w:w="100" w:type="dxa"/>
+        </w:tblCellMar>
+      </w:tblPr>
+      <w:tblGrid>
+        <w:gridCol w:w="4248"/>
+        <w:gridCol w:w="1512"/>
+        <w:gridCol w:w="3600"/>
+      </w:tblGrid>
+      <w:tr>
+        <w:trPr>
+          <w:cantSplit/>
+          <w:tblHeader/>
+        </w:trPr>
+        <w:tc>
+          <w:tcPr>
+            <w:tcW w:type="dxa" w:w="4248"/>
             <w:vAlign w:val="center"/>
             <w:shd w:fill="EDF0F2"/>
           </w:tcPr>
@@ -969,7 +1354,47 @@
                 <w:b/>
                 <w:sz w:val="21"/>
               </w:rPr>
-              <w:t>Proposed change to evaluate</w:t>
+              <w:t>Model or population</w:t>
+            </w:r>
+          </w:p>
+        </w:tc>
+        <w:tc>
+          <w:tcPr>
+            <w:tcW w:type="dxa" w:w="1512"/>
+            <w:vAlign w:val="center"/>
+            <w:shd w:fill="EDF0F2"/>
+          </w:tcPr>
+          <w:p>
+            <w:pPr>
+              <w:keepNext/>
+              <w:spacing w:after="0" w:before="0" w:line="252" w:lineRule="auto"/>
+            </w:pPr>
+            <w:r>
+              <w:rPr>
+                <w:b/>
+                <w:sz w:val="21"/>
+              </w:rPr>
+              <w:t>Respondents</w:t>
+            </w:r>
+          </w:p>
+        </w:tc>
+        <w:tc>
+          <w:tcPr>
+            <w:tcW w:type="dxa" w:w="3600"/>
+            <w:vAlign w:val="center"/>
+            <w:shd w:fill="EDF0F2"/>
+          </w:tcPr>
+          <w:p>
+            <w:pPr>
+              <w:keepNext/>
+              <w:spacing w:after="0" w:before="0" w:line="252" w:lineRule="auto"/>
+            </w:pPr>
+            <w:r>
+              <w:rPr>
+                <w:b/>
+                <w:sz w:val="21"/>
+              </w:rPr>
+              <w:t>Difference in distress, pp (95% CI)</w:t>
             </w:r>
           </w:p>
         </w:tc>
@@ -980,193 +1405,7 @@
         </w:trPr>
         <w:tc>
           <w:tcPr>
-            <w:tcW w:type="dxa" w:w="1584"/>
-            <w:vAlign w:val="center"/>
-          </w:tcPr>
-          <w:p>
-            <w:pPr>
-              <w:keepNext/>
-              <w:spacing w:after="0" w:before="0" w:line="252" w:lineRule="auto"/>
-            </w:pPr>
-            <w:r>
-              <w:rPr>
-                <w:b w:val="0"/>
-                <w:sz w:val="21"/>
-              </w:rPr>
-              <w:t>Vacancy accuracy</w:t>
-            </w:r>
-          </w:p>
-        </w:tc>
-        <w:tc>
-          <w:tcPr>
-            <w:tcW w:type="dxa" w:w="3816"/>
-            <w:vAlign w:val="center"/>
-          </w:tcPr>
-          <w:p>
-            <w:pPr>
-              <w:keepNext/>
-              <w:spacing w:after="0" w:before="0" w:line="252" w:lineRule="auto"/>
-            </w:pPr>
-            <w:r>
-              <w:rPr>
-                <w:b w:val="0"/>
-                <w:sz w:val="21"/>
-              </w:rPr>
-              <w:t>Whether an advertised vacancy is current, authorized, and accepting applications; time to remove closed listings.</w:t>
-            </w:r>
-          </w:p>
-        </w:tc>
-        <w:tc>
-          <w:tcPr>
-            <w:tcW w:type="dxa" w:w="3960"/>
-            <w:vAlign w:val="center"/>
-          </w:tcPr>
-          <w:p>
-            <w:pPr>
-              <w:keepNext/>
-              <w:spacing w:after="0" w:before="0" w:line="252" w:lineRule="auto"/>
-            </w:pPr>
-            <w:r>
-              <w:rPr>
-                <w:b w:val="0"/>
-                <w:sz w:val="21"/>
-              </w:rPr>
-              <w:t>Label vacancy status, distinguish ongoing talent pools, and close unavailable roles promptly.</w:t>
-            </w:r>
-          </w:p>
-        </w:tc>
-      </w:tr>
-      <w:tr>
-        <w:trPr>
-          <w:cantSplit/>
-        </w:trPr>
-        <w:tc>
-          <w:tcPr>
-            <w:tcW w:type="dxa" w:w="1584"/>
-            <w:vAlign w:val="center"/>
-          </w:tcPr>
-          <w:p>
-            <w:pPr>
-              <w:keepNext/>
-              <w:spacing w:after="0" w:before="0" w:line="252" w:lineRule="auto"/>
-            </w:pPr>
-            <w:r>
-              <w:rPr>
-                <w:b w:val="0"/>
-                <w:sz w:val="21"/>
-              </w:rPr>
-              <w:t>Predictable communication</w:t>
-            </w:r>
-          </w:p>
-        </w:tc>
-        <w:tc>
-          <w:tcPr>
-            <w:tcW w:type="dxa" w:w="3816"/>
-            <w:vAlign w:val="center"/>
-          </w:tcPr>
-          <w:p>
-            <w:pPr>
-              <w:keepNext/>
-              <w:spacing w:after="0" w:before="0" w:line="252" w:lineRule="auto"/>
-            </w:pPr>
-            <w:r>
-              <w:rPr>
-                <w:b w:val="0"/>
-                <w:sz w:val="21"/>
-              </w:rPr>
-              <w:t>Days without an update; whether stages and decision dates are stated; whether applicants receive closure.</w:t>
-            </w:r>
-          </w:p>
-        </w:tc>
-        <w:tc>
-          <w:tcPr>
-            <w:tcW w:type="dxa" w:w="3960"/>
-            <w:vAlign w:val="center"/>
-          </w:tcPr>
-          <w:p>
-            <w:pPr>
-              <w:keepNext/>
-              <w:spacing w:after="0" w:before="0" w:line="252" w:lineRule="auto"/>
-            </w:pPr>
-            <w:r>
-              <w:rPr>
-                <w:b w:val="0"/>
-                <w:sz w:val="21"/>
-              </w:rPr>
-              <w:t>Publish the process and update schedule; provide accurate status and a defined closure procedure.</w:t>
-            </w:r>
-          </w:p>
-        </w:tc>
-      </w:tr>
-      <w:tr>
-        <w:trPr>
-          <w:cantSplit/>
-        </w:trPr>
-        <w:tc>
-          <w:tcPr>
-            <w:tcW w:type="dxa" w:w="1584"/>
-            <w:vAlign w:val="center"/>
-          </w:tcPr>
-          <w:p>
-            <w:pPr>
-              <w:keepNext/>
-              <w:spacing w:after="0" w:before="0" w:line="252" w:lineRule="auto"/>
-            </w:pPr>
-            <w:r>
-              <w:rPr>
-                <w:b w:val="0"/>
-                <w:sz w:val="21"/>
-              </w:rPr>
-              <w:t>Proportionate demands</w:t>
-            </w:r>
-          </w:p>
-        </w:tc>
-        <w:tc>
-          <w:tcPr>
-            <w:tcW w:type="dxa" w:w="3816"/>
-            <w:vAlign w:val="center"/>
-          </w:tcPr>
-          <w:p>
-            <w:pPr>
-              <w:keepNext/>
-              <w:spacing w:after="0" w:before="0" w:line="252" w:lineRule="auto"/>
-            </w:pPr>
-            <w:r>
-              <w:rPr>
-                <w:b w:val="0"/>
-                <w:sz w:val="21"/>
-              </w:rPr>
-              <w:t>Applicant time and out-of-pocket costs; repeated forms; length and number of unpaid assessments.</w:t>
-            </w:r>
-          </w:p>
-        </w:tc>
-        <w:tc>
-          <w:tcPr>
-            <w:tcW w:type="dxa" w:w="3960"/>
-            <w:vAlign w:val="center"/>
-          </w:tcPr>
-          <w:p>
-            <w:pPr>
-              <w:keepNext/>
-              <w:spacing w:after="0" w:before="0" w:line="252" w:lineRule="auto"/>
-            </w:pPr>
-            <w:r>
-              <w:rPr>
-                <w:b w:val="0"/>
-                <w:sz w:val="21"/>
-              </w:rPr>
-              <w:t>Remove duplicate demands, limit unpaid tasks, and test compensation for substantial assessments.</w:t>
-            </w:r>
-          </w:p>
-        </w:tc>
-      </w:tr>
-      <w:tr>
-        <w:trPr>
-          <w:cantSplit/>
-        </w:trPr>
-        <w:tc>
-          <w:tcPr>
-            <w:tcW w:type="dxa" w:w="1584"/>
+            <w:tcW w:type="dxa" w:w="4248"/>
             <w:vAlign w:val="center"/>
           </w:tcPr>
           <w:p>
@@ -1179,13 +1418,13 @@
                 <w:b w:val="0"/>
                 <w:sz w:val="21"/>
               </w:rPr>
-              <w:t>Accessible review</w:t>
+              <w:t>Primary model</w:t>
             </w:r>
           </w:p>
         </w:tc>
         <w:tc>
           <w:tcPr>
-            <w:tcW w:type="dxa" w:w="3816"/>
+            <w:tcW w:type="dxa" w:w="1512"/>
             <w:vAlign w:val="center"/>
           </w:tcPr>
           <w:p>
@@ -1198,13 +1437,13 @@
                 <w:b w:val="0"/>
                 <w:sz w:val="21"/>
               </w:rPr>
-              <w:t>Availability and use of accommodations, explanations of process, and review of disputed exclusions.</w:t>
+              <w:t>193,060</w:t>
             </w:r>
           </w:p>
         </w:tc>
         <w:tc>
           <w:tcPr>
-            <w:tcW w:type="dxa" w:w="3960"/>
+            <w:tcW w:type="dxa" w:w="3600"/>
             <w:vAlign w:val="center"/>
           </w:tcPr>
           <w:p>
@@ -1217,7 +1456,689 @@
                 <w:b w:val="0"/>
                 <w:sz w:val="21"/>
               </w:rPr>
-              <w:t>Offer accessible routes to request assistance or review; audit differences in access and outcomes.</w:t>
+              <w:t>-0.80 (-2.05 to 0.45)</w:t>
+            </w:r>
+          </w:p>
+        </w:tc>
+      </w:tr>
+      <w:tr>
+        <w:trPr>
+          <w:cantSplit/>
+        </w:trPr>
+        <w:tc>
+          <w:tcPr>
+            <w:tcW w:type="dxa" w:w="4248"/>
+            <w:vAlign w:val="center"/>
+          </w:tcPr>
+          <w:p>
+            <w:pPr>
+              <w:keepNext w:val="0"/>
+              <w:spacing w:after="0" w:before="0" w:line="252" w:lineRule="auto"/>
+            </w:pPr>
+            <w:r>
+              <w:rPr>
+                <w:b w:val="0"/>
+                <w:sz w:val="21"/>
+              </w:rPr>
+              <w:t>Without unemployment adjustment</w:t>
+            </w:r>
+          </w:p>
+        </w:tc>
+        <w:tc>
+          <w:tcPr>
+            <w:tcW w:type="dxa" w:w="1512"/>
+            <w:vAlign w:val="center"/>
+          </w:tcPr>
+          <w:p>
+            <w:pPr>
+              <w:keepNext w:val="0"/>
+              <w:spacing w:after="0" w:before="0" w:line="252" w:lineRule="auto"/>
+            </w:pPr>
+            <w:r>
+              <w:rPr>
+                <w:b w:val="0"/>
+                <w:sz w:val="21"/>
+              </w:rPr>
+              <w:t>193,060</w:t>
+            </w:r>
+          </w:p>
+        </w:tc>
+        <w:tc>
+          <w:tcPr>
+            <w:tcW w:type="dxa" w:w="3600"/>
+            <w:vAlign w:val="center"/>
+          </w:tcPr>
+          <w:p>
+            <w:pPr>
+              <w:keepNext w:val="0"/>
+              <w:spacing w:after="0" w:before="0" w:line="252" w:lineRule="auto"/>
+            </w:pPr>
+            <w:r>
+              <w:rPr>
+                <w:b w:val="0"/>
+                <w:sz w:val="21"/>
+              </w:rPr>
+              <w:t>-0.93 (-2.26 to 0.40)</w:t>
+            </w:r>
+          </w:p>
+        </w:tc>
+      </w:tr>
+      <w:tr>
+        <w:trPr>
+          <w:cantSplit/>
+        </w:trPr>
+        <w:tc>
+          <w:tcPr>
+            <w:tcW w:type="dxa" w:w="4248"/>
+            <w:vAlign w:val="center"/>
+          </w:tcPr>
+          <w:p>
+            <w:pPr>
+              <w:keepNext w:val="0"/>
+              <w:spacing w:after="0" w:before="0" w:line="252" w:lineRule="auto"/>
+            </w:pPr>
+            <w:r>
+              <w:rPr>
+                <w:b w:val="0"/>
+                <w:sz w:val="21"/>
+              </w:rPr>
+              <w:t>Previous-year conditions</w:t>
+            </w:r>
+          </w:p>
+        </w:tc>
+        <w:tc>
+          <w:tcPr>
+            <w:tcW w:type="dxa" w:w="1512"/>
+            <w:vAlign w:val="center"/>
+          </w:tcPr>
+          <w:p>
+            <w:pPr>
+              <w:keepNext w:val="0"/>
+              <w:spacing w:after="0" w:before="0" w:line="252" w:lineRule="auto"/>
+            </w:pPr>
+            <w:r>
+              <w:rPr>
+                <w:b w:val="0"/>
+                <w:sz w:val="21"/>
+              </w:rPr>
+              <w:t>193,060</w:t>
+            </w:r>
+          </w:p>
+        </w:tc>
+        <w:tc>
+          <w:tcPr>
+            <w:tcW w:type="dxa" w:w="3600"/>
+            <w:vAlign w:val="center"/>
+          </w:tcPr>
+          <w:p>
+            <w:pPr>
+              <w:keepNext w:val="0"/>
+              <w:spacing w:after="0" w:before="0" w:line="252" w:lineRule="auto"/>
+            </w:pPr>
+            <w:r>
+              <w:rPr>
+                <w:b w:val="0"/>
+                <w:sz w:val="21"/>
+              </w:rPr>
+              <w:t>0.92 (-0.50 to 2.34)</w:t>
+            </w:r>
+          </w:p>
+        </w:tc>
+      </w:tr>
+      <w:tr>
+        <w:trPr>
+          <w:cantSplit/>
+        </w:trPr>
+        <w:tc>
+          <w:tcPr>
+            <w:tcW w:type="dxa" w:w="4248"/>
+            <w:vAlign w:val="center"/>
+          </w:tcPr>
+          <w:p>
+            <w:pPr>
+              <w:keepNext w:val="0"/>
+              <w:spacing w:after="0" w:before="0" w:line="252" w:lineRule="auto"/>
+            </w:pPr>
+            <w:r>
+              <w:rPr>
+                <w:b w:val="0"/>
+                <w:sz w:val="21"/>
+              </w:rPr>
+              <w:t>Exclude 2020–2021</w:t>
+            </w:r>
+          </w:p>
+        </w:tc>
+        <w:tc>
+          <w:tcPr>
+            <w:tcW w:type="dxa" w:w="1512"/>
+            <w:vAlign w:val="center"/>
+          </w:tcPr>
+          <w:p>
+            <w:pPr>
+              <w:keepNext w:val="0"/>
+              <w:spacing w:after="0" w:before="0" w:line="252" w:lineRule="auto"/>
+            </w:pPr>
+            <w:r>
+              <w:rPr>
+                <w:b w:val="0"/>
+                <w:sz w:val="21"/>
+              </w:rPr>
+              <w:t>156,651</w:t>
+            </w:r>
+          </w:p>
+        </w:tc>
+        <w:tc>
+          <w:tcPr>
+            <w:tcW w:type="dxa" w:w="3600"/>
+            <w:vAlign w:val="center"/>
+          </w:tcPr>
+          <w:p>
+            <w:pPr>
+              <w:keepNext w:val="0"/>
+              <w:spacing w:after="0" w:before="0" w:line="252" w:lineRule="auto"/>
+            </w:pPr>
+            <w:r>
+              <w:rPr>
+                <w:b w:val="0"/>
+                <w:sz w:val="21"/>
+              </w:rPr>
+              <w:t>-0.13 (-1.27 to 1.02)</w:t>
+            </w:r>
+          </w:p>
+        </w:tc>
+      </w:tr>
+      <w:tr>
+        <w:trPr>
+          <w:cantSplit/>
+        </w:trPr>
+        <w:tc>
+          <w:tcPr>
+            <w:tcW w:type="dxa" w:w="4248"/>
+            <w:vAlign w:val="center"/>
+          </w:tcPr>
+          <w:p>
+            <w:pPr>
+              <w:keepNext w:val="0"/>
+              <w:spacing w:after="0" w:before="0" w:line="252" w:lineRule="auto"/>
+            </w:pPr>
+            <w:r>
+              <w:rPr>
+                <w:b w:val="0"/>
+                <w:sz w:val="21"/>
+              </w:rPr>
+              <w:t>State-specific linear trends</w:t>
+            </w:r>
+          </w:p>
+        </w:tc>
+        <w:tc>
+          <w:tcPr>
+            <w:tcW w:type="dxa" w:w="1512"/>
+            <w:vAlign w:val="center"/>
+          </w:tcPr>
+          <w:p>
+            <w:pPr>
+              <w:keepNext w:val="0"/>
+              <w:spacing w:after="0" w:before="0" w:line="252" w:lineRule="auto"/>
+            </w:pPr>
+            <w:r>
+              <w:rPr>
+                <w:b w:val="0"/>
+                <w:sz w:val="21"/>
+              </w:rPr>
+              <w:t>193,060</w:t>
+            </w:r>
+          </w:p>
+        </w:tc>
+        <w:tc>
+          <w:tcPr>
+            <w:tcW w:type="dxa" w:w="3600"/>
+            <w:vAlign w:val="center"/>
+          </w:tcPr>
+          <w:p>
+            <w:pPr>
+              <w:keepNext w:val="0"/>
+              <w:spacing w:after="0" w:before="0" w:line="252" w:lineRule="auto"/>
+            </w:pPr>
+            <w:r>
+              <w:rPr>
+                <w:b w:val="0"/>
+                <w:sz w:val="21"/>
+              </w:rPr>
+              <w:t>-1.17 (-2.65 to 0.31)</w:t>
+            </w:r>
+          </w:p>
+        </w:tc>
+      </w:tr>
+      <w:tr>
+        <w:trPr>
+          <w:cantSplit/>
+        </w:trPr>
+        <w:tc>
+          <w:tcPr>
+            <w:tcW w:type="dxa" w:w="4248"/>
+            <w:vAlign w:val="center"/>
+          </w:tcPr>
+          <w:p>
+            <w:pPr>
+              <w:keepNext w:val="0"/>
+              <w:spacing w:after="0" w:before="0" w:line="252" w:lineRule="auto"/>
+            </w:pPr>
+            <w:r>
+              <w:rPr>
+                <w:b w:val="0"/>
+                <w:sz w:val="21"/>
+              </w:rPr>
+              <w:t>Equal total weight per state-year</w:t>
+            </w:r>
+          </w:p>
+        </w:tc>
+        <w:tc>
+          <w:tcPr>
+            <w:tcW w:type="dxa" w:w="1512"/>
+            <w:vAlign w:val="center"/>
+          </w:tcPr>
+          <w:p>
+            <w:pPr>
+              <w:keepNext w:val="0"/>
+              <w:spacing w:after="0" w:before="0" w:line="252" w:lineRule="auto"/>
+            </w:pPr>
+            <w:r>
+              <w:rPr>
+                <w:b w:val="0"/>
+                <w:sz w:val="21"/>
+              </w:rPr>
+              <w:t>193,060</w:t>
+            </w:r>
+          </w:p>
+        </w:tc>
+        <w:tc>
+          <w:tcPr>
+            <w:tcW w:type="dxa" w:w="3600"/>
+            <w:vAlign w:val="center"/>
+          </w:tcPr>
+          <w:p>
+            <w:pPr>
+              <w:keepNext w:val="0"/>
+              <w:spacing w:after="0" w:before="0" w:line="252" w:lineRule="auto"/>
+            </w:pPr>
+            <w:r>
+              <w:rPr>
+                <w:b w:val="0"/>
+                <w:sz w:val="21"/>
+              </w:rPr>
+              <w:t>-0.43 (-1.88 to 1.02)</w:t>
+            </w:r>
+          </w:p>
+        </w:tc>
+      </w:tr>
+      <w:tr>
+        <w:trPr>
+          <w:cantSplit/>
+        </w:trPr>
+        <w:tc>
+          <w:tcPr>
+            <w:tcW w:type="dxa" w:w="4248"/>
+            <w:vAlign w:val="center"/>
+          </w:tcPr>
+          <w:p>
+            <w:pPr>
+              <w:keepNext w:val="0"/>
+              <w:spacing w:after="0" w:before="0" w:line="252" w:lineRule="auto"/>
+            </w:pPr>
+            <w:r>
+              <w:rPr>
+                <w:b w:val="0"/>
+                <w:sz w:val="21"/>
+              </w:rPr>
+              <w:t>46 continuously observed states</w:t>
+            </w:r>
+          </w:p>
+        </w:tc>
+        <w:tc>
+          <w:tcPr>
+            <w:tcW w:type="dxa" w:w="1512"/>
+            <w:vAlign w:val="center"/>
+          </w:tcPr>
+          <w:p>
+            <w:pPr>
+              <w:keepNext w:val="0"/>
+              <w:spacing w:after="0" w:before="0" w:line="252" w:lineRule="auto"/>
+            </w:pPr>
+            <w:r>
+              <w:rPr>
+                <w:b w:val="0"/>
+                <w:sz w:val="21"/>
+              </w:rPr>
+              <w:t>171,237</w:t>
+            </w:r>
+          </w:p>
+        </w:tc>
+        <w:tc>
+          <w:tcPr>
+            <w:tcW w:type="dxa" w:w="3600"/>
+            <w:vAlign w:val="center"/>
+          </w:tcPr>
+          <w:p>
+            <w:pPr>
+              <w:keepNext w:val="0"/>
+              <w:spacing w:after="0" w:before="0" w:line="252" w:lineRule="auto"/>
+            </w:pPr>
+            <w:r>
+              <w:rPr>
+                <w:b w:val="0"/>
+                <w:sz w:val="21"/>
+              </w:rPr>
+              <w:t>-0.78 (-2.27 to 0.72)</w:t>
+            </w:r>
+          </w:p>
+        </w:tc>
+      </w:tr>
+      <w:tr>
+        <w:trPr>
+          <w:cantSplit/>
+        </w:trPr>
+        <w:tc>
+          <w:tcPr>
+            <w:tcW w:type="dxa" w:w="4248"/>
+            <w:vAlign w:val="center"/>
+          </w:tcPr>
+          <w:p>
+            <w:pPr>
+              <w:keepNext w:val="0"/>
+              <w:spacing w:after="0" w:before="0" w:line="252" w:lineRule="auto"/>
+            </w:pPr>
+            <w:r>
+              <w:rPr>
+                <w:b w:val="0"/>
+                <w:sz w:val="21"/>
+              </w:rPr>
+              <w:t>Out of work &lt;1 year</w:t>
+            </w:r>
+          </w:p>
+        </w:tc>
+        <w:tc>
+          <w:tcPr>
+            <w:tcW w:type="dxa" w:w="1512"/>
+            <w:vAlign w:val="center"/>
+          </w:tcPr>
+          <w:p>
+            <w:pPr>
+              <w:keepNext w:val="0"/>
+              <w:spacing w:after="0" w:before="0" w:line="252" w:lineRule="auto"/>
+            </w:pPr>
+            <w:r>
+              <w:rPr>
+                <w:b w:val="0"/>
+                <w:sz w:val="21"/>
+              </w:rPr>
+              <w:t>103,820</w:t>
+            </w:r>
+          </w:p>
+        </w:tc>
+        <w:tc>
+          <w:tcPr>
+            <w:tcW w:type="dxa" w:w="3600"/>
+            <w:vAlign w:val="center"/>
+          </w:tcPr>
+          <w:p>
+            <w:pPr>
+              <w:keepNext w:val="0"/>
+              <w:spacing w:after="0" w:before="0" w:line="252" w:lineRule="auto"/>
+            </w:pPr>
+            <w:r>
+              <w:rPr>
+                <w:b w:val="0"/>
+                <w:sz w:val="21"/>
+              </w:rPr>
+              <w:t>-1.64 (-3.14 to -0.13)</w:t>
+            </w:r>
+          </w:p>
+        </w:tc>
+      </w:tr>
+      <w:tr>
+        <w:trPr>
+          <w:cantSplit/>
+        </w:trPr>
+        <w:tc>
+          <w:tcPr>
+            <w:tcW w:type="dxa" w:w="4248"/>
+            <w:vAlign w:val="center"/>
+          </w:tcPr>
+          <w:p>
+            <w:pPr>
+              <w:keepNext w:val="0"/>
+              <w:spacing w:after="0" w:before="0" w:line="252" w:lineRule="auto"/>
+            </w:pPr>
+            <w:r>
+              <w:rPr>
+                <w:b w:val="0"/>
+                <w:sz w:val="21"/>
+              </w:rPr>
+              <w:t>Out of work ≥1 year</w:t>
+            </w:r>
+          </w:p>
+        </w:tc>
+        <w:tc>
+          <w:tcPr>
+            <w:tcW w:type="dxa" w:w="1512"/>
+            <w:vAlign w:val="center"/>
+          </w:tcPr>
+          <w:p>
+            <w:pPr>
+              <w:keepNext w:val="0"/>
+              <w:spacing w:after="0" w:before="0" w:line="252" w:lineRule="auto"/>
+            </w:pPr>
+            <w:r>
+              <w:rPr>
+                <w:b w:val="0"/>
+                <w:sz w:val="21"/>
+              </w:rPr>
+              <w:t>89,240</w:t>
+            </w:r>
+          </w:p>
+        </w:tc>
+        <w:tc>
+          <w:tcPr>
+            <w:tcW w:type="dxa" w:w="3600"/>
+            <w:vAlign w:val="center"/>
+          </w:tcPr>
+          <w:p>
+            <w:pPr>
+              <w:keepNext w:val="0"/>
+              <w:spacing w:after="0" w:before="0" w:line="252" w:lineRule="auto"/>
+            </w:pPr>
+            <w:r>
+              <w:rPr>
+                <w:b w:val="0"/>
+                <w:sz w:val="21"/>
+              </w:rPr>
+              <w:t>0.65 (-1.50 to 2.79)</w:t>
+            </w:r>
+          </w:p>
+        </w:tc>
+      </w:tr>
+      <w:tr>
+        <w:trPr>
+          <w:cantSplit/>
+        </w:trPr>
+        <w:tc>
+          <w:tcPr>
+            <w:tcW w:type="dxa" w:w="4248"/>
+            <w:vAlign w:val="center"/>
+          </w:tcPr>
+          <w:p>
+            <w:pPr>
+              <w:keepNext w:val="0"/>
+              <w:spacing w:after="0" w:before="0" w:line="252" w:lineRule="auto"/>
+            </w:pPr>
+            <w:r>
+              <w:rPr>
+                <w:b w:val="0"/>
+                <w:sz w:val="21"/>
+              </w:rPr>
+              <w:t>Employed adults</w:t>
+            </w:r>
+          </w:p>
+        </w:tc>
+        <w:tc>
+          <w:tcPr>
+            <w:tcW w:type="dxa" w:w="1512"/>
+            <w:vAlign w:val="center"/>
+          </w:tcPr>
+          <w:p>
+            <w:pPr>
+              <w:keepNext w:val="0"/>
+              <w:spacing w:after="0" w:before="0" w:line="252" w:lineRule="auto"/>
+            </w:pPr>
+            <w:r>
+              <w:rPr>
+                <w:b w:val="0"/>
+                <w:sz w:val="21"/>
+              </w:rPr>
+              <w:t>2,223,024</w:t>
+            </w:r>
+          </w:p>
+        </w:tc>
+        <w:tc>
+          <w:tcPr>
+            <w:tcW w:type="dxa" w:w="3600"/>
+            <w:vAlign w:val="center"/>
+          </w:tcPr>
+          <w:p>
+            <w:pPr>
+              <w:keepNext w:val="0"/>
+              <w:spacing w:after="0" w:before="0" w:line="252" w:lineRule="auto"/>
+            </w:pPr>
+            <w:r>
+              <w:rPr>
+                <w:b w:val="0"/>
+                <w:sz w:val="21"/>
+              </w:rPr>
+              <w:t>0.01 (-0.37 to 0.40)</w:t>
+            </w:r>
+          </w:p>
+        </w:tc>
+      </w:tr>
+      <w:tr>
+        <w:trPr>
+          <w:cantSplit/>
+        </w:trPr>
+        <w:tc>
+          <w:tcPr>
+            <w:tcW w:type="dxa" w:w="4248"/>
+            <w:vAlign w:val="center"/>
+          </w:tcPr>
+          <w:p>
+            <w:pPr>
+              <w:keepNext w:val="0"/>
+              <w:spacing w:after="0" w:before="0" w:line="252" w:lineRule="auto"/>
+            </w:pPr>
+            <w:r>
+              <w:rPr>
+                <w:b w:val="0"/>
+                <w:sz w:val="21"/>
+              </w:rPr>
+              <w:t>Through 2025: 11-month unemployment input</w:t>
+            </w:r>
+          </w:p>
+        </w:tc>
+        <w:tc>
+          <w:tcPr>
+            <w:tcW w:type="dxa" w:w="1512"/>
+            <w:vAlign w:val="center"/>
+          </w:tcPr>
+          <w:p>
+            <w:pPr>
+              <w:keepNext w:val="0"/>
+              <w:spacing w:after="0" w:before="0" w:line="252" w:lineRule="auto"/>
+            </w:pPr>
+            <w:r>
+              <w:rPr>
+                <w:b w:val="0"/>
+                <w:sz w:val="21"/>
+              </w:rPr>
+              <w:t>205,592</w:t>
+            </w:r>
+          </w:p>
+        </w:tc>
+        <w:tc>
+          <w:tcPr>
+            <w:tcW w:type="dxa" w:w="3600"/>
+            <w:vAlign w:val="center"/>
+          </w:tcPr>
+          <w:p>
+            <w:pPr>
+              <w:keepNext w:val="0"/>
+              <w:spacing w:after="0" w:before="0" w:line="252" w:lineRule="auto"/>
+            </w:pPr>
+            <w:r>
+              <w:rPr>
+                <w:b w:val="0"/>
+                <w:sz w:val="21"/>
+              </w:rPr>
+              <w:t>-0.40 (-1.86 to 1.07)</w:t>
+            </w:r>
+          </w:p>
+        </w:tc>
+      </w:tr>
+      <w:tr>
+        <w:trPr>
+          <w:cantSplit/>
+        </w:trPr>
+        <w:tc>
+          <w:tcPr>
+            <w:tcW w:type="dxa" w:w="4248"/>
+            <w:vAlign w:val="center"/>
+          </w:tcPr>
+          <w:p>
+            <w:pPr>
+              <w:keepNext w:val="0"/>
+              <w:spacing w:after="0" w:before="0" w:line="252" w:lineRule="auto"/>
+            </w:pPr>
+            <w:r>
+              <w:rPr>
+                <w:b w:val="0"/>
+                <w:sz w:val="21"/>
+              </w:rPr>
+              <w:t>Logistic average marginal association (post hoc)</w:t>
+            </w:r>
+          </w:p>
+        </w:tc>
+        <w:tc>
+          <w:tcPr>
+            <w:tcW w:type="dxa" w:w="1512"/>
+            <w:vAlign w:val="center"/>
+          </w:tcPr>
+          <w:p>
+            <w:pPr>
+              <w:keepNext w:val="0"/>
+              <w:spacing w:after="0" w:before="0" w:line="252" w:lineRule="auto"/>
+            </w:pPr>
+            <w:r>
+              <w:rPr>
+                <w:b w:val="0"/>
+                <w:sz w:val="21"/>
+              </w:rPr>
+              <w:t>193,060</w:t>
+            </w:r>
+          </w:p>
+        </w:tc>
+        <w:tc>
+          <w:tcPr>
+            <w:tcW w:type="dxa" w:w="3600"/>
+            <w:vAlign w:val="center"/>
+          </w:tcPr>
+          <w:p>
+            <w:pPr>
+              <w:keepNext w:val="0"/>
+              <w:spacing w:after="0" w:before="0" w:line="252" w:lineRule="auto"/>
+            </w:pPr>
+            <w:r>
+              <w:rPr>
+                <w:b w:val="0"/>
+                <w:sz w:val="21"/>
+              </w:rPr>
+              <w:t>-0.65 (-1.88 to 0.59)</w:t>
             </w:r>
           </w:p>
         </w:tc>
@@ -1231,119 +2152,12 @@
         <w:rPr>
           <w:sz w:val="20"/>
         </w:rPr>
-        <w:t>These are proposed intervention targets, not demonstrated causes of psychiatric disorder or proven treatments. Evaluate mental health, employment quality, access, and unintended effects together. Process transparency does not require sharing confidential evaluations or collecting clinical information for hiring decisions.</w:t>
+        <w:t>All rows use a one-percentage-point lower hiring rate; all except the explicitly unadjusted-for-unemployment row include unemployment. The continuous-days check gave -0.19 (-0.58 to 0.20) mentally unhealthy days per month. The outcome units in this last estimate are days, not percentage points. Full coefficients, including the unemployment term in every model, are in results/models.csv.</w:t>
       </w:r>
     </w:p>
     <w:p>
       <w:r>
-        <w:t>Responsibility is shared but should be assigned explicitly. Employers control vacancy authorization, selection demands, and final decisions. Platforms control how opportunities and status information are presented and what conduct they require from participating employers. Recruitment intermediaries can document where delays arise and communicate realistic expectations. Agreements among these actors should specify who updates applicants and who closes a vacancy. A process with several owners should not leave the applicant without an answer.</w:t>
-      </w:r>
-    </w:p>
-    <w:p>
-      <w:r>
-        <w:t>Economic conditions also matter. Communication standards cannot create sufficient good jobs, replace income support, or remove discrimination throughout the labor market. Evidence connecting financial strain and time pressure to mental health makes those limits central to the position. [4, 5] The practical aim is to reduce avoidable burdens within hiring while keeping broader employment and social protection policy in view.</w:t>
-      </w:r>
-    </w:p>
-    <w:p>
-      <w:r>
-        <w:t>Industry evaluation should include unsuccessful applicants, people who withdraw, and those who stop using a platform. Studying only completed hires would overlook many people most exposed to uncertainty and rejection. Results should report who was reached, who declined research participation, and who was lost to follow-up. Applicants should be able to participate or decline without affecting selection, with health information held by an independent research team and separated from hiring records available to decision-makers.</w:t>
-      </w:r>
-    </w:p>
-    <w:p>
-      <w:pPr>
-        <w:pStyle w:val="Heading1"/>
-      </w:pPr>
-      <w:r>
-        <w:t>A testable research agenda</w:t>
-      </w:r>
-    </w:p>
-    <w:p>
-      <w:r>
-        <w:t>The next study should measure the exposure directly. Recruit people near the start of a search, including employed searchers, and measure baseline mental health, recent job loss, prior health history, financial resources, caregiving responsibilities, and occupational circumstances. Follow participants at fixed intervals through search, withdrawal, and reemployment. Link consented process records to repeated reports of uncertainty and control, and assess symptoms using the same validated scales at each wave. Logging application volume alone is insufficient: applying repeatedly may be a response to distress or a poor labor market, as well as a source of strain. [2]</w:t>
-      </w:r>
-    </w:p>
-    <w:p>
-      <w:r>
-        <w:t>A regression framework can make the question transparent. The primary observational model would relate later symptom severity to a previously measured hiring exposure, adjusting for baseline symptoms and prespecified confounders. Repeated observations would require allowance for clustering within people and shared employers or platforms. Calendar time and local labor-market conditions should be measured where possible. A temporal sequence improves interpretation but does not itself eliminate unmeasured confounding, selection, or changes in exposure caused by earlier symptoms.</w:t>
-      </w:r>
-    </w:p>
-    <w:p>
-      <w:r>
-        <w:t>A stronger test would randomize an organizational practice, such as scheduled status updates and a defined closure procedure, across employers or hiring units. Applicants would receive the practice assigned to the unit, and the primary analysis would compare later symptoms by assignment, adjusting for baseline symptoms and the randomization design. Follow-up should continue after withdrawal or employment. Conditioning the main analysis on eventual hiring would select on an outcome the intervention may itself change. The primary endpoint, follow-up interval, clinically relevant difference, sample size, and approach to attrition should be specified before recruitment.</w:t>
-      </w:r>
-    </w:p>
-    <w:p>
-      <w:r>
-        <w:t>For mechanism testing, a longitudinal structural equation model could examine whether an earlier exposure predicts later uncertainty or loss of control, which in turn predicts subsequent symptoms. Exposure records, mediators, and outcomes should remain distinct. Such a model requires adequate repeated measurements, a justified measurement model, and explicit assumptions about confounding of each pathway. Model fit alone would not establish causation. The current NHIS illustration contains neither the exposures nor the temporal sequence needed for that analysis, so no mediation or structural equation model is fitted here.</w:t>
-      </w:r>
-    </w:p>
-    <w:p>
-      <w:r>
-        <w:t>The most consequential research question is comparative: which changes reduce symptoms without reducing access to suitable work or transferring burdens to disadvantaged applicants? Trials should measure employment quality and access alongside health, examine variation across relevant social groups, and publish null or adverse findings. A feature that improves employer satisfaction while increasing applicant distress would not meet this public health standard.</w:t>
-      </w:r>
-    </w:p>
-    <w:p>
-      <w:pPr>
-        <w:pStyle w:val="Heading1"/>
-      </w:pPr>
-      <w:r>
-        <w:t>Limitations of the position and illustration</w:t>
-      </w:r>
-    </w:p>
-    <w:p>
-      <w:r>
-        <w:t>The empirical illustration has several limits. Its broad unemployment/search category does not identify active searching, search duration, the number of applications, or exposure to specific hiring practices. The employed comparator includes some job seekers and heterogeneous work arrangements. The surveys are cross-sectional, so the direction of the association is unresolved. Prior mental health, wealth, job quality, and local opportunity are incompletely captured by the adjustment set. Self-reported symptoms are screening measures, and exclusion of institutionalized populations limits coverage.</w:t>
-      </w:r>
-    </w:p>
-    <w:p>
-      <w:r>
-        <w:t>Small numbers in the unemployment/search group produce wider intervals than in the employed group. Complete-case analysis assumes that the remaining exclusions do not materially distort comparisons; the missing-outcome bounds do not address all selection processes. Survey weights reduce some coverage and nonresponse differences but cannot guarantee their removal. The 2025 NHIS introduced a new sample design and experienced a federal-funding-related interruption in data collection; its final weighted Sample Adult response rate was 41.3%. [11] These features reinforce caution about time comparisons. Pooled results describe the two included survey years, not an average of every year from 2022 through 2025.</w:t>
-      </w:r>
-    </w:p>
-    <w:p>
-      <w:r>
-        <w:t>The position also extends beyond the directly observed evidence. Findings from earlier studies and other countries make specific mechanisms plausible, but do not establish their present prevalence in United States hiring. The literature discussed is a focused selection supporting a position, not a systematic review. No estimate is offered of the number of illnesses caused by hiring systems, the share preventable by platform changes, or an economic return on intervention. Those are empirical questions for the proposed studies.</w:t>
-      </w:r>
-    </w:p>
-    <w:p>
-      <w:pPr>
-        <w:pStyle w:val="Heading1"/>
-      </w:pPr>
-      <w:r>
-        <w:t>Conclusion</w:t>
-      </w:r>
-    </w:p>
-    <w:p>
-      <w:r>
-        <w:t>People seeking work should not have to bear avoidable uncertainty, demands, and exclusion simply because these costs are difficult for hiring organizations to see. Public data show a substantial symptom burden among adults classified as unemployed, laid off, or looking for work. Existing research gives reason to investigate the search environment itself. The next step is to measure that environment and test changes to it. Employers, platforms, and public health researchers can make access to work an object of prevention as well as an employment outcome.</w:t>
-      </w:r>
-    </w:p>
-    <w:p>
-      <w:pPr>
-        <w:pStyle w:val="Heading1"/>
-      </w:pPr>
-      <w:r>
-        <w:t>Declarations</w:t>
-      </w:r>
-    </w:p>
-    <w:p>
-      <w:r>
-        <w:t>Competing interests: Jacob E. Thomas works in recruitment marketing at Results Generation. This industry affiliation is relevant to the position advanced here. No proprietary applicant records, platform analytics, or employer data were used in the empirical illustration.</w:t>
-      </w:r>
-    </w:p>
-    <w:p>
-      <w:r>
-        <w:t>Funding: No external funding.</w:t>
-      </w:r>
-    </w:p>
-    <w:p>
-      <w:r>
-        <w:t>Ethics: The empirical illustration is a secondary analysis of deidentified, publicly released NHIS files. It involved no participant recruitment or access to restricted records.</w:t>
-      </w:r>
-    </w:p>
-    <w:p>
-      <w:r>
-        <w:t>Data and code: Official source files, SHA-256 checksums, the analysis plan, code, generated results, reference audit, and manuscript source are available in the PsychologicalRecession repository. [15] The archived exploratory index is not used in this analysis. All essential methods, results, tables, and references are included in this paper.</w:t>
+        <w:t>The main linear model’s predicted probabilities were outside zero to one for 0.009% of the weighted out-of-work sample. The logistic check uses the same covariates and state-clustered delta-method uncertainty for the average marginal association. It was added after inspecting the initial model diagnostics and is therefore labeled post hoc. All other checks above were specified before fitting. Leave-one-state-out hiring estimates ranged from -1.07 to -0.33 percentage points; omitting one state did not turn the primary estimate into a positive point estimate.</w:t>
       </w:r>
     </w:p>
     <w:p>
@@ -1362,16 +2176,38 @@
     <w:p>
       <w:pPr>
         <w:keepLines/>
-        <w:spacing w:line="252" w:lineRule="auto" w:after="100"/>
+        <w:spacing w:line="252" w:lineRule="auto" w:after="120"/>
         <w:ind w:left="331" w:hanging="331"/>
       </w:pPr>
       <w:r>
         <w:rPr>
           <w:sz w:val="21"/>
         </w:rPr>
-        <w:t xml:space="preserve">1. Paul KI, Moser K. Unemployment impairs mental health: Meta-analyses. Journal of Vocational Behavior. 2009;74(3):264–282. </w:t>
+        <w:t xml:space="preserve">1. Rugaber C. “No hire” job market leaves unemployed in limbo as threats to economy multiply. Associated Press. November 7, 2025. </w:t>
       </w:r>
       <w:hyperlink r:id="rId11">
+        <w:r>
+          <w:rPr>
+            <w:color w:val="244D5B"/>
+            <w:sz w:val="21"/>
+          </w:rPr>
+          <w:t>https://apnews.com/article/c48fd84dfaa71eee962feb3a88fd8575</w:t>
+        </w:r>
+      </w:hyperlink>
+    </w:p>
+    <w:p>
+      <w:pPr>
+        <w:keepLines/>
+        <w:spacing w:line="252" w:lineRule="auto" w:after="120"/>
+        <w:ind w:left="331" w:hanging="331"/>
+      </w:pPr>
+      <w:r>
+        <w:rPr>
+          <w:sz w:val="21"/>
+        </w:rPr>
+        <w:t xml:space="preserve">2. Paul KI, Moser K. Unemployment impairs mental health: Meta-analyses. Journal of Vocational Behavior. 2009;74(3):264–282. </w:t>
+      </w:r>
+      <w:hyperlink r:id="rId12">
         <w:r>
           <w:rPr>
             <w:color w:val="244D5B"/>
@@ -1384,16 +2220,104 @@
     <w:p>
       <w:pPr>
         <w:keepLines/>
-        <w:spacing w:line="252" w:lineRule="auto" w:after="100"/>
+        <w:spacing w:line="252" w:lineRule="auto" w:after="120"/>
         <w:ind w:left="331" w:hanging="331"/>
       </w:pPr>
       <w:r>
         <w:rPr>
           <w:sz w:val="21"/>
         </w:rPr>
-        <w:t xml:space="preserve">2. Song Z, Uy MA, Zhang S, Shi K. Daily job search and psychological distress: Evidence from China. Human Relations. 2009;62(8):1171–1197. </w:t>
+        <w:t xml:space="preserve">3. Charles KK, DeCicca P. Local labor market fluctuations and health: Is there a connection and for whom? Journal of Health Economics. 2008;27(6):1532–1550. </w:t>
       </w:r>
-      <w:hyperlink r:id="rId12">
+      <w:hyperlink r:id="rId13">
+        <w:r>
+          <w:rPr>
+            <w:color w:val="244D5B"/>
+            <w:sz w:val="21"/>
+          </w:rPr>
+          <w:t>https://doi.org/10.1016/j.jhealeco.2008.06.004</w:t>
+        </w:r>
+      </w:hyperlink>
+    </w:p>
+    <w:p>
+      <w:pPr>
+        <w:keepLines/>
+        <w:spacing w:line="252" w:lineRule="auto" w:after="120"/>
+        <w:ind w:left="331" w:hanging="331"/>
+      </w:pPr>
+      <w:r>
+        <w:rPr>
+          <w:sz w:val="21"/>
+        </w:rPr>
+        <w:t xml:space="preserve">4. Farré L, Fasani F, Mueller H. Feeling useless: The effect of unemployment on mental health in the Great Recession. IZA Journal of Labor Economics. 2018;7:8. </w:t>
+      </w:r>
+      <w:hyperlink r:id="rId14">
+        <w:r>
+          <w:rPr>
+            <w:color w:val="244D5B"/>
+            <w:sz w:val="21"/>
+          </w:rPr>
+          <w:t>https://doi.org/10.1186/s40172-018-0068-5</w:t>
+        </w:r>
+      </w:hyperlink>
+    </w:p>
+    <w:p>
+      <w:pPr>
+        <w:keepLines/>
+        <w:spacing w:line="252" w:lineRule="auto" w:after="120"/>
+        <w:ind w:left="331" w:hanging="331"/>
+      </w:pPr>
+      <w:r>
+        <w:rPr>
+          <w:sz w:val="21"/>
+        </w:rPr>
+        <w:t xml:space="preserve">5. Clark AE. Unemployment as a social norm: Psychological evidence from panel data. Journal of Labor Economics. 2003;21(2):323–351. </w:t>
+      </w:r>
+      <w:hyperlink r:id="rId15">
+        <w:r>
+          <w:rPr>
+            <w:color w:val="244D5B"/>
+            <w:sz w:val="21"/>
+          </w:rPr>
+          <w:t>https://doi.org/10.1086/345560</w:t>
+        </w:r>
+      </w:hyperlink>
+    </w:p>
+    <w:p>
+      <w:pPr>
+        <w:keepLines/>
+        <w:spacing w:line="252" w:lineRule="auto" w:after="120"/>
+        <w:ind w:left="331" w:hanging="331"/>
+      </w:pPr>
+      <w:r>
+        <w:rPr>
+          <w:sz w:val="21"/>
+        </w:rPr>
+        <w:t xml:space="preserve">6. Gagné T, Schoon I, Sacker A. Trends in young adults’ mental distress and its association with employment: Evidence from the Behavioral Risk Factor Surveillance System, 1993–2019. Preventive Medicine. 2021;150:106691. </w:t>
+      </w:r>
+      <w:hyperlink r:id="rId16">
+        <w:r>
+          <w:rPr>
+            <w:color w:val="244D5B"/>
+            <w:sz w:val="21"/>
+          </w:rPr>
+          <w:t>https://doi.org/10.1016/j.ypmed.2021.106691</w:t>
+        </w:r>
+      </w:hyperlink>
+    </w:p>
+    <w:p>
+      <w:pPr>
+        <w:keepLines/>
+        <w:spacing w:line="252" w:lineRule="auto" w:after="120"/>
+        <w:ind w:left="331" w:hanging="331"/>
+      </w:pPr>
+      <w:r>
+        <w:rPr>
+          <w:sz w:val="21"/>
+        </w:rPr>
+        <w:t xml:space="preserve">7. Song Z, Uy MA, Zhang S, Shi K. Daily job search and psychological distress: Evidence from China. Human Relations. 2009;62(8):1171–1197. </w:t>
+      </w:r>
+      <w:hyperlink r:id="rId17">
         <w:r>
           <w:rPr>
             <w:color w:val="244D5B"/>
@@ -1406,38 +2330,16 @@
     <w:p>
       <w:pPr>
         <w:keepLines/>
-        <w:spacing w:line="252" w:lineRule="auto" w:after="100"/>
+        <w:spacing w:line="252" w:lineRule="auto" w:after="120"/>
         <w:ind w:left="331" w:hanging="331"/>
       </w:pPr>
       <w:r>
         <w:rPr>
           <w:sz w:val="21"/>
         </w:rPr>
-        <w:t xml:space="preserve">3. Phelan JC, Link BG, Tehranifar P. Social conditions as fundamental causes of health inequalities: Theory, evidence, and policy implications. Journal of Health and Social Behavior. 2010;51(suppl):S28–S40. </w:t>
+        <w:t xml:space="preserve">8. Price RH, Choi JN, Vinokur AD. Links in the chain of adversity following job loss: How financial strain and loss of personal control lead to depression, impaired functioning, and poor health. Journal of Occupational Health Psychology. 2002;7(4):302–312. </w:t>
       </w:r>
-      <w:hyperlink r:id="rId13">
-        <w:r>
-          <w:rPr>
-            <w:color w:val="244D5B"/>
-            <w:sz w:val="21"/>
-          </w:rPr>
-          <w:t>https://doi.org/10.1177/0022146510383498</w:t>
-        </w:r>
-      </w:hyperlink>
-    </w:p>
-    <w:p>
-      <w:pPr>
-        <w:keepLines/>
-        <w:spacing w:line="252" w:lineRule="auto" w:after="100"/>
-        <w:ind w:left="331" w:hanging="331"/>
-      </w:pPr>
-      <w:r>
-        <w:rPr>
-          <w:sz w:val="21"/>
-        </w:rPr>
-        <w:t xml:space="preserve">4. Price RH, Choi JN, Vinokur AD. Links in the chain of adversity following job loss: How financial strain and loss of personal control lead to depression, impaired functioning, and poor health. Journal of Occupational Health Psychology. 2002;7(4):302–312. </w:t>
-      </w:r>
-      <w:hyperlink r:id="rId14">
+      <w:hyperlink r:id="rId18">
         <w:r>
           <w:rPr>
             <w:color w:val="244D5B"/>
@@ -1450,16 +2352,16 @@
     <w:p>
       <w:pPr>
         <w:keepLines/>
-        <w:spacing w:line="252" w:lineRule="auto" w:after="100"/>
+        <w:spacing w:line="252" w:lineRule="auto" w:after="120"/>
         <w:ind w:left="331" w:hanging="331"/>
       </w:pPr>
       <w:r>
         <w:rPr>
           <w:sz w:val="21"/>
         </w:rPr>
-        <w:t xml:space="preserve">5. Wanberg CR, van Hooft EAJ, Dossinger K, van Vianen AEM, Klehe UC. How strong is my safety net? Perceived unemployment insurance generosity and implications for job search, mental health, and reemployment. Journal of Applied Psychology. 2020;105(3):209–229. </w:t>
+        <w:t xml:space="preserve">9. Wanberg CR, van Hooft EAJ, Dossinger K, van Vianen AEM, Klehe UC. How strong is my safety net? Perceived unemployment insurance generosity and implications for job search, mental health, and reemployment. Journal of Applied Psychology. 2020;105(3):209–229. </w:t>
       </w:r>
-      <w:hyperlink r:id="rId15">
+      <w:hyperlink r:id="rId19">
         <w:r>
           <w:rPr>
             <w:color w:val="244D5B"/>
@@ -1472,60 +2374,16 @@
     <w:p>
       <w:pPr>
         <w:keepLines/>
-        <w:spacing w:line="252" w:lineRule="auto" w:after="100"/>
+        <w:spacing w:line="252" w:lineRule="auto" w:after="120"/>
         <w:ind w:left="331" w:hanging="331"/>
       </w:pPr>
       <w:r>
         <w:rPr>
           <w:sz w:val="21"/>
         </w:rPr>
-        <w:t xml:space="preserve">6. Hausknecht JP, Day DV, Thomas SC. Applicant reactions to selection procedures: An updated model and meta-analysis. Personnel Psychology. 2004;57(3):639–683. </w:t>
+        <w:t xml:space="preserve">10. Bjørnshagen V. The mark of mental health problems. A field experiment on hiring discrimination before and during COVID-19. Social Science &amp; Medicine. 2021;283:114181. </w:t>
       </w:r>
-      <w:hyperlink r:id="rId16">
-        <w:r>
-          <w:rPr>
-            <w:color w:val="244D5B"/>
-            <w:sz w:val="21"/>
-          </w:rPr>
-          <w:t>https://doi.org/10.1111/j.1744-6570.2004.00003.x</w:t>
-        </w:r>
-      </w:hyperlink>
-    </w:p>
-    <w:p>
-      <w:pPr>
-        <w:keepLines/>
-        <w:spacing w:line="252" w:lineRule="auto" w:after="100"/>
-        <w:ind w:left="331" w:hanging="331"/>
-      </w:pPr>
-      <w:r>
-        <w:rPr>
-          <w:sz w:val="21"/>
-        </w:rPr>
-        <w:t xml:space="preserve">7. Schinkel S, van Dierendonck D, van Vianen A, Ryan AM. Applicant reactions to rejection: Feedback, fairness, and attributional style effects. Journal of Personnel Psychology. 2011;10(4):146–156. </w:t>
-      </w:r>
-      <w:hyperlink r:id="rId17">
-        <w:r>
-          <w:rPr>
-            <w:color w:val="244D5B"/>
-            <w:sz w:val="21"/>
-          </w:rPr>
-          <w:t>https://doi.org/10.1027/1866-5888/a000047</w:t>
-        </w:r>
-      </w:hyperlink>
-    </w:p>
-    <w:p>
-      <w:pPr>
-        <w:keepLines/>
-        <w:spacing w:line="252" w:lineRule="auto" w:after="100"/>
-        <w:ind w:left="331" w:hanging="331"/>
-      </w:pPr>
-      <w:r>
-        <w:rPr>
-          <w:sz w:val="21"/>
-        </w:rPr>
-        <w:t xml:space="preserve">8. Bjørnshagen V. The mark of mental health problems. A field experiment on hiring discrimination before and during COVID-19. Social Science &amp; Medicine. 2021;283:114181. </w:t>
-      </w:r>
-      <w:hyperlink r:id="rId18">
+      <w:hyperlink r:id="rId20">
         <w:r>
           <w:rPr>
             <w:color w:val="244D5B"/>
@@ -1538,16 +2396,280 @@
     <w:p>
       <w:pPr>
         <w:keepLines/>
-        <w:spacing w:line="252" w:lineRule="auto" w:after="100"/>
+        <w:spacing w:line="252" w:lineRule="auto" w:after="120"/>
         <w:ind w:left="331" w:hanging="331"/>
       </w:pPr>
       <w:r>
         <w:rPr>
           <w:sz w:val="21"/>
         </w:rPr>
-        <w:t xml:space="preserve">9. Vinokur AD, Schul Y, Vuori J, Price RH. Two years after a job loss: Long-term impact of the JOBS program on reemployment and mental health. Journal of Occupational Health Psychology. 2000;5(1):32–47. </w:t>
+        <w:t xml:space="preserve">11. Hershbein BJ, Lim K, Webber D, Zabek M. Local labor market tightness and job quality: Evidence from job changers. Upjohn Institute Working Paper 26-433 [working paper]. July 2026. </w:t>
       </w:r>
-      <w:hyperlink r:id="rId19">
+      <w:hyperlink r:id="rId21">
+        <w:r>
+          <w:rPr>
+            <w:color w:val="244D5B"/>
+            <w:sz w:val="21"/>
+          </w:rPr>
+          <w:t>https://doi.org/10.17848/wp26-433</w:t>
+        </w:r>
+      </w:hyperlink>
+    </w:p>
+    <w:p>
+      <w:pPr>
+        <w:keepLines/>
+        <w:spacing w:line="252" w:lineRule="auto" w:after="120"/>
+        <w:ind w:left="331" w:hanging="331"/>
+      </w:pPr>
+      <w:r>
+        <w:rPr>
+          <w:sz w:val="21"/>
+        </w:rPr>
+        <w:t xml:space="preserve">12. Chan E. 2024 Job Seeker Insights Report: 1,000 candidates weigh in on the job search. Resume Genius. 2024. </w:t>
+      </w:r>
+      <w:hyperlink r:id="rId22">
+        <w:r>
+          <w:rPr>
+            <w:color w:val="244D5B"/>
+            <w:sz w:val="21"/>
+          </w:rPr>
+          <w:t>https://resumegenius.com/blog/job-hunting/job-seeker-insights-survey</w:t>
+        </w:r>
+      </w:hyperlink>
+    </w:p>
+    <w:p>
+      <w:pPr>
+        <w:keepLines/>
+        <w:spacing w:line="252" w:lineRule="auto" w:after="120"/>
+        <w:ind w:left="331" w:hanging="331"/>
+      </w:pPr>
+      <w:r>
+        <w:rPr>
+          <w:sz w:val="21"/>
+        </w:rPr>
+        <w:t xml:space="preserve">13. Robinson B. 72% of applicants say the job search has harmed their mental health. Forbes. September 20, 2024. </w:t>
+      </w:r>
+      <w:hyperlink r:id="rId23">
+        <w:r>
+          <w:rPr>
+            <w:color w:val="244D5B"/>
+            <w:sz w:val="21"/>
+          </w:rPr>
+          <w:t>https://www.forbes.com/sites/bryanrobinson/2024/09/20/72-of-applicants-say-the-job-search-has-harmed-their-mental-health/</w:t>
+        </w:r>
+      </w:hyperlink>
+    </w:p>
+    <w:p>
+      <w:pPr>
+        <w:keepLines/>
+        <w:spacing w:line="252" w:lineRule="auto" w:after="120"/>
+        <w:ind w:left="331" w:hanging="331"/>
+      </w:pPr>
+      <w:r>
+        <w:rPr>
+          <w:sz w:val="21"/>
+        </w:rPr>
+        <w:t xml:space="preserve">14. Alobeid D. Ghosting, ghost jobs and bots: Candidates reveal their top challenges in the Greenhouse 2024 State of Job Hunting report. Greenhouse. December 10, 2024. </w:t>
+      </w:r>
+      <w:hyperlink r:id="rId24">
+        <w:r>
+          <w:rPr>
+            <w:color w:val="244D5B"/>
+            <w:sz w:val="21"/>
+          </w:rPr>
+          <w:t>https://www.greenhouse.com/blog/greenhouse-2024-state-of-job-hunting-report</w:t>
+        </w:r>
+      </w:hyperlink>
+    </w:p>
+    <w:p>
+      <w:pPr>
+        <w:keepLines/>
+        <w:spacing w:line="252" w:lineRule="auto" w:after="120"/>
+        <w:ind w:left="331" w:hanging="331"/>
+      </w:pPr>
+      <w:r>
+        <w:rPr>
+          <w:sz w:val="21"/>
+        </w:rPr>
+        <w:t xml:space="preserve">15. Wright S. The Q1 2026 Job Search Trends Report. Huntr. 2026. </w:t>
+      </w:r>
+      <w:hyperlink r:id="rId25">
+        <w:r>
+          <w:rPr>
+            <w:color w:val="244D5B"/>
+            <w:sz w:val="21"/>
+          </w:rPr>
+          <w:t>https://huntr.co/research/job-search-trends-q1-2026</w:t>
+        </w:r>
+      </w:hyperlink>
+    </w:p>
+    <w:p>
+      <w:pPr>
+        <w:keepLines/>
+        <w:spacing w:line="252" w:lineRule="auto" w:after="120"/>
+        <w:ind w:left="331" w:hanging="331"/>
+      </w:pPr>
+      <w:r>
+        <w:rPr>
+          <w:sz w:val="21"/>
+        </w:rPr>
+        <w:t xml:space="preserve">16. Miller S, Piazza M, Bogue Simpson E, Broady K. Worker perspectives: When every dollar counts—inside the economic struggles of workers who earn low to moderate incomes. Federal Reserve; Fed Communities. June 24, 2026. </w:t>
+      </w:r>
+      <w:hyperlink r:id="rId26">
+        <w:r>
+          <w:rPr>
+            <w:color w:val="244D5B"/>
+            <w:sz w:val="21"/>
+          </w:rPr>
+          <w:t>https://doi.org/10.59695/20260624</w:t>
+        </w:r>
+      </w:hyperlink>
+    </w:p>
+    <w:p>
+      <w:pPr>
+        <w:keepLines/>
+        <w:spacing w:line="252" w:lineRule="auto" w:after="120"/>
+        <w:ind w:left="331" w:hanging="331"/>
+      </w:pPr>
+      <w:r>
+        <w:rPr>
+          <w:sz w:val="21"/>
+        </w:rPr>
+        <w:t xml:space="preserve">17. Ng H. Why is it so hard to find a job now? Enter Ghost Jobs. arXiv:2410.21771v1 [preprint]. October 29, 2024. </w:t>
+      </w:r>
+      <w:hyperlink r:id="rId27">
+        <w:r>
+          <w:rPr>
+            <w:color w:val="244D5B"/>
+            <w:sz w:val="21"/>
+          </w:rPr>
+          <w:t>https://arxiv.org/abs/2410.21771v1</w:t>
+        </w:r>
+      </w:hyperlink>
+    </w:p>
+    <w:p>
+      <w:pPr>
+        <w:keepLines/>
+        <w:spacing w:line="252" w:lineRule="auto" w:after="120"/>
+        <w:ind w:left="331" w:hanging="331"/>
+      </w:pPr>
+      <w:r>
+        <w:rPr>
+          <w:sz w:val="21"/>
+        </w:rPr>
+        <w:t xml:space="preserve">18. Centers for Disease Control and Prevention. Behavioral Risk Factor Surveillance System: Annual survey data and documentation, 2013–2025. Accessed September 29, 2026. </w:t>
+      </w:r>
+      <w:hyperlink r:id="rId28">
+        <w:r>
+          <w:rPr>
+            <w:color w:val="244D5B"/>
+            <w:sz w:val="21"/>
+          </w:rPr>
+          <w:t>https://www.cdc.gov/brfss/annual_data/annual_data.htm</w:t>
+        </w:r>
+      </w:hyperlink>
+    </w:p>
+    <w:p>
+      <w:pPr>
+        <w:keepLines/>
+        <w:spacing w:line="252" w:lineRule="auto" w:after="120"/>
+        <w:ind w:left="331" w:hanging="331"/>
+      </w:pPr>
+      <w:r>
+        <w:rPr>
+          <w:sz w:val="21"/>
+        </w:rPr>
+        <w:t xml:space="preserve">19. Centers for Disease Control and Prevention. FAQs about health-related quality-of-life measures: Frequent mental distress. Archived resource. Accessed September 29, 2026. </w:t>
+      </w:r>
+      <w:hyperlink r:id="rId29">
+        <w:r>
+          <w:rPr>
+            <w:color w:val="244D5B"/>
+            <w:sz w:val="21"/>
+          </w:rPr>
+          <w:t>https://archive.cdc.gov/www_cdc_gov/hrqol/faqs.htm</w:t>
+        </w:r>
+      </w:hyperlink>
+    </w:p>
+    <w:p>
+      <w:pPr>
+        <w:keepLines/>
+        <w:spacing w:line="252" w:lineRule="auto" w:after="120"/>
+        <w:ind w:left="331" w:hanging="331"/>
+      </w:pPr>
+      <w:r>
+        <w:rPr>
+          <w:sz w:val="21"/>
+        </w:rPr>
+        <w:t xml:space="preserve">20. Bureau of Labor Statistics. JOLTS state estimates: Methodology. Accessed September 29, 2026. </w:t>
+      </w:r>
+      <w:hyperlink r:id="rId30">
+        <w:r>
+          <w:rPr>
+            <w:color w:val="244D5B"/>
+            <w:sz w:val="21"/>
+          </w:rPr>
+          <w:t>https://www.bls.gov/jlt/jlt_statedata_methodology.htm</w:t>
+        </w:r>
+      </w:hyperlink>
+    </w:p>
+    <w:p>
+      <w:pPr>
+        <w:keepLines/>
+        <w:spacing w:line="252" w:lineRule="auto" w:after="120"/>
+        <w:ind w:left="331" w:hanging="331"/>
+      </w:pPr>
+      <w:r>
+        <w:rPr>
+          <w:sz w:val="21"/>
+        </w:rPr>
+        <w:t xml:space="preserve">21. Bureau of Labor Statistics. Local Area Unemployment Statistics: Overview. Accessed September 29, 2026. </w:t>
+      </w:r>
+      <w:hyperlink r:id="rId31">
+        <w:r>
+          <w:rPr>
+            <w:color w:val="244D5B"/>
+            <w:sz w:val="21"/>
+          </w:rPr>
+          <w:t>https://www.bls.gov/lau/lauov.htm</w:t>
+        </w:r>
+      </w:hyperlink>
+    </w:p>
+    <w:p>
+      <w:pPr>
+        <w:keepLines/>
+        <w:spacing w:line="252" w:lineRule="auto" w:after="120"/>
+        <w:ind w:left="331" w:hanging="331"/>
+      </w:pPr>
+      <w:r>
+        <w:rPr>
+          <w:sz w:val="21"/>
+        </w:rPr>
+        <w:t xml:space="preserve">22. Bureau of Labor Statistics. State employment and unemployment—January 2026. April 8, 2026. </w:t>
+      </w:r>
+      <w:hyperlink r:id="rId32">
+        <w:r>
+          <w:rPr>
+            <w:color w:val="244D5B"/>
+            <w:sz w:val="21"/>
+          </w:rPr>
+          <w:t>https://www.bls.gov/news.release/archives/laus_04082026.htm</w:t>
+        </w:r>
+      </w:hyperlink>
+    </w:p>
+    <w:p>
+      <w:pPr>
+        <w:keepLines/>
+        <w:spacing w:line="252" w:lineRule="auto" w:after="120"/>
+        <w:ind w:left="331" w:hanging="331"/>
+      </w:pPr>
+      <w:r>
+        <w:rPr>
+          <w:sz w:val="21"/>
+        </w:rPr>
+        <w:t xml:space="preserve">23. Vinokur AD, Schul Y, Vuori J, Price RH. Two years after a job loss: Long-term impact of the JOBS program on reemployment and mental health. Journal of Occupational Health Psychology. 2000;5(1):32–47. </w:t>
+      </w:r>
+      <w:hyperlink r:id="rId33">
         <w:r>
           <w:rPr>
             <w:color w:val="244D5B"/>
@@ -1560,126 +2682,16 @@
     <w:p>
       <w:pPr>
         <w:keepLines/>
-        <w:spacing w:line="252" w:lineRule="auto" w:after="100"/>
+        <w:spacing w:line="252" w:lineRule="auto" w:after="120"/>
         <w:ind w:left="331" w:hanging="331"/>
       </w:pPr>
       <w:r>
         <w:rPr>
           <w:sz w:val="21"/>
         </w:rPr>
-        <w:t xml:space="preserve">10. National Center for Health Statistics. 2022 National Health Interview Survey questionnaires, datasets, and documentation. Sample Adult public-use data, codebook, and survey description. Accessed September 29, 2026. </w:t>
+        <w:t xml:space="preserve">24. Thomas JE. PsychologicalRecession. Public data, analysis code, manuscript, and audit records. GitHub repository. Revision dated September 29, 2026. </w:t>
       </w:r>
-      <w:hyperlink r:id="rId20">
-        <w:r>
-          <w:rPr>
-            <w:color w:val="244D5B"/>
-            <w:sz w:val="21"/>
-          </w:rPr>
-          <w:t>https://www.cdc.gov/nchs/nhis/documentation/2022-nhis.html</w:t>
-        </w:r>
-      </w:hyperlink>
-    </w:p>
-    <w:p>
-      <w:pPr>
-        <w:keepLines/>
-        <w:spacing w:line="252" w:lineRule="auto" w:after="100"/>
-        <w:ind w:left="331" w:hanging="331"/>
-      </w:pPr>
-      <w:r>
-        <w:rPr>
-          <w:sz w:val="21"/>
-        </w:rPr>
-        <w:t xml:space="preserve">11. National Center for Health Statistics. 2025 National Health Interview Survey questionnaires, datasets, and documentation. Sample Adult public-use data, codebook, and survey description. Accessed September 29, 2026. </w:t>
-      </w:r>
-      <w:hyperlink r:id="rId21">
-        <w:r>
-          <w:rPr>
-            <w:color w:val="244D5B"/>
-            <w:sz w:val="21"/>
-          </w:rPr>
-          <w:t>https://www.cdc.gov/nchs/nhis/documentation/2025-nhis.html</w:t>
-        </w:r>
-      </w:hyperlink>
-    </w:p>
-    <w:p>
-      <w:pPr>
-        <w:keepLines/>
-        <w:spacing w:line="252" w:lineRule="auto" w:after="100"/>
-        <w:ind w:left="331" w:hanging="331"/>
-      </w:pPr>
-      <w:r>
-        <w:rPr>
-          <w:sz w:val="21"/>
-        </w:rPr>
-        <w:t xml:space="preserve">12. Kroenke K, Strine TW, Spitzer RL, Williams JBW, Berry JT, Mokdad AH. The PHQ-8 as a measure of current depression in the general population. Journal of Affective Disorders. 2009;114(1–3):163–173. </w:t>
-      </w:r>
-      <w:hyperlink r:id="rId22">
-        <w:r>
-          <w:rPr>
-            <w:color w:val="244D5B"/>
-            <w:sz w:val="21"/>
-          </w:rPr>
-          <w:t>https://doi.org/10.1016/j.jad.2008.06.026</w:t>
-        </w:r>
-      </w:hyperlink>
-    </w:p>
-    <w:p>
-      <w:pPr>
-        <w:keepLines/>
-        <w:spacing w:line="252" w:lineRule="auto" w:after="100"/>
-        <w:ind w:left="331" w:hanging="331"/>
-      </w:pPr>
-      <w:r>
-        <w:rPr>
-          <w:sz w:val="21"/>
-        </w:rPr>
-        <w:t xml:space="preserve">13. Spitzer RL, Kroenke K, Williams JBW, Löwe B. A brief measure for assessing generalized anxiety disorder: The GAD-7. Archives of Internal Medicine. 2006;166(10):1092–1097. </w:t>
-      </w:r>
-      <w:hyperlink r:id="rId23">
-        <w:r>
-          <w:rPr>
-            <w:color w:val="244D5B"/>
-            <w:sz w:val="21"/>
-          </w:rPr>
-          <w:t>https://doi.org/10.1001/archinte.166.10.1092</w:t>
-        </w:r>
-      </w:hyperlink>
-    </w:p>
-    <w:p>
-      <w:pPr>
-        <w:keepLines/>
-        <w:spacing w:line="252" w:lineRule="auto" w:after="100"/>
-        <w:ind w:left="331" w:hanging="331"/>
-      </w:pPr>
-      <w:r>
-        <w:rPr>
-          <w:sz w:val="21"/>
-        </w:rPr>
-        <w:t xml:space="preserve">14. Zou G. A modified Poisson regression approach to prospective studies with binary data. American Journal of Epidemiology. 2004;159(7):702–706. </w:t>
-      </w:r>
-      <w:hyperlink r:id="rId24">
-        <w:r>
-          <w:rPr>
-            <w:color w:val="244D5B"/>
-            <w:sz w:val="21"/>
-          </w:rPr>
-          <w:t>https://doi.org/10.1093/aje/kwh090</w:t>
-        </w:r>
-      </w:hyperlink>
-    </w:p>
-    <w:p>
-      <w:pPr>
-        <w:keepLines/>
-        <w:spacing w:line="252" w:lineRule="auto" w:after="100"/>
-        <w:ind w:left="331" w:hanging="331"/>
-      </w:pPr>
-      <w:r>
-        <w:rPr>
-          <w:sz w:val="21"/>
-        </w:rPr>
-        <w:t xml:space="preserve">15. Thomas JE. PsychologicalRecession. Public data, analysis code, manuscript, and audit records. GitHub repository. Revision dated September 29, 2026. </w:t>
-      </w:r>
-      <w:hyperlink r:id="rId25">
+      <w:hyperlink r:id="rId34">
         <w:r>
           <w:rPr>
             <w:color w:val="244D5B"/>
@@ -1707,11 +2719,6 @@
       <w:pStyle w:val="Footer"/>
       <w:jc w:val="center"/>
     </w:pPr>
-    <w:r>
-      <w:rPr>
-        <w:sz w:val="18"/>
-      </w:rPr>
-    </w:r>
     <w:fldSimple w:instr="PAGE"/>
   </w:p>
 </w:ftr>

</xml_diff>

<commit_message>
Recast manuscript as a concise empirical opinion editorial
</commit_message>
<xml_diff>
--- a/manuscript/Job_seeking_as_a_psychiatric_exposure.docx
+++ b/manuscript/Job_seeking_as_a_psychiatric_exposure.docx
@@ -7,7 +7,7 @@
         <w:pStyle w:val="Title"/>
       </w:pPr>
       <w:r>
-        <w:t>Job seeking as a psychiatric exposure</w:t>
+        <w:t>Job seeking is a public health issue</w:t>
       </w:r>
     </w:p>
     <w:p>
@@ -15,11 +15,12 @@
         <w:pStyle w:val="Subtitle"/>
       </w:pPr>
       <w:r>
-        <w:t>Labor-market conditions, mental distress, and the responsibilities of the hiring industry</w:t>
+        <w:t>The hiring environment as a potential psychiatric exposure</w:t>
       </w:r>
     </w:p>
     <w:p>
       <w:pPr>
+        <w:keepNext/>
         <w:spacing w:after="100"/>
       </w:pPr>
       <w:r>
@@ -28,64 +29,34 @@
     </w:p>
     <w:p>
       <w:pPr>
-        <w:spacing w:after="100"/>
-      </w:pPr>
-      <w:r>
-        <w:t>Results Generation, Austin, Texas, United States</w:t>
-      </w:r>
-    </w:p>
-    <w:p>
-      <w:pPr>
-        <w:spacing w:after="100"/>
+        <w:keepNext/>
+        <w:spacing w:after="240"/>
       </w:pPr>
       <w:r>
         <w:rPr>
           <w:sz w:val="20"/>
         </w:rPr>
-        <w:t>Correspondence: jacob.thomas@resultsgeneration.com</w:t>
-      </w:r>
-    </w:p>
-    <w:p>
-      <w:pPr>
-        <w:spacing w:after="100"/>
-      </w:pPr>
-      <w:r>
-        <w:rPr>
-          <w:sz w:val="20"/>
-        </w:rPr>
-        <w:t>Article type: Empirical editorial / position paper</w:t>
-      </w:r>
-    </w:p>
-    <w:p>
-      <w:pPr>
-        <w:pStyle w:val="Heading2"/>
-      </w:pPr>
-      <w:r>
-        <w:t>Abstract</w:t>
-      </w:r>
-    </w:p>
-    <w:p>
-      <w:pPr>
-        <w:spacing w:after="100"/>
-      </w:pPr>
-      <w:r>
-        <w:t>The conditions under which people seek work deserve attention as potential psychiatric exposures. A low unemployment rate can coexist with limited hiring, prolonged searches, and uncertainty about whether advertised opportunities will lead to employment. We bring together research on labor-market shocks, job-search experiences, industry surveys, preprints, and reporting, and estimate associations between mental-health burden and market conditions. We linked Behavioral Risk Factor Surveillance System records to state hiring, vacancy, and unemployment measures. The primary analysis included 193,060 adults aged 18–64 who reported being out of work in 607 state-years, 2013–2024. Survey-weighted regressions compared changes within states, accounting for national year effects and demographic composition. A one-percentage-point lower hiring rate was associated with -0.80 percentage points in frequent mental distress (95% confidence interval, -2.05 to 0.45), conditional on unemployment. Doubling unemployed people per opening was associated with 1.71 percentage points more distress (-0.01 to 3.44) in a separate model. Hiring estimates changed direction with lagged exposure; neither main interval excluded zero. These results do not establish that slow hiring causes illness. They show why unemployment status, access to opportunities, and the experience of searching must be measured separately. Employers and platforms should make recruitment conditions observable, enable independent evaluation, and test whether reducing avoidable uncertainty improves mental health. Industry testimony and surveys help identify exposures; representative health data and stronger research designs are needed to estimate their consequences.</w:t>
-      </w:r>
-    </w:p>
-    <w:p>
-      <w:pPr>
-        <w:spacing w:after="100"/>
-      </w:pPr>
-      <w:r>
-        <w:rPr>
-          <w:sz w:val="20"/>
-        </w:rPr>
-        <w:t>Keywords: job seeking; labor market; mental distress; hiring; structural exposure; public health</w:t>
+        <w:t>Article type: Empirical opinion editorial</w:t>
       </w:r>
     </w:p>
     <w:p>
       <w:r>
-        <w:br w:type="page"/>
+        <w:t>The hiring industry should regard the conditions of looking for work as a public health concern. Access to income, security, and a viable future can depend on an application process over which the applicant has little control. When scarce opportunities are combined with prolonged uncertainty, repeated rejection, and demands for unpaid effort, the consequences for mental health deserve attention. Employers and job platforms should be expected to examine the burdens their systems create and to test ways of reducing them.</w:t>
+      </w:r>
+    </w:p>
+    <w:p>
+      <w:r>
+        <w:t>This is what it means to consider job seeking a potential psychiatric exposure: the environment through which people must obtain work may contribute to distress and, for some, mental illness. The relevant exposure includes the availability of suitable jobs, competition for them, and the conditions imposed on applicants. It extends to people searching while employed, including those trying to leave work that is insecure or harmful. The question is how these conditions affect people over time.</w:t>
+      </w:r>
+    </w:p>
+    <w:p>
+      <w:r>
+        <w:t>An unemployment rate cannot describe this environment on its own. Associated Press reporting on the slow-hiring market in late 2025 described applicants facing canceled recruitment and prolonged searches despite relatively low unemployment. [1] A labor market can look stable from the perspective of those who already have jobs while remaining difficult to enter. For the person seeking work, the uncertainty has practical consequences: how long to keep applying, whether to retrain, which bills can wait, and when an advertised opportunity can reasonably be treated as closed.</w:t>
+      </w:r>
+    </w:p>
+    <w:p>
+      <w:r>
+        <w:t>I write from within recruitment marketing. That perspective makes the industry’s responsibility concrete. Employers and platforms make decisions about the information applicants receive, the effort required of them, and how a search can end. We should account for those decisions in our understanding of mental health. Advice about resilience may help an individual, but it cannot make an unavailable job available or obtain a response from an employer who has stopped communicating.</w:t>
       </w:r>
     </w:p>
     <w:p>
@@ -93,27 +64,37 @@
         <w:pStyle w:val="Heading1"/>
       </w:pPr>
       <w:r>
-        <w:t>The health question is about access to work</w:t>
+        <w:t>There is enough evidence to take the exposure seriously</w:t>
       </w:r>
     </w:p>
     <w:p>
       <w:r>
-        <w:t>For a person trying to obtain a job, the relevant labor market is the one they can enter. An unemployment rate describes how many people are without work and seeking it under a particular statistical definition. It does not describe how often employers hire, how many plausible opportunities an applicant encounters, or how long a search remains unresolved. Associated Press reporting in late 2025 illustrated this distinction through job seekers facing canceled recruitment and long searches during a period of low unemployment and slow hiring. [1] These experiences raise a public health question: when access to work becomes prolonged, uncertain, and difficult to influence, does the environment contribute to mental illness?</w:t>
+        <w:t>Research has long associated unemployment with poorer mental health, including changes following unemployment and reemployment. Health also affects a person’s chances of obtaining and retaining work. [2] The evidence extends beyond the simple distinction between having a job and being unemployed. Charles and DeCicca linked local labor-market conditions to mental health among working-age men in US metropolitan areas, with worse outcomes in groups facing weaker employment prospects. [3] In Spain, Farré and colleagues used the construction collapse during the Great Recession to examine the mental-health consequences of lost employment opportunities in a setting where finding another job was difficult. [4] These studies support treating access to work as part of the health environment.</w:t>
       </w:r>
     </w:p>
     <w:p>
       <w:r>
-        <w:t>We argue that job seeking should be studied as an encounter with a potentially harmful environment. The exposure includes the availability of suitable work, competition for that work, the demands of applying, and the information employers provide. Its effects may operate through financial insecurity, repeated rejection, diminished control, and uncertainty about the future. This definition includes people searching while employed. It also distinguishes active searching from simply being out of work.</w:t>
+        <w:t>The experience of searching offers plausible pathways. A daily diary study of unemployed people in China found that searching and distress were related in both directions, with negative search experiences helping explain subsequent distress. [5] Longitudinal research after job loss linked financial strain and reduced personal control to depression and impaired functioning. [6] Research across three countries also connected perceived unemployment-insurance generosity with mental health through financial strain and time pressure. [7] These findings point toward conditions that institutions can influence: resources, uncertainty, and the amount of control people retain while trying to secure work.</w:t>
       </w:r>
     </w:p>
     <w:p>
       <w:r>
-        <w:t>“Psychiatric exposure” names a research question about conditions that may contribute to symptoms or disorders. It is not a diagnosis or a claim that disappointment is itself illness. The term “psychological recession” is useful only if it directs attention to measurable burdens that conventional economic summaries miss.</w:t>
+        <w:t>There can also be a damaging feedback loop. In a Norwegian correspondence experiment, applicants who disclosed a history of mental health problems received fewer positive responses from employers. [8] People experiencing distress may therefore encounter additional barriers to employment. A public health approach must consider both the burden of trying to obtain work and the exclusion that can follow poor mental health.</w:t>
       </w:r>
     </w:p>
     <w:p>
       <w:r>
-        <w:t>Our industry perspective matters because recruitment systems are designed and maintained by identifiable organizations. Those organizations determine whether applications receive a response, whether assessments require substantial unpaid time, and whether a posting accurately describes a current opportunity. Responsibility for these conditions cannot rest entirely on applicants’ coping skills. At the same time, industry familiarity is not evidence of causation. We therefore combine a focused review of different kinds of evidence with a reproducible analysis relating mental-health burden to actual labor-market measures.</w:t>
+        <w:t>Industry reports give this question a contemporary vocabulary. In a 2024 Resume Genius survey of 1,000 active US job seekers, 72% said searching had negatively affected their mental health at some point in their lives. Forbes subsequently reported the same survey. [9, 10] This was a self-attributed lifetime experience in a selected online sample, so the percentage cannot be read as the current prevalence of a disorder. It does show why applicants’ accounts warrant a place in the research agenda.</w:t>
+      </w:r>
+    </w:p>
+    <w:p>
+      <w:r>
+        <w:t>Greenhouse’s survey summary described heightened anxiety and employers ending communication after interviews. Huntr’s platform reports describe application activity and experiences during searches. [11, 12] Federal Reserve focus groups likewise documented financial pressure, unstable employment, and barriers to obtaining better jobs. [13] These sources describe burdens that conventional employment statistics seldom capture. They help identify what should be measured, even when their samples cannot establish how common an experience is in the population.</w:t>
+      </w:r>
+    </w:p>
+    <w:p>
+      <w:r>
+        <w:t>Popular concern about “ghost jobs” belongs in this discussion, with care about what is actually known. An exploratory preprint classified online interview reviews to identify suspected ghost jobs; it did not independently establish employer intent or measure psychiatric outcomes. [14] The useful public health question is whether inaccurate or unresolved information prolongs exposure to uncertainty and wasted effort. That question can be investigated without assuming that every unsuccessful application involved a fictitious vacancy.</w:t>
       </w:r>
     </w:p>
     <w:p>
@@ -121,76 +102,27 @@
         <w:pStyle w:val="Heading1"/>
       </w:pPr>
       <w:r>
-        <w:t>What the existing evidence tells us</w:t>
-      </w:r>
-    </w:p>
-    <w:p>
-      <w:pPr>
-        <w:pStyle w:val="Heading2"/>
-      </w:pPr>
-      <w:r>
-        <w:t>Labor demand can matter beyond employment status</w:t>
+        <w:t>Public data establish a burden, but leave the mechanism unresolved</w:t>
       </w:r>
     </w:p>
     <w:p>
       <w:r>
-        <w:t>The association between unemployment and poor mental health is well established, including evidence of change following unemployment and reemployment. Health also affects entry to and exit from employment. [2] The more specific question is whether the opportunities available in a labor market alter this burden. Charles and DeCicca studied working-age men in 58 large US metropolitan areas and found that worsening conditions were associated with poorer mental health in groups with weaker employment prospects, including less-educated and Black men. [3]</w:t>
+        <w:t>We examined publicly available health and labor-market data to put this argument against evidence. We linked 193,060 out-of-work adults aged 18–64 in the Behavioral Risk Factor Surveillance System (BRFSS) to state hiring, vacancy, and unemployment measures across 2013–2024. Frequent mental distress—at least 14 mentally unhealthy days in the preceding month—was reported by 21.2% of the out-of-work group in 2013 and 28.5% in 2024. [15, 16] Those are substantial burdens. Changing survey coverage and the composition of the out-of-work population mean that the increase cannot simply be attributed to a worsening job market.</w:t>
       </w:r>
     </w:p>
     <w:p>
       <w:r>
-        <w:t>A study of Spain’s construction collapse provides a more direct link between demand for labor and health. Farré and colleagues used pre-crisis industry composition and the subsequent contraction to estimate the consequences of job losses in exposed labor markets. Their findings linked the shock to worse mental health in a setting where reemployment was difficult. [4] The design depends on assumptions about the instrument and the pathways from the construction shock to health. It nevertheless addresses a structural change in opportunity, rather than attributing all differences between employed and unemployed people to joblessness itself.</w:t>
+        <w:t>We then used regression to ask whether distress changed as a state’s market conditions changed, accounting for national year effects and measured demographic differences. The findings were mixed. Lower hiring rates did not show a consistent association with greater distress. More unemployed people competing for each opening was associated with more distress, but the estimate was uncertain. The brief analysis note below gives the estimates and their confidence intervals. These results do not demonstrate that slow hiring causes illness.</w:t>
       </w:r>
     </w:p>
     <w:p>
       <w:r>
-        <w:t>The expected relationship is not uniformly negative. Clark’s panel study found that unemployed people reported better well-being when unemployment was more common in their reference groups, particularly among men. [5] Reduced stigma may coexist with worse employment prospects. In US BRFSS data, Gagné and colleagues found that the associations of short- and long-duration out-of-work status with distress among young adults varied over time. [6] A credible account must allow for these differences instead of assuming one psychological response to every downturn.</w:t>
-      </w:r>
-    </w:p>
-    <w:p>
-      <w:pPr>
-        <w:pStyle w:val="Heading2"/>
-      </w:pPr>
-      <w:r>
-        <w:t>Search experiences offer plausible pathways</w:t>
+        <w:t>They also identify a limit to what broad indicators can tell us. A statewide hiring rate combines movement between jobs, entry into employment, and other forms of turnover. It does not tell us whether an applicant can find suitable work or whether an employer has left an application unresolved. People entering and leaving the out-of-work group also change its average health. Moreover, unemployment may carry less stigma where it is more common, even as opportunities deteriorate; Clark’s panel research illustrates that possibility. [17] A single expected relationship between an aggregate rate and distress is therefore too simple.</w:t>
       </w:r>
     </w:p>
     <w:p>
       <w:r>
-        <w:t>A daily diary study of unemployed people in China linked job searching and psychological distress in both directions; negative search experiences helped explain the association from searching to distress. [7] Longitudinal research after job loss also linked financial strain and diminished personal control to depression and impaired functioning. [8] In a study across three countries, perceived unemployment-insurance generosity was associated with mental health through financial strain and time pressure. [9] Together, these findings make the conditions of searching relevant to prevention. They do not show that an improved application process can compensate for a shortage of suitable jobs or inadequate income.</w:t>
-      </w:r>
-    </w:p>
-    <w:p>
-      <w:r>
-        <w:t>There is also a possible feedback loop. A Norwegian correspondence experiment found fewer positive employer responses when applications disclosed a history of mental health problems. [10] Poor mental health can therefore be both an outcome of difficult access to work and a source of further exclusion. The mechanism is not captured by counting vacancies alone. A 2026 Upjohn working paper, using Survey of Household Economics and Decisionmaking data, relates labor-market tightness to job changes and job quality. [11] It offers evidence about opportunity and the quality of work obtained, not a psychiatric effect estimate.</w:t>
-      </w:r>
-    </w:p>
-    <w:p>
-      <w:pPr>
-        <w:pStyle w:val="Heading2"/>
-      </w:pPr>
-      <w:r>
-        <w:t>Industry surveys and reporting identify experiences worth measuring</w:t>
-      </w:r>
-    </w:p>
-    <w:p>
-      <w:r>
-        <w:t>Grey literature is essential for identifying features of contemporary recruitment that health surveys seldom ask about. It must also be read at the level of its actual questions and denominators. Resume Genius surveyed 1,000 active US job seekers in August 2024, with 500 employed and 500 unemployed respondents. Seventy-two percent reported that searching had negatively affected their mental health at some point in their lives. [12] The outcome is a lifetime, self-attributed experience in an online sample; it is not the prevalence of current depression or anxiety. Forbes subsequently reported the same survey. [13] The two publications represent one source of participants, not independent confirmation.</w:t>
-      </w:r>
-    </w:p>
-    <w:p>
-      <w:r>
-        <w:t>Greenhouse’s 2024 report summary described a survey of 2,500 workers across the United States, United Kingdom, and Germany and reported heightened anxiety among US respondents, alongside post-interview nonresponse. [14] The multinational sample total should not be used as the denominator for the US anxiety statistic. The public summary also does not establish whether nonresponse or a suspected “ghost job” caused clinical symptoms. Huntr’s reports provide application and search-process information from platform users, but user selection, incomplete searches, and self-reported events limit population claims. The Q1 2026 report itself cautions that applicants’ perceptions of AI rejection do not verify employers’ use of automatic rejection. [15]</w:t>
-      </w:r>
-    </w:p>
-    <w:p>
-      <w:r>
-        <w:t>A Federal Reserve qualitative study adds a different form of evidence: 63 participants in 11 focus groups held in late 2025 described financial pressure, unstable work, and barriers to obtaining better employment. [16] Such accounts help identify mechanisms and the language people use to describe their experience. They cannot supply a population prevalence or isolate the contribution of hiring from housing costs, caregiving, and other pressures.</w:t>
-      </w:r>
-    </w:p>
-    <w:p>
-      <w:r>
-        <w:t>Preprints warrant the same scrutiny. Ng’s ghost-jobs preprint classified Glassdoor interview reviews using text models. The often-quoted 21% refers to classifier-positive reviews in a selected sample, not a probability sample of all advertised vacancies. Employer intent was not independently verified, and psychiatric outcomes were not measured. [17] It is useful as exploratory measurement work. Those data cannot establish the population prevalence of nonexistent vacancies.</w:t>
+        <w:t>The case for attention rests on the wider evidence about opportunity, financial strain, control, and searching. Our analysis adds a reproducible test and an honest boundary: it does not identify the health effects of particular hiring practices. The next step is to measure those exposures directly, including among people who remain employed while searching.</w:t>
       </w:r>
     </w:p>
     <w:p>
@@ -198,63 +130,37 @@
         <w:pStyle w:val="Heading1"/>
       </w:pPr>
       <w:r>
-        <w:t>Linking public mental-health data to market conditions</w:t>
-      </w:r>
-    </w:p>
-    <w:p>
-      <w:pPr>
-        <w:pStyle w:val="Heading2"/>
-      </w:pPr>
-      <w:r>
-        <w:t>Sources and population</w:t>
+        <w:t>The hiring industry can reduce burdens and test the consequences</w:t>
       </w:r>
     </w:p>
     <w:p>
       <w:r>
-        <w:t>We linked public annual records from the Behavioral Risk Factor Surveillance System (BRFSS) to state labor-market data from the Bureau of Labor Statistics (BLS). BRFSS provides the respondent’s state, survey year, employment category, demographic characteristics, survey weight, and number of days in the past month when mental health was not good. We used 2013 onward to maintain the EMPLOY1 employment-status series, after the major 2011 survey-weighting and cellphone changes. [18] The primary population was adults aged 18–64 reporting that they were out of work for less than one year or for at least one year. These categories do not verify active search, willingness to accept work, or exposure to a particular job board. Employed and self-employed adults were analyzed separately for context.</w:t>
+        <w:t>We should begin with obligations that follow from asking people to invest time in a recruitment process. Applicants should be able to tell whether a position is currently being filled, what the process will require, and when the employer has ended its consideration. Employers should explain substantial assessments in advance and consider compensation when they demand significant work. Platforms should make it easier to correct or remove stale information and to record when a search opportunity has closed. These are proposed standards for the treatment of applicants; their effects on mental health should be evaluated.</w:t>
       </w:r>
     </w:p>
     <w:p>
       <w:r>
-        <w:t>The primary period was 2013–2024. The available files omitted New Jersey in 2019, Florida in 2021, Kentucky and Pennsylvania in 2023, and Tennessee in 2024. No missing state-year was imputed. We excluded respondents missing the outcome, age, sex, education, race/ethnicity, or a positive survey weight. The final out-of-work analysis included 193,060 respondents in 607 state-years across all 50 states and the District of Columbia. The corresponding employed analysis included 2,223,024 respondents. The technical note reports the sample flow.</w:t>
+        <w:t>Better information is only part of the response. Clear rejection cannot substitute for suitable jobs, adequate income, or access to care. The evidence on financial strain and perceived income protection makes that distinction consequential. Recruitment reform should accompany efforts to improve economic security. It should not imply that a more considerate application process can resolve a shortage of work.</w:t>
       </w:r>
     </w:p>
     <w:p>
       <w:r>
-        <w:t>Frequent mental distress was defined as 14 or more mentally unhealthy days in the previous 30 days, following CDC’s surveillance definition. [19] We also analyzed the reported number of days, from zero to 30. Neither measure is a clinician-confirmed disorder. The BRFSS question includes stress, depression, and problems with emotions; it does not identify their source.</w:t>
+        <w:t>The industry also has a responsibility to make evaluation possible. With applicants’ consent and independent oversight, researchers could follow people from the start of a search, measure symptoms before substantial exposure, and link subsequent changes to local opportunities and application events. Recording delayed responses, repeated assessments, withdrawals, offers, and time spent searching would allow us to ask which experiences precede worsening symptoms. The same study should track employment, earnings, job quality, and who drops out of the process. Better mental-health scores achieved by discouraging disadvantaged applicants would not represent success.</w:t>
       </w:r>
     </w:p>
     <w:p>
       <w:r>
-        <w:t>The primary market exposure was the mean of the 12 monthly state hires rates from the Job Openings and Labor Turnover Survey (JOLTS), measured as hires per 100 payroll employees. We used the seasonally adjusted series and expressed results for a one-percentage-point lower rate. This measures employment entry activity, including job-to-job movement; it is not an unemployed person’s probability of finding a job. State JOLTS estimates combine survey information with modeled administrative inputs. [20] We adjusted the primary model for the published annual-average unemployment rate from Local Area Unemployment Statistics (LAUS). [21] Separate models used the mean monthly unemployed-persons-per-opening ratio, expressed per doubling, and the mean job-opening rate, expressed per one-percentage-point decrease. The ratio captures relative scarcity; neither measure identifies whether openings match a particular applicant’s occupation or location.</w:t>
+        <w:t>These questions fit an understandable regression framework: do symptoms change after particular conditions or events, after accounting for prior health and relevant changes in circumstances? If financial strain and perceived control are measured repeatedly, a structural equation model could examine proposed pathways. The scientific value would come from measuring the sequence of exposure and response well. Industry partners should contribute access and operational knowledge while allowing independent analysis and publication, including unfavorable findings. Identifiable mental-health information should never become an input to hiring decisions.</w:t>
       </w:r>
     </w:p>
     <w:p>
       <w:r>
-        <w:t>We downloaded 2025 BRFSS and market data as well. However, October 2025 unemployment data were not collected during the federal shutdown. BLS’s 2025 unemployment averages cover 11 months and are not strictly comparable with earlier annual averages. [22] We therefore kept 2025 out of the complete-year primary analysis and evaluated a separately labeled extension through 2025. We did not fill the missing October competition ratio or treat an 11-month ratio as a complete annual measure.</w:t>
-      </w:r>
-    </w:p>
-    <w:p>
-      <w:pPr>
-        <w:pStyle w:val="Heading2"/>
-      </w:pPr>
-      <w:r>
-        <w:t>Regression approach</w:t>
+        <w:t>Employers and platforms can also test changes in their own processes, such as predictable status updates or reduced duplication of assessments. The JOBS intervention trial offers a precedent for evaluating employment and mental-health outcomes together, although it tested job-search support rather than platform design. [18] New recruitment practices require their own evidence.</w:t>
       </w:r>
     </w:p>
     <w:p>
       <w:r>
-        <w:t>The primary survey-weighted linear probability regression estimated absolute differences in distress. State fixed effects accounted for persistent differences between states; year fixed effects accounted for changes shared nationally. Additional terms included age group, sex as released in each survey, four education categories, and five race/ethnicity categories. In plain language, the model asks whether distress changed when a state’s hiring conditions changed relative to the national pattern, among respondents with the same measured demographic characteristics. It does not attribute the national rise in distress to the national hiring trend.</w:t>
-      </w:r>
-    </w:p>
-    <w:p>
-      <w:r>
-        <w:t>The primary hiring coefficient was estimated conditional on unemployment. That is a narrower association than the total health effect of a labor-demand shock, because unemployment may itself be part of that effect. We therefore also estimated hiring without unemployment adjustment. Income and unemployment duration were not adjustment variables in the primary model because they may lie on relevant pathways or reflect health selection. Analyses of the two out-of-work duration groups were reported separately.</w:t>
-      </w:r>
-    </w:p>
-    <w:p>
-      <w:r>
-        <w:t>We clustered uncertainty by state to allow observations within a state to be related across respondents and years, using a small-sample correction and a t distribution with 50 degrees of freedom for the 51-state models. This is a state-clustered analysis using survey weights, not a full BRFSS sampling-design variance calculation. It does not propagate uncertainty in BLS’s modeled state estimates. The analysis plan was recorded before fitting these linked models; it was not externally preregistered. All specified checks are reported. The technical note provides the equation and additional implementation detail.</w:t>
+        <w:t>We do not need to assume that every difficult search causes illness to recognize an institutional responsibility. People seeking work depend on systems that govern access to basic resources and shape their ability to plan a future. Treating those systems as potential psychiatric exposures changes the questions the industry must answer: what burdens do we impose, which can we prevent, and does changing them improve people’s lives? Those questions belong in public health and in the daily work of hiring.</w:t>
       </w:r>
     </w:p>
     <w:p>
@@ -262,446 +168,29 @@
         <w:pStyle w:val="Heading1"/>
       </w:pPr>
       <w:r>
-        <w:t>What the linked analysis found</w:t>
-      </w:r>
-    </w:p>
-    <w:p>
-      <w:r>
-        <w:t>Among complete-case respondents in the participating states, weighted frequent mental distress was 21.2% in the out-of-work group in 2013 and 28.5% in 2024. The corresponding employed estimates were 8.6% and 14.9%. These are descriptive annual estimates with changing state coverage and respondent composition; they are not a causal comparison between employment groups or an explanation of the time trend.</w:t>
-      </w:r>
-    </w:p>
-    <w:p>
-      <w:r>
-        <w:t>The primary hiring estimate was -0.80 percentage points in distress for a one-percentage-point lower hiring rate (95% confidence interval, -2.05 to 0.45). The unemployment coefficient in the same model was 0.46 percentage points per one-percentage-point higher unemployment (-0.12 to 1.05). Neither interval excluded zero. The estimate for doubling unemployed people per opening was positive, 1.71 percentage points (-0.01 to 3.44), but remained imprecise. The job-opening-rate estimate was also uncertain. Table 1 reports all three exposure definitions with their confidence intervals.</w:t>
+        <w:t>About the supporting analysis</w:t>
       </w:r>
     </w:p>
     <w:p>
       <w:pPr>
-        <w:pStyle w:val="Caption"/>
-      </w:pPr>
-      <w:r>
-        <w:t>Table 1. Labor-market conditions and frequent mental distress</w:t>
-      </w:r>
-    </w:p>
-    <w:tbl>
-      <w:tblPr>
-        <w:tblW w:type="auto" w:w="0"/>
-        <w:jc w:val="center"/>
-        <w:tblLayout w:type="fixed"/>
-        <w:tblLook w:firstColumn="1" w:firstRow="1" w:lastColumn="0" w:lastRow="0" w:noHBand="0" w:noVBand="1" w:val="04A0"/>
-        <w:tblBorders>
-          <w:top w:val="single" w:sz="4" w:color="CFD5D9"/>
-          <w:left w:val="single" w:sz="4" w:color="CFD5D9"/>
-          <w:bottom w:val="single" w:sz="4" w:color="CFD5D9"/>
-          <w:right w:val="single" w:sz="4" w:color="CFD5D9"/>
-          <w:insideH w:val="single" w:sz="4" w:color="CFD5D9"/>
-          <w:insideV w:val="single" w:sz="4" w:color="CFD5D9"/>
-        </w:tblBorders>
-        <w:tblCellMar>
-          <w:top w:w="90" w:type="dxa"/>
-          <w:bottom w:w="90" w:type="dxa"/>
-          <w:left w:w="100" w:type="dxa"/>
-          <w:right w:w="100" w:type="dxa"/>
-        </w:tblCellMar>
-      </w:tblPr>
-      <w:tblGrid>
-        <w:gridCol w:w="4896"/>
-        <w:gridCol w:w="1944"/>
-        <w:gridCol w:w="2520"/>
-      </w:tblGrid>
-      <w:tr>
-        <w:trPr>
-          <w:cantSplit/>
-          <w:tblHeader/>
-        </w:trPr>
-        <w:tc>
-          <w:tcPr>
-            <w:tcW w:type="dxa" w:w="4896"/>
-            <w:vAlign w:val="center"/>
-            <w:shd w:fill="EDF0F2"/>
-          </w:tcPr>
-          <w:p>
-            <w:pPr>
-              <w:keepNext/>
-              <w:spacing w:after="0" w:before="0" w:line="252" w:lineRule="auto"/>
-            </w:pPr>
-            <w:r>
-              <w:rPr>
-                <w:b/>
-                <w:sz w:val="21"/>
-              </w:rPr>
-              <w:t>Change in market condition</w:t>
-            </w:r>
-          </w:p>
-        </w:tc>
-        <w:tc>
-          <w:tcPr>
-            <w:tcW w:type="dxa" w:w="1944"/>
-            <w:vAlign w:val="center"/>
-            <w:shd w:fill="EDF0F2"/>
-          </w:tcPr>
-          <w:p>
-            <w:pPr>
-              <w:keepNext/>
-              <w:spacing w:after="0" w:before="0" w:line="252" w:lineRule="auto"/>
-            </w:pPr>
-            <w:r>
-              <w:rPr>
-                <w:b/>
-                <w:sz w:val="21"/>
-              </w:rPr>
-              <w:t>Distress difference, pp</w:t>
-            </w:r>
-          </w:p>
-        </w:tc>
-        <w:tc>
-          <w:tcPr>
-            <w:tcW w:type="dxa" w:w="2520"/>
-            <w:vAlign w:val="center"/>
-            <w:shd w:fill="EDF0F2"/>
-          </w:tcPr>
-          <w:p>
-            <w:pPr>
-              <w:keepNext/>
-              <w:spacing w:after="0" w:before="0" w:line="252" w:lineRule="auto"/>
-            </w:pPr>
-            <w:r>
-              <w:rPr>
-                <w:b/>
-                <w:sz w:val="21"/>
-              </w:rPr>
-              <w:t>95% confidence interval</w:t>
-            </w:r>
-          </w:p>
-        </w:tc>
-      </w:tr>
-      <w:tr>
-        <w:trPr>
-          <w:cantSplit/>
-        </w:trPr>
-        <w:tc>
-          <w:tcPr>
-            <w:tcW w:type="dxa" w:w="4896"/>
-            <w:vAlign w:val="center"/>
-          </w:tcPr>
-          <w:p>
-            <w:pPr>
-              <w:keepNext w:val="0"/>
-              <w:spacing w:after="0" w:before="0" w:line="252" w:lineRule="auto"/>
-            </w:pPr>
-            <w:r>
-              <w:rPr>
-                <w:b w:val="0"/>
-                <w:sz w:val="21"/>
-              </w:rPr>
-              <w:t>1-point lower hiring rate (primary)</w:t>
-            </w:r>
-          </w:p>
-        </w:tc>
-        <w:tc>
-          <w:tcPr>
-            <w:tcW w:type="dxa" w:w="1944"/>
-            <w:vAlign w:val="center"/>
-          </w:tcPr>
-          <w:p>
-            <w:pPr>
-              <w:keepNext w:val="0"/>
-              <w:spacing w:after="0" w:before="0" w:line="252" w:lineRule="auto"/>
-            </w:pPr>
-            <w:r>
-              <w:rPr>
-                <w:b w:val="0"/>
-                <w:sz w:val="21"/>
-              </w:rPr>
-              <w:t>-0.80</w:t>
-            </w:r>
-          </w:p>
-        </w:tc>
-        <w:tc>
-          <w:tcPr>
-            <w:tcW w:type="dxa" w:w="2520"/>
-            <w:vAlign w:val="center"/>
-          </w:tcPr>
-          <w:p>
-            <w:pPr>
-              <w:keepNext w:val="0"/>
-              <w:spacing w:after="0" w:before="0" w:line="252" w:lineRule="auto"/>
-            </w:pPr>
-            <w:r>
-              <w:rPr>
-                <w:b w:val="0"/>
-                <w:sz w:val="21"/>
-              </w:rPr>
-              <w:t>-2.05 to 0.45</w:t>
-            </w:r>
-          </w:p>
-        </w:tc>
-      </w:tr>
-      <w:tr>
-        <w:trPr>
-          <w:cantSplit/>
-        </w:trPr>
-        <w:tc>
-          <w:tcPr>
-            <w:tcW w:type="dxa" w:w="4896"/>
-            <w:vAlign w:val="center"/>
-          </w:tcPr>
-          <w:p>
-            <w:pPr>
-              <w:keepNext w:val="0"/>
-              <w:spacing w:after="0" w:before="0" w:line="252" w:lineRule="auto"/>
-            </w:pPr>
-            <w:r>
-              <w:rPr>
-                <w:b w:val="0"/>
-                <w:sz w:val="21"/>
-              </w:rPr>
-              <w:t>1-point higher unemployment rate (same model)</w:t>
-            </w:r>
-          </w:p>
-        </w:tc>
-        <w:tc>
-          <w:tcPr>
-            <w:tcW w:type="dxa" w:w="1944"/>
-            <w:vAlign w:val="center"/>
-          </w:tcPr>
-          <w:p>
-            <w:pPr>
-              <w:keepNext w:val="0"/>
-              <w:spacing w:after="0" w:before="0" w:line="252" w:lineRule="auto"/>
-            </w:pPr>
-            <w:r>
-              <w:rPr>
-                <w:b w:val="0"/>
-                <w:sz w:val="21"/>
-              </w:rPr>
-              <w:t>0.46</w:t>
-            </w:r>
-          </w:p>
-        </w:tc>
-        <w:tc>
-          <w:tcPr>
-            <w:tcW w:type="dxa" w:w="2520"/>
-            <w:vAlign w:val="center"/>
-          </w:tcPr>
-          <w:p>
-            <w:pPr>
-              <w:keepNext w:val="0"/>
-              <w:spacing w:after="0" w:before="0" w:line="252" w:lineRule="auto"/>
-            </w:pPr>
-            <w:r>
-              <w:rPr>
-                <w:b w:val="0"/>
-                <w:sz w:val="21"/>
-              </w:rPr>
-              <w:t>-0.12 to 1.05</w:t>
-            </w:r>
-          </w:p>
-        </w:tc>
-      </w:tr>
-      <w:tr>
-        <w:trPr>
-          <w:cantSplit/>
-        </w:trPr>
-        <w:tc>
-          <w:tcPr>
-            <w:tcW w:type="dxa" w:w="4896"/>
-            <w:vAlign w:val="center"/>
-          </w:tcPr>
-          <w:p>
-            <w:pPr>
-              <w:keepNext w:val="0"/>
-              <w:spacing w:after="0" w:before="0" w:line="252" w:lineRule="auto"/>
-            </w:pPr>
-            <w:r>
-              <w:rPr>
-                <w:b w:val="0"/>
-                <w:sz w:val="21"/>
-              </w:rPr>
-              <w:t>Doubling unemployed people per opening (separate model)</w:t>
-            </w:r>
-          </w:p>
-        </w:tc>
-        <w:tc>
-          <w:tcPr>
-            <w:tcW w:type="dxa" w:w="1944"/>
-            <w:vAlign w:val="center"/>
-          </w:tcPr>
-          <w:p>
-            <w:pPr>
-              <w:keepNext w:val="0"/>
-              <w:spacing w:after="0" w:before="0" w:line="252" w:lineRule="auto"/>
-            </w:pPr>
-            <w:r>
-              <w:rPr>
-                <w:b w:val="0"/>
-                <w:sz w:val="21"/>
-              </w:rPr>
-              <w:t>1.71</w:t>
-            </w:r>
-          </w:p>
-        </w:tc>
-        <w:tc>
-          <w:tcPr>
-            <w:tcW w:type="dxa" w:w="2520"/>
-            <w:vAlign w:val="center"/>
-          </w:tcPr>
-          <w:p>
-            <w:pPr>
-              <w:keepNext w:val="0"/>
-              <w:spacing w:after="0" w:before="0" w:line="252" w:lineRule="auto"/>
-            </w:pPr>
-            <w:r>
-              <w:rPr>
-                <w:b w:val="0"/>
-                <w:sz w:val="21"/>
-              </w:rPr>
-              <w:t>-0.01 to 3.44</w:t>
-            </w:r>
-          </w:p>
-        </w:tc>
-      </w:tr>
-      <w:tr>
-        <w:trPr>
-          <w:cantSplit/>
-        </w:trPr>
-        <w:tc>
-          <w:tcPr>
-            <w:tcW w:type="dxa" w:w="4896"/>
-            <w:vAlign w:val="center"/>
-          </w:tcPr>
-          <w:p>
-            <w:pPr>
-              <w:keepNext w:val="0"/>
-              <w:spacing w:after="0" w:before="0" w:line="252" w:lineRule="auto"/>
-            </w:pPr>
-            <w:r>
-              <w:rPr>
-                <w:b w:val="0"/>
-                <w:sz w:val="21"/>
-              </w:rPr>
-              <w:t>1-point lower job-opening rate (separate model)</w:t>
-            </w:r>
-          </w:p>
-        </w:tc>
-        <w:tc>
-          <w:tcPr>
-            <w:tcW w:type="dxa" w:w="1944"/>
-            <w:vAlign w:val="center"/>
-          </w:tcPr>
-          <w:p>
-            <w:pPr>
-              <w:keepNext w:val="0"/>
-              <w:spacing w:after="0" w:before="0" w:line="252" w:lineRule="auto"/>
-            </w:pPr>
-            <w:r>
-              <w:rPr>
-                <w:b w:val="0"/>
-                <w:sz w:val="21"/>
-              </w:rPr>
-              <w:t>0.13</w:t>
-            </w:r>
-          </w:p>
-        </w:tc>
-        <w:tc>
-          <w:tcPr>
-            <w:tcW w:type="dxa" w:w="2520"/>
-            <w:vAlign w:val="center"/>
-          </w:tcPr>
-          <w:p>
-            <w:pPr>
-              <w:keepNext w:val="0"/>
-              <w:spacing w:after="0" w:before="0" w:line="252" w:lineRule="auto"/>
-            </w:pPr>
-            <w:r>
-              <w:rPr>
-                <w:b w:val="0"/>
-                <w:sz w:val="21"/>
-              </w:rPr>
-              <w:t>-0.76 to 1.02</w:t>
-            </w:r>
-          </w:p>
-        </w:tc>
-      </w:tr>
-    </w:tbl>
-    <w:p>
-      <w:pPr>
-        <w:spacing w:line="252" w:lineRule="auto" w:after="180"/>
+        <w:spacing w:line="259" w:lineRule="auto"/>
       </w:pPr>
       <w:r>
         <w:rPr>
-          <w:sz w:val="20"/>
+          <w:sz w:val="21"/>
         </w:rPr>
-        <w:t>Out-of-work adults aged 18–64, 2013–2024; n = 193,060 in 607 state-years. pp = percentage points. All models include state, year, and demographic terms. Hiring and unemployment appear jointly in the primary model; other exposures are fitted separately. Exposure changes have different units, so coefficient magnitudes should not be ranked as equivalent effects. Confidence intervals are clustered by state.</w:t>
-      </w:r>
-    </w:p>
-    <w:p>
-      <w:r>
-        <w:t>The hiring results were not consistent with a simple claim that lower hiring produces more distress. Using the previous year’s conditions changed the direction of the hiring estimate to 0.92 percentage points (-0.50 to 2.34). Excluding 2020–2021, adding state-specific trends, using equal state-year weights, restricting to continuously observed states, and extending through 2025 did not produce a clear positive hiring association. Figure 1 and the technical note show these checks. The recent-out-of-work subgroup had an inverse estimate, while the longer-duration subgroup had an uncertain positive estimate. These exploratory differences do not establish that slower hiring protects health or that duration modifies a causal effect.</w:t>
-      </w:r>
-    </w:p>
-    <w:p>
-      <w:r>
-        <w:t>The separate employed analysis gave a hiring estimate near zero. A post hoc logistic-model check, prompted by a small number of out-of-range linear-model predictions, also gave an uncertain hiring association: -0.65 percentage points (-1.88 to 0.59). Independent calculations from the uncollapsed out-of-work records reproduced the main regression coefficients and state-clustered covariance.</w:t>
+        <w:t>The primary public-data analysis included 193,060 complete-case out-of-work respondents in 607 state-years, 2013–2024. BRFSS out-of-work categories do not verify active job search, and frequent mental distress is a surveillance measure rather than a diagnosis. Survey-weighted linear regressions included state and year effects, age group, released sex, education, and race/ethnicity. Confidence intervals allowed observations within each state to be related over time. Hiring was the annual mean monthly rate from the Job Openings and Labor Turnover Survey; unemployment came from Local Area Unemployment Statistics. [19, 20]</w:t>
       </w:r>
     </w:p>
     <w:p>
       <w:pPr>
-        <w:pStyle w:val="Caption"/>
-      </w:pPr>
-      <w:r>
-        <w:t>Figure 1. Hiring estimates across model specifications</w:t>
-      </w:r>
-    </w:p>
-    <w:p>
-      <w:pPr>
-        <w:keepNext/>
-        <w:spacing w:after="60"/>
-      </w:pPr>
-      <w:r>
-        <w:drawing>
-          <wp:inline xmlns:a="http://schemas.openxmlformats.org/drawingml/2006/main" xmlns:pic="http://schemas.openxmlformats.org/drawingml/2006/picture">
-            <wp:extent cx="5943600" cy="3157538"/>
-            <wp:docPr id="1" name="Picture 1" descr="Hiring coefficients and 95% confidence intervals for the main model and five sensitivity checks. Intervals cross zero; the lagged estimate has the opposite direction from the same-year estimate."/>
-            <wp:cNvGraphicFramePr>
-              <a:graphicFrameLocks noChangeAspect="1"/>
-            </wp:cNvGraphicFramePr>
-            <a:graphic>
-              <a:graphicData uri="http://schemas.openxmlformats.org/drawingml/2006/picture">
-                <pic:pic>
-                  <pic:nvPicPr>
-                    <pic:cNvPr id="0" name="figure1.png"/>
-                    <pic:cNvPicPr/>
-                  </pic:nvPicPr>
-                  <pic:blipFill>
-                    <a:blip r:embed="rId10"/>
-                    <a:stretch>
-                      <a:fillRect/>
-                    </a:stretch>
-                  </pic:blipFill>
-                  <pic:spPr>
-                    <a:xfrm>
-                      <a:off x="0" y="0"/>
-                      <a:ext cx="5943600" cy="3157538"/>
-                    </a:xfrm>
-                    <a:prstGeom prst="rect"/>
-                  </pic:spPr>
-                </pic:pic>
-              </a:graphicData>
-            </a:graphic>
-          </wp:inline>
-        </w:drawing>
-      </w:r>
-    </w:p>
-    <w:p>
-      <w:pPr>
-        <w:spacing w:line="252" w:lineRule="auto" w:after="180"/>
+        <w:spacing w:line="259" w:lineRule="auto"/>
       </w:pPr>
       <w:r>
         <w:rPr>
-          <w:sz w:val="20"/>
+          <w:sz w:val="21"/>
         </w:rPr>
-        <w:t>Each point is an adjusted association with frequent mental distress per one-percentage-point lower state hiring rate. Lines show 95% confidence intervals. Positive values indicate more distress; negative values indicate less. The previous-year model uses lagged hiring and unemployment. The 2025 extension uses the published 11-month unemployment input and has different state coverage. These observational estimates are not effects of an intervention.</w:t>
+        <w:t>A one-percentage-point lower hiring rate was associated with -0.80 percentage points in distress (95% confidence interval -2.05 to 0.45), conditional on unemployment. A separate model estimated 1.71 percentage points more distress per doubling of unemployed people per opening (-0.01 to 3.44). Neither interval excluded zero. The opening-rate estimate was also uncertain, and the hiring estimate reversed direction with prior-year exposure. The complete set of models, exclusions, coding decisions, and independent numerical checks is available with the public data and code. [21] A separately labeled extension through 2025 uses the Bureau of Labor Statistics’ 11-month unemployment average because October data were not collected during the federal shutdown. [22] These observational estimates cannot establish a causal effect, and state and year effects do not remove all changing confounding. The literature informing this editorial is a focused narrative review; the repository records the review depth and limits of each source.</w:t>
       </w:r>
     </w:p>
     <w:p>
@@ -709,1455 +198,18 @@
         <w:pStyle w:val="Heading1"/>
       </w:pPr>
       <w:r>
-        <w:t>How to interpret a mixed result</w:t>
-      </w:r>
-    </w:p>
-    <w:p>
-      <w:r>
-        <w:t>The analysis directly relates a measured health burden to measured market conditions. It does not provide strong evidence for a general same-year relationship between slower state hiring and greater distress among people currently out of work. The competition estimate is compatible with a meaningful increase as well as almost no difference. It should motivate replication, not a claim that a threshold has been crossed.</w:t>
-      </w:r>
-    </w:p>
-    <w:p>
-      <w:r>
-        <w:t>There are substantive reasons the exposures need not behave alike. Hiring counts include workers moving between jobs, people returning to the labor force, and seasonal turnover. Openings describe a stock of opportunities, while the unemployed-to-openings ratio also reflects the number of people competing for work. Applicant experiences depend on suitable vacancies, eligibility, pay, distance, and the way recruitment proceeds. A single statewide rate cannot represent all of these conditions.</w:t>
-      </w:r>
-    </w:p>
-    <w:p>
-      <w:r>
-        <w:t>Selection is especially important. A contraction can bring previously employed people into the out-of-work group and change its average health, even if some individuals become worse off. Conversely, people with better health may leave that group more quickly when opportunities improve. Conditioning on current employment status can therefore obscure or reverse an association that would appear in longitudinal follow-up. Annual surveys cannot distinguish those processes here. The inverse subgroup estimate reinforces the need for longitudinal follow-up.</w:t>
-      </w:r>
-    </w:p>
-    <w:p>
-      <w:r>
-        <w:t>Other limitations remain. State residence may poorly describe a remote or cross-border search. Survey nonresponse, missing covariates, changes in who reports symptoms, state policies, industry composition, and living costs may confound associations. State and year effects do not remove changing state-specific confounding. Annual exposure averages overlap the outcome’s recall period and sometimes include months after an interview; they establish no clear temporal order. Some interviews occur after the nominal survey year. Lagging exposure improves ordering only partially because prior residence and search histories are unknown. BLS modeling and rounding add measurement uncertainty. These limitations constrain both positive and null findings.</w:t>
-      </w:r>
-    </w:p>
-    <w:p>
-      <w:r>
-        <w:t>The literature review is focused and narrative, not a systematic review or a meta-analysis. We searched academic and institutional sources alongside industry reports, preprints, and popular reporting, tracing quantitative claims back to their original source. The repository records source type, review depth, claim support, and limitations. Abstract-only review is identified. Industry questionnaires and selected platform samples describe experiences that representative surveys omit, but their percentages are not interchangeable with clinical screening or BRFSS distress measures.</w:t>
+        <w:t>Author information and disclosures</w:t>
       </w:r>
     </w:p>
     <w:p>
       <w:pPr>
-        <w:pStyle w:val="Heading1"/>
-      </w:pPr>
-      <w:r>
-        <w:t>What an industry response should make possible</w:t>
-      </w:r>
-    </w:p>
-    <w:p>
-      <w:r>
-        <w:t>The strongest implication is a measurement and accountability agenda tied to testable interventions. Recruitment systems should record whether a position is funded and actively being filled, when an application changes status, when communication ends, and how much time an applicant is asked to invest. These records would make it possible to distinguish scarce opportunities from inaccurate information, prolonged silence, and burdensome procedures. Public reporting should use clear denominators, follow incomplete searches, and describe which applicants are missing from the data.</w:t>
-      </w:r>
-    </w:p>
-    <w:p>
-      <w:r>
-        <w:t>The next study should recruit people when they begin a search, including employed searchers, measure symptoms before substantial exposure, and follow them through offers, withdrawals, reemployment, or continued searching. With consent, weekly or monthly symptom assessments could be linked to the relevant geographic and occupational market, application events, financial strain, and perceived control. Validated symptom measures should sit alongside the practical outcomes applicants value: income, job quality, time spent searching, and the ability to leave harmful work. This design would separate baseline health from changes during a search and distinguish market conditions from platform experiences.</w:t>
-      </w:r>
-    </w:p>
-    <w:p>
-      <w:r>
-        <w:t>A regression framework can relate repeated symptom scores to prior market conditions and recruitment events, with person and time effects and prespecified adjustment for changing circumstances. A structural equation model would be useful only if financial strain, control, and symptoms were measured in an ordered sequence and its causal assumptions were defensible.</w:t>
-      </w:r>
-    </w:p>
-    <w:p>
-      <w:r>
-        <w:t>Employers and platforms can also randomize feasible changes: accurate vacancy-status notices, predictable communication, reduced duplicate assessments, or compensation for substantial tasks. Independent evaluators should examine mental health together with employment outcomes and access, including whether an apparently helpful change excludes applicants or shifts burdens elsewhere. Trial evidence from the JOBS program shows that job-search support can improve employment and mental-health outcomes. [23] It does not establish the effectiveness of these proposed recruitment-system changes; those require their own evaluation.</w:t>
-      </w:r>
-    </w:p>
-    <w:p>
-      <w:r>
-        <w:t>The institutional response should extend beyond interfaces. Income protection and access to care may matter more than the wording of an application email. Industry partners can contribute knowledge and event data, but they should not control publication, suppress unfavorable findings, or obtain identifiable applicant mental-health records for hiring decisions. The aim is to identify preventable exposures while preserving a fair route into work.</w:t>
-      </w:r>
-    </w:p>
-    <w:p>
-      <w:pPr>
-        <w:pStyle w:val="Heading1"/>
-      </w:pPr>
-      <w:r>
-        <w:t>Conclusion</w:t>
-      </w:r>
-    </w:p>
-    <w:p>
-      <w:r>
-        <w:t>Job seeking places people in an environment that governs access to income, security, and social participation. Existing research gives reason to examine that environment as a potential psychiatric exposure. Our linked public-data analysis finds an uncertain association with competition for openings and no consistent association with lower hiring rates. These findings support more direct measurement and longitudinal evaluation of the search environment. A public health approach should evaluate what hiring systems require of people and whether changing those requirements reduces harm.</w:t>
-      </w:r>
-    </w:p>
-    <w:p>
-      <w:pPr>
-        <w:pStyle w:val="Heading1"/>
-      </w:pPr>
-      <w:r>
-        <w:t>Declarations</w:t>
-      </w:r>
-    </w:p>
-    <w:p>
-      <w:r>
-        <w:t>Competing interests: Jacob E. Thomas is affiliated with Results Generation, a recruitment-marketing firm. This industry relationship is relevant to the argument. The views expressed are his own. The empirical analysis used no proprietary applicant records or employer analytics.</w:t>
-      </w:r>
-    </w:p>
-    <w:p>
-      <w:r>
-        <w:t>Funding: No external funding supported this work.</w:t>
-      </w:r>
-    </w:p>
-    <w:p>
-      <w:r>
-        <w:t>Ethics: This was a secondary analysis of deidentified, publicly released records. No participants were recruited and no restricted records were accessed.</w:t>
-      </w:r>
-    </w:p>
-    <w:p>
-      <w:r>
-        <w:t>Data and code: The public source URLs, download checksums, variable definitions, analysis decision log, derived inputs, code, generated results, and reference audit are available in the PsychologicalRecession repository. [24] The main analysis can be rebuilt from the included inputs; a separate command rebuilds those inputs from the official source files. All essential methods, results, figures, and references are included in this document.</w:t>
-      </w:r>
-    </w:p>
-    <w:p>
-      <w:r>
-        <w:br w:type="page"/>
-      </w:r>
-    </w:p>
-    <w:p>
-      <w:pPr>
-        <w:pStyle w:val="Heading1"/>
-      </w:pPr>
-      <w:r>
-        <w:t>Technical note</w:t>
-      </w:r>
-    </w:p>
-    <w:p>
-      <w:pPr>
-        <w:pStyle w:val="Heading2"/>
-      </w:pPr>
-      <w:r>
-        <w:t>Sample and coding</w:t>
-      </w:r>
-    </w:p>
-    <w:tbl>
-      <w:tblPr>
-        <w:tblW w:type="auto" w:w="0"/>
-        <w:jc w:val="center"/>
-        <w:tblLayout w:type="fixed"/>
-        <w:tblLook w:firstColumn="1" w:firstRow="1" w:lastColumn="0" w:lastRow="0" w:noHBand="0" w:noVBand="1" w:val="04A0"/>
-        <w:tblBorders>
-          <w:top w:val="single" w:sz="4" w:color="CFD5D9"/>
-          <w:left w:val="single" w:sz="4" w:color="CFD5D9"/>
-          <w:bottom w:val="single" w:sz="4" w:color="CFD5D9"/>
-          <w:right w:val="single" w:sz="4" w:color="CFD5D9"/>
-          <w:insideH w:val="single" w:sz="4" w:color="CFD5D9"/>
-          <w:insideV w:val="single" w:sz="4" w:color="CFD5D9"/>
-        </w:tblBorders>
-        <w:tblCellMar>
-          <w:top w:w="90" w:type="dxa"/>
-          <w:bottom w:w="90" w:type="dxa"/>
-          <w:left w:w="100" w:type="dxa"/>
-          <w:right w:w="100" w:type="dxa"/>
-        </w:tblCellMar>
-      </w:tblPr>
-      <w:tblGrid>
-        <w:gridCol w:w="6768"/>
-        <w:gridCol w:w="2592"/>
-      </w:tblGrid>
-      <w:tr>
-        <w:trPr>
-          <w:cantSplit/>
-          <w:tblHeader/>
-        </w:trPr>
-        <w:tc>
-          <w:tcPr>
-            <w:tcW w:type="dxa" w:w="6768"/>
-            <w:vAlign w:val="center"/>
-            <w:shd w:fill="EDF0F2"/>
-          </w:tcPr>
-          <w:p>
-            <w:pPr>
-              <w:keepNext/>
-              <w:spacing w:after="0" w:before="0" w:line="252" w:lineRule="auto"/>
-            </w:pPr>
-            <w:r>
-              <w:rPr>
-                <w:b/>
-                <w:sz w:val="21"/>
-              </w:rPr>
-              <w:t>Sequential sample definition</w:t>
-            </w:r>
-          </w:p>
-        </w:tc>
-        <w:tc>
-          <w:tcPr>
-            <w:tcW w:type="dxa" w:w="2592"/>
-            <w:vAlign w:val="center"/>
-            <w:shd w:fill="EDF0F2"/>
-          </w:tcPr>
-          <w:p>
-            <w:pPr>
-              <w:keepNext/>
-              <w:spacing w:after="0" w:before="0" w:line="252" w:lineRule="auto"/>
-            </w:pPr>
-            <w:r>
-              <w:rPr>
-                <w:b/>
-                <w:sz w:val="21"/>
-              </w:rPr>
-              <w:t>Respondents</w:t>
-            </w:r>
-          </w:p>
-        </w:tc>
-      </w:tr>
-      <w:tr>
-        <w:trPr>
-          <w:cantSplit/>
-        </w:trPr>
-        <w:tc>
-          <w:tcPr>
-            <w:tcW w:type="dxa" w:w="6768"/>
-            <w:vAlign w:val="center"/>
-          </w:tcPr>
-          <w:p>
-            <w:pPr>
-              <w:keepNext w:val="0"/>
-              <w:spacing w:after="0" w:before="0" w:line="252" w:lineRule="auto"/>
-            </w:pPr>
-            <w:r>
-              <w:rPr>
-                <w:b w:val="0"/>
-                <w:sz w:val="21"/>
-              </w:rPr>
-              <w:t>All public records, 2013–2024</w:t>
-            </w:r>
-          </w:p>
-        </w:tc>
-        <w:tc>
-          <w:tcPr>
-            <w:tcW w:type="dxa" w:w="2592"/>
-            <w:vAlign w:val="center"/>
-          </w:tcPr>
-          <w:p>
-            <w:pPr>
-              <w:keepNext w:val="0"/>
-              <w:spacing w:after="0" w:before="0" w:line="252" w:lineRule="auto"/>
-            </w:pPr>
-            <w:r>
-              <w:rPr>
-                <w:b w:val="0"/>
-                <w:sz w:val="21"/>
-              </w:rPr>
-              <w:t>5,366,692</w:t>
-            </w:r>
-          </w:p>
-        </w:tc>
-      </w:tr>
-      <w:tr>
-        <w:trPr>
-          <w:cantSplit/>
-        </w:trPr>
-        <w:tc>
-          <w:tcPr>
-            <w:tcW w:type="dxa" w:w="6768"/>
-            <w:vAlign w:val="center"/>
-          </w:tcPr>
-          <w:p>
-            <w:pPr>
-              <w:keepNext w:val="0"/>
-              <w:spacing w:after="0" w:before="0" w:line="252" w:lineRule="auto"/>
-            </w:pPr>
-            <w:r>
-              <w:rPr>
-                <w:b w:val="0"/>
-                <w:sz w:val="21"/>
-              </w:rPr>
-              <w:t>50 states and District of Columbia</w:t>
-            </w:r>
-          </w:p>
-        </w:tc>
-        <w:tc>
-          <w:tcPr>
-            <w:tcW w:type="dxa" w:w="2592"/>
-            <w:vAlign w:val="center"/>
-          </w:tcPr>
-          <w:p>
-            <w:pPr>
-              <w:keepNext w:val="0"/>
-              <w:spacing w:after="0" w:before="0" w:line="252" w:lineRule="auto"/>
-            </w:pPr>
-            <w:r>
-              <w:rPr>
-                <w:b w:val="0"/>
-                <w:sz w:val="21"/>
-              </w:rPr>
-              <w:t>5,274,607</w:t>
-            </w:r>
-          </w:p>
-        </w:tc>
-      </w:tr>
-      <w:tr>
-        <w:trPr>
-          <w:cantSplit/>
-        </w:trPr>
-        <w:tc>
-          <w:tcPr>
-            <w:tcW w:type="dxa" w:w="6768"/>
-            <w:vAlign w:val="center"/>
-          </w:tcPr>
-          <w:p>
-            <w:pPr>
-              <w:keepNext w:val="0"/>
-              <w:spacing w:after="0" w:before="0" w:line="252" w:lineRule="auto"/>
-            </w:pPr>
-            <w:r>
-              <w:rPr>
-                <w:b w:val="0"/>
-                <w:sz w:val="21"/>
-              </w:rPr>
-              <w:t>Age 18–64</w:t>
-            </w:r>
-          </w:p>
-        </w:tc>
-        <w:tc>
-          <w:tcPr>
-            <w:tcW w:type="dxa" w:w="2592"/>
-            <w:vAlign w:val="center"/>
-          </w:tcPr>
-          <w:p>
-            <w:pPr>
-              <w:keepNext w:val="0"/>
-              <w:spacing w:after="0" w:before="0" w:line="252" w:lineRule="auto"/>
-            </w:pPr>
-            <w:r>
-              <w:rPr>
-                <w:b w:val="0"/>
-                <w:sz w:val="21"/>
-              </w:rPr>
-              <w:t>3,326,804</w:t>
-            </w:r>
-          </w:p>
-        </w:tc>
-      </w:tr>
-      <w:tr>
-        <w:trPr>
-          <w:cantSplit/>
-        </w:trPr>
-        <w:tc>
-          <w:tcPr>
-            <w:tcW w:type="dxa" w:w="6768"/>
-            <w:vAlign w:val="center"/>
-          </w:tcPr>
-          <w:p>
-            <w:pPr>
-              <w:keepNext w:val="0"/>
-              <w:spacing w:after="0" w:before="0" w:line="252" w:lineRule="auto"/>
-            </w:pPr>
-            <w:r>
-              <w:rPr>
-                <w:b w:val="0"/>
-                <w:sz w:val="21"/>
-              </w:rPr>
-              <w:t>Employed, self-employed, or out of work</w:t>
-            </w:r>
-          </w:p>
-        </w:tc>
-        <w:tc>
-          <w:tcPr>
-            <w:tcW w:type="dxa" w:w="2592"/>
-            <w:vAlign w:val="center"/>
-          </w:tcPr>
-          <w:p>
-            <w:pPr>
-              <w:keepNext w:val="0"/>
-              <w:spacing w:after="0" w:before="0" w:line="252" w:lineRule="auto"/>
-            </w:pPr>
-            <w:r>
-              <w:rPr>
-                <w:b w:val="0"/>
-                <w:sz w:val="21"/>
-              </w:rPr>
-              <w:t>2,488,550</w:t>
-            </w:r>
-          </w:p>
-        </w:tc>
-      </w:tr>
-      <w:tr>
-        <w:trPr>
-          <w:cantSplit/>
-        </w:trPr>
-        <w:tc>
-          <w:tcPr>
-            <w:tcW w:type="dxa" w:w="6768"/>
-            <w:vAlign w:val="center"/>
-          </w:tcPr>
-          <w:p>
-            <w:pPr>
-              <w:keepNext w:val="0"/>
-              <w:spacing w:after="0" w:before="0" w:line="252" w:lineRule="auto"/>
-            </w:pPr>
-            <w:r>
-              <w:rPr>
-                <w:b w:val="0"/>
-                <w:sz w:val="21"/>
-              </w:rPr>
-              <w:t>Valid mental-health-days response</w:t>
-            </w:r>
-          </w:p>
-        </w:tc>
-        <w:tc>
-          <w:tcPr>
-            <w:tcW w:type="dxa" w:w="2592"/>
-            <w:vAlign w:val="center"/>
-          </w:tcPr>
-          <w:p>
-            <w:pPr>
-              <w:keepNext w:val="0"/>
-              <w:spacing w:after="0" w:before="0" w:line="252" w:lineRule="auto"/>
-            </w:pPr>
-            <w:r>
-              <w:rPr>
-                <w:b w:val="0"/>
-                <w:sz w:val="21"/>
-              </w:rPr>
-              <w:t>2,458,252</w:t>
-            </w:r>
-          </w:p>
-        </w:tc>
-      </w:tr>
-      <w:tr>
-        <w:trPr>
-          <w:cantSplit/>
-        </w:trPr>
-        <w:tc>
-          <w:tcPr>
-            <w:tcW w:type="dxa" w:w="6768"/>
-            <w:vAlign w:val="center"/>
-          </w:tcPr>
-          <w:p>
-            <w:pPr>
-              <w:keepNext w:val="0"/>
-              <w:spacing w:after="0" w:before="0" w:line="252" w:lineRule="auto"/>
-            </w:pPr>
-            <w:r>
-              <w:rPr>
-                <w:b w:val="0"/>
-                <w:sz w:val="21"/>
-              </w:rPr>
-              <w:t>Complete demographics and positive weight</w:t>
-            </w:r>
-          </w:p>
-        </w:tc>
-        <w:tc>
-          <w:tcPr>
-            <w:tcW w:type="dxa" w:w="2592"/>
-            <w:vAlign w:val="center"/>
-          </w:tcPr>
-          <w:p>
-            <w:pPr>
-              <w:keepNext w:val="0"/>
-              <w:spacing w:after="0" w:before="0" w:line="252" w:lineRule="auto"/>
-            </w:pPr>
-            <w:r>
-              <w:rPr>
-                <w:b w:val="0"/>
-                <w:sz w:val="21"/>
-              </w:rPr>
-              <w:t>2,416,084</w:t>
-            </w:r>
-          </w:p>
-        </w:tc>
-      </w:tr>
-      <w:tr>
-        <w:trPr>
-          <w:cantSplit/>
-        </w:trPr>
-        <w:tc>
-          <w:tcPr>
-            <w:tcW w:type="dxa" w:w="6768"/>
-            <w:vAlign w:val="center"/>
-          </w:tcPr>
-          <w:p>
-            <w:pPr>
-              <w:keepNext w:val="0"/>
-              <w:spacing w:after="0" w:before="0" w:line="252" w:lineRule="auto"/>
-            </w:pPr>
-            <w:r>
-              <w:rPr>
-                <w:b w:val="0"/>
-                <w:sz w:val="21"/>
-              </w:rPr>
-              <w:t>Out of work: primary analysis</w:t>
-            </w:r>
-          </w:p>
-        </w:tc>
-        <w:tc>
-          <w:tcPr>
-            <w:tcW w:type="dxa" w:w="2592"/>
-            <w:vAlign w:val="center"/>
-          </w:tcPr>
-          <w:p>
-            <w:pPr>
-              <w:keepNext w:val="0"/>
-              <w:spacing w:after="0" w:before="0" w:line="252" w:lineRule="auto"/>
-            </w:pPr>
-            <w:r>
-              <w:rPr>
-                <w:b w:val="0"/>
-                <w:sz w:val="21"/>
-              </w:rPr>
-              <w:t>193,060</w:t>
-            </w:r>
-          </w:p>
-        </w:tc>
-      </w:tr>
-      <w:tr>
-        <w:trPr>
-          <w:cantSplit/>
-        </w:trPr>
-        <w:tc>
-          <w:tcPr>
-            <w:tcW w:type="dxa" w:w="6768"/>
-            <w:vAlign w:val="center"/>
-          </w:tcPr>
-          <w:p>
-            <w:pPr>
-              <w:keepNext w:val="0"/>
-              <w:spacing w:after="0" w:before="0" w:line="252" w:lineRule="auto"/>
-            </w:pPr>
-            <w:r>
-              <w:rPr>
-                <w:b w:val="0"/>
-                <w:sz w:val="21"/>
-              </w:rPr>
-              <w:t>Employed: contextual analysis</w:t>
-            </w:r>
-          </w:p>
-        </w:tc>
-        <w:tc>
-          <w:tcPr>
-            <w:tcW w:type="dxa" w:w="2592"/>
-            <w:vAlign w:val="center"/>
-          </w:tcPr>
-          <w:p>
-            <w:pPr>
-              <w:keepNext w:val="0"/>
-              <w:spacing w:after="0" w:before="0" w:line="252" w:lineRule="auto"/>
-            </w:pPr>
-            <w:r>
-              <w:rPr>
-                <w:b w:val="0"/>
-                <w:sz w:val="21"/>
-              </w:rPr>
-              <w:t>2,223,024</w:t>
-            </w:r>
-          </w:p>
-        </w:tc>
-      </w:tr>
-    </w:tbl>
-    <w:p>
-      <w:pPr>
-        <w:spacing w:line="252" w:lineRule="auto" w:after="180"/>
+        <w:spacing w:line="259" w:lineRule="auto"/>
       </w:pPr>
       <w:r>
         <w:rPr>
-          <w:sz w:val="20"/>
+          <w:sz w:val="21"/>
         </w:rPr>
-        <w:t>The final two rows partition the complete sample. Counts represent different respondents in repeated annual cross-sections. Year-specific counts, missing states, and the 2025 extension are supplied in the reproducibility files.</w:t>
-      </w:r>
-    </w:p>
-    <w:p>
-      <w:r>
-        <w:t>The out-of-work population is EMPLOY1=3 or 4; employed is EMPLOY1=1 or 2. Age groups are 18–24 and five-year bands from 25–29 to 60–64. MENTHLTH=88 is recoded to zero; 77, 99, and blanks are missing. Education is grouped as less than high school, high school, some college, and college graduate. Race/ethnicity uses the common five-category output of _RACEGR3, or _RACEGR4 in 2022. These broad categories are adjustment variables, not explanations of inherent group differences. Sex uses SEX in 2013–2017, SEX1 in 2018, and the calculated _SEX thereafter; question and derivation changes limit exact harmonization. Final weights are _LLCPWT. No diagnosis, active-search variable, or industry-specific search exposure is inferred from these codes.</w:t>
-      </w:r>
-    </w:p>
-    <w:p>
-      <w:pPr>
-        <w:pStyle w:val="Heading2"/>
-      </w:pPr>
-      <w:r>
-        <w:t>Estimand and uncertainty</w:t>
-      </w:r>
-    </w:p>
-    <w:p>
-      <w:pPr>
-        <w:jc w:val="center"/>
-      </w:pPr>
-      <w:r>
-        <w:rPr>
-          <w:rFonts w:ascii="Cambria" w:hAnsi="Cambria"/>
-          <w:sz w:val="22"/>
-        </w:rPr>
-        <w:t>Pr(Y = 1) = a(state) + g(year) + b × (−H) + c × U + X′d</w:t>
-      </w:r>
-    </w:p>
-    <w:p>
-      <w:r>
-        <w:t>Here Y is the indicator of frequent mental distress; H is the state survey-year hiring rate; U is the published annual unemployment rate; X contains the demographic categories; a and g represent state and year effects. The coefficient b describes a one-percentage-point lower hiring rate, holding the included variables fixed. Reported percentage-point differences equal 100 times the corresponding probability-scale coefficient. The competition and opening-rate regressions replace the two market terms with their respective single exposure. All models retain demographic, state, and year terms.</w:t>
-      </w:r>
-    </w:p>
-    <w:p>
-      <w:r>
-        <w:t>We solved weighted least squares using cross-products from identical respondent profiles; this preserves the individual-level coefficient estimates and state score contributions exactly. Standard errors use the state-cluster sandwich with correction G/(G−1) × (N−1)/(N−K), where G is the number of states, N the original respondent count, and K the number of fitted coefficients. Intervals use the t distribution with G−1 degrees of freedom. The complete-state check has 46 clusters; other main checks have 51. No multiplicity-adjusted discovery claim is made. The estimates and intervals, including unfavorable and null results, should be read together.</w:t>
-      </w:r>
-    </w:p>
-    <w:p>
-      <w:r>
-        <w:t>Annual JOLTS measures require all 12 months; the competition ratio is log base two of the annual mean monthly ratio. This is not the ratio of two annual totals. Primary data include 607 of 612 possible state-years. No state-year had to be dropped for a missing BLS primary exposure. The remaining hiring-rate variation after adjustment has a weighted standard deviation of 0.24 percentage points: a one-point contrast is substantially larger than a typical residual difference. Estimates should not be extrapolated to large policy shifts.</w:t>
-      </w:r>
-    </w:p>
-    <w:p>
-      <w:pPr>
-        <w:pStyle w:val="Heading2"/>
-      </w:pPr>
-      <w:r>
-        <w:t>Full set of hiring checks</w:t>
-      </w:r>
-    </w:p>
-    <w:tbl>
-      <w:tblPr>
-        <w:tblW w:type="auto" w:w="0"/>
-        <w:jc w:val="center"/>
-        <w:tblLayout w:type="fixed"/>
-        <w:tblLook w:firstColumn="1" w:firstRow="1" w:lastColumn="0" w:lastRow="0" w:noHBand="0" w:noVBand="1" w:val="04A0"/>
-        <w:tblBorders>
-          <w:top w:val="single" w:sz="4" w:color="CFD5D9"/>
-          <w:left w:val="single" w:sz="4" w:color="CFD5D9"/>
-          <w:bottom w:val="single" w:sz="4" w:color="CFD5D9"/>
-          <w:right w:val="single" w:sz="4" w:color="CFD5D9"/>
-          <w:insideH w:val="single" w:sz="4" w:color="CFD5D9"/>
-          <w:insideV w:val="single" w:sz="4" w:color="CFD5D9"/>
-        </w:tblBorders>
-        <w:tblCellMar>
-          <w:top w:w="90" w:type="dxa"/>
-          <w:bottom w:w="90" w:type="dxa"/>
-          <w:left w:w="100" w:type="dxa"/>
-          <w:right w:w="100" w:type="dxa"/>
-        </w:tblCellMar>
-      </w:tblPr>
-      <w:tblGrid>
-        <w:gridCol w:w="4248"/>
-        <w:gridCol w:w="1512"/>
-        <w:gridCol w:w="3600"/>
-      </w:tblGrid>
-      <w:tr>
-        <w:trPr>
-          <w:cantSplit/>
-          <w:tblHeader/>
-        </w:trPr>
-        <w:tc>
-          <w:tcPr>
-            <w:tcW w:type="dxa" w:w="4248"/>
-            <w:vAlign w:val="center"/>
-            <w:shd w:fill="EDF0F2"/>
-          </w:tcPr>
-          <w:p>
-            <w:pPr>
-              <w:keepNext/>
-              <w:spacing w:after="0" w:before="0" w:line="252" w:lineRule="auto"/>
-            </w:pPr>
-            <w:r>
-              <w:rPr>
-                <w:b/>
-                <w:sz w:val="21"/>
-              </w:rPr>
-              <w:t>Model or population</w:t>
-            </w:r>
-          </w:p>
-        </w:tc>
-        <w:tc>
-          <w:tcPr>
-            <w:tcW w:type="dxa" w:w="1512"/>
-            <w:vAlign w:val="center"/>
-            <w:shd w:fill="EDF0F2"/>
-          </w:tcPr>
-          <w:p>
-            <w:pPr>
-              <w:keepNext/>
-              <w:spacing w:after="0" w:before="0" w:line="252" w:lineRule="auto"/>
-            </w:pPr>
-            <w:r>
-              <w:rPr>
-                <w:b/>
-                <w:sz w:val="21"/>
-              </w:rPr>
-              <w:t>Respondents</w:t>
-            </w:r>
-          </w:p>
-        </w:tc>
-        <w:tc>
-          <w:tcPr>
-            <w:tcW w:type="dxa" w:w="3600"/>
-            <w:vAlign w:val="center"/>
-            <w:shd w:fill="EDF0F2"/>
-          </w:tcPr>
-          <w:p>
-            <w:pPr>
-              <w:keepNext/>
-              <w:spacing w:after="0" w:before="0" w:line="252" w:lineRule="auto"/>
-            </w:pPr>
-            <w:r>
-              <w:rPr>
-                <w:b/>
-                <w:sz w:val="21"/>
-              </w:rPr>
-              <w:t>Difference in distress, pp (95% CI)</w:t>
-            </w:r>
-          </w:p>
-        </w:tc>
-      </w:tr>
-      <w:tr>
-        <w:trPr>
-          <w:cantSplit/>
-        </w:trPr>
-        <w:tc>
-          <w:tcPr>
-            <w:tcW w:type="dxa" w:w="4248"/>
-            <w:vAlign w:val="center"/>
-          </w:tcPr>
-          <w:p>
-            <w:pPr>
-              <w:keepNext w:val="0"/>
-              <w:spacing w:after="0" w:before="0" w:line="252" w:lineRule="auto"/>
-            </w:pPr>
-            <w:r>
-              <w:rPr>
-                <w:b w:val="0"/>
-                <w:sz w:val="21"/>
-              </w:rPr>
-              <w:t>Primary model</w:t>
-            </w:r>
-          </w:p>
-        </w:tc>
-        <w:tc>
-          <w:tcPr>
-            <w:tcW w:type="dxa" w:w="1512"/>
-            <w:vAlign w:val="center"/>
-          </w:tcPr>
-          <w:p>
-            <w:pPr>
-              <w:keepNext w:val="0"/>
-              <w:spacing w:after="0" w:before="0" w:line="252" w:lineRule="auto"/>
-            </w:pPr>
-            <w:r>
-              <w:rPr>
-                <w:b w:val="0"/>
-                <w:sz w:val="21"/>
-              </w:rPr>
-              <w:t>193,060</w:t>
-            </w:r>
-          </w:p>
-        </w:tc>
-        <w:tc>
-          <w:tcPr>
-            <w:tcW w:type="dxa" w:w="3600"/>
-            <w:vAlign w:val="center"/>
-          </w:tcPr>
-          <w:p>
-            <w:pPr>
-              <w:keepNext w:val="0"/>
-              <w:spacing w:after="0" w:before="0" w:line="252" w:lineRule="auto"/>
-            </w:pPr>
-            <w:r>
-              <w:rPr>
-                <w:b w:val="0"/>
-                <w:sz w:val="21"/>
-              </w:rPr>
-              <w:t>-0.80 (-2.05 to 0.45)</w:t>
-            </w:r>
-          </w:p>
-        </w:tc>
-      </w:tr>
-      <w:tr>
-        <w:trPr>
-          <w:cantSplit/>
-        </w:trPr>
-        <w:tc>
-          <w:tcPr>
-            <w:tcW w:type="dxa" w:w="4248"/>
-            <w:vAlign w:val="center"/>
-          </w:tcPr>
-          <w:p>
-            <w:pPr>
-              <w:keepNext w:val="0"/>
-              <w:spacing w:after="0" w:before="0" w:line="252" w:lineRule="auto"/>
-            </w:pPr>
-            <w:r>
-              <w:rPr>
-                <w:b w:val="0"/>
-                <w:sz w:val="21"/>
-              </w:rPr>
-              <w:t>Without unemployment adjustment</w:t>
-            </w:r>
-          </w:p>
-        </w:tc>
-        <w:tc>
-          <w:tcPr>
-            <w:tcW w:type="dxa" w:w="1512"/>
-            <w:vAlign w:val="center"/>
-          </w:tcPr>
-          <w:p>
-            <w:pPr>
-              <w:keepNext w:val="0"/>
-              <w:spacing w:after="0" w:before="0" w:line="252" w:lineRule="auto"/>
-            </w:pPr>
-            <w:r>
-              <w:rPr>
-                <w:b w:val="0"/>
-                <w:sz w:val="21"/>
-              </w:rPr>
-              <w:t>193,060</w:t>
-            </w:r>
-          </w:p>
-        </w:tc>
-        <w:tc>
-          <w:tcPr>
-            <w:tcW w:type="dxa" w:w="3600"/>
-            <w:vAlign w:val="center"/>
-          </w:tcPr>
-          <w:p>
-            <w:pPr>
-              <w:keepNext w:val="0"/>
-              <w:spacing w:after="0" w:before="0" w:line="252" w:lineRule="auto"/>
-            </w:pPr>
-            <w:r>
-              <w:rPr>
-                <w:b w:val="0"/>
-                <w:sz w:val="21"/>
-              </w:rPr>
-              <w:t>-0.93 (-2.26 to 0.40)</w:t>
-            </w:r>
-          </w:p>
-        </w:tc>
-      </w:tr>
-      <w:tr>
-        <w:trPr>
-          <w:cantSplit/>
-        </w:trPr>
-        <w:tc>
-          <w:tcPr>
-            <w:tcW w:type="dxa" w:w="4248"/>
-            <w:vAlign w:val="center"/>
-          </w:tcPr>
-          <w:p>
-            <w:pPr>
-              <w:keepNext w:val="0"/>
-              <w:spacing w:after="0" w:before="0" w:line="252" w:lineRule="auto"/>
-            </w:pPr>
-            <w:r>
-              <w:rPr>
-                <w:b w:val="0"/>
-                <w:sz w:val="21"/>
-              </w:rPr>
-              <w:t>Previous-year conditions</w:t>
-            </w:r>
-          </w:p>
-        </w:tc>
-        <w:tc>
-          <w:tcPr>
-            <w:tcW w:type="dxa" w:w="1512"/>
-            <w:vAlign w:val="center"/>
-          </w:tcPr>
-          <w:p>
-            <w:pPr>
-              <w:keepNext w:val="0"/>
-              <w:spacing w:after="0" w:before="0" w:line="252" w:lineRule="auto"/>
-            </w:pPr>
-            <w:r>
-              <w:rPr>
-                <w:b w:val="0"/>
-                <w:sz w:val="21"/>
-              </w:rPr>
-              <w:t>193,060</w:t>
-            </w:r>
-          </w:p>
-        </w:tc>
-        <w:tc>
-          <w:tcPr>
-            <w:tcW w:type="dxa" w:w="3600"/>
-            <w:vAlign w:val="center"/>
-          </w:tcPr>
-          <w:p>
-            <w:pPr>
-              <w:keepNext w:val="0"/>
-              <w:spacing w:after="0" w:before="0" w:line="252" w:lineRule="auto"/>
-            </w:pPr>
-            <w:r>
-              <w:rPr>
-                <w:b w:val="0"/>
-                <w:sz w:val="21"/>
-              </w:rPr>
-              <w:t>0.92 (-0.50 to 2.34)</w:t>
-            </w:r>
-          </w:p>
-        </w:tc>
-      </w:tr>
-      <w:tr>
-        <w:trPr>
-          <w:cantSplit/>
-        </w:trPr>
-        <w:tc>
-          <w:tcPr>
-            <w:tcW w:type="dxa" w:w="4248"/>
-            <w:vAlign w:val="center"/>
-          </w:tcPr>
-          <w:p>
-            <w:pPr>
-              <w:keepNext w:val="0"/>
-              <w:spacing w:after="0" w:before="0" w:line="252" w:lineRule="auto"/>
-            </w:pPr>
-            <w:r>
-              <w:rPr>
-                <w:b w:val="0"/>
-                <w:sz w:val="21"/>
-              </w:rPr>
-              <w:t>Exclude 2020–2021</w:t>
-            </w:r>
-          </w:p>
-        </w:tc>
-        <w:tc>
-          <w:tcPr>
-            <w:tcW w:type="dxa" w:w="1512"/>
-            <w:vAlign w:val="center"/>
-          </w:tcPr>
-          <w:p>
-            <w:pPr>
-              <w:keepNext w:val="0"/>
-              <w:spacing w:after="0" w:before="0" w:line="252" w:lineRule="auto"/>
-            </w:pPr>
-            <w:r>
-              <w:rPr>
-                <w:b w:val="0"/>
-                <w:sz w:val="21"/>
-              </w:rPr>
-              <w:t>156,651</w:t>
-            </w:r>
-          </w:p>
-        </w:tc>
-        <w:tc>
-          <w:tcPr>
-            <w:tcW w:type="dxa" w:w="3600"/>
-            <w:vAlign w:val="center"/>
-          </w:tcPr>
-          <w:p>
-            <w:pPr>
-              <w:keepNext w:val="0"/>
-              <w:spacing w:after="0" w:before="0" w:line="252" w:lineRule="auto"/>
-            </w:pPr>
-            <w:r>
-              <w:rPr>
-                <w:b w:val="0"/>
-                <w:sz w:val="21"/>
-              </w:rPr>
-              <w:t>-0.13 (-1.27 to 1.02)</w:t>
-            </w:r>
-          </w:p>
-        </w:tc>
-      </w:tr>
-      <w:tr>
-        <w:trPr>
-          <w:cantSplit/>
-        </w:trPr>
-        <w:tc>
-          <w:tcPr>
-            <w:tcW w:type="dxa" w:w="4248"/>
-            <w:vAlign w:val="center"/>
-          </w:tcPr>
-          <w:p>
-            <w:pPr>
-              <w:keepNext w:val="0"/>
-              <w:spacing w:after="0" w:before="0" w:line="252" w:lineRule="auto"/>
-            </w:pPr>
-            <w:r>
-              <w:rPr>
-                <w:b w:val="0"/>
-                <w:sz w:val="21"/>
-              </w:rPr>
-              <w:t>State-specific linear trends</w:t>
-            </w:r>
-          </w:p>
-        </w:tc>
-        <w:tc>
-          <w:tcPr>
-            <w:tcW w:type="dxa" w:w="1512"/>
-            <w:vAlign w:val="center"/>
-          </w:tcPr>
-          <w:p>
-            <w:pPr>
-              <w:keepNext w:val="0"/>
-              <w:spacing w:after="0" w:before="0" w:line="252" w:lineRule="auto"/>
-            </w:pPr>
-            <w:r>
-              <w:rPr>
-                <w:b w:val="0"/>
-                <w:sz w:val="21"/>
-              </w:rPr>
-              <w:t>193,060</w:t>
-            </w:r>
-          </w:p>
-        </w:tc>
-        <w:tc>
-          <w:tcPr>
-            <w:tcW w:type="dxa" w:w="3600"/>
-            <w:vAlign w:val="center"/>
-          </w:tcPr>
-          <w:p>
-            <w:pPr>
-              <w:keepNext w:val="0"/>
-              <w:spacing w:after="0" w:before="0" w:line="252" w:lineRule="auto"/>
-            </w:pPr>
-            <w:r>
-              <w:rPr>
-                <w:b w:val="0"/>
-                <w:sz w:val="21"/>
-              </w:rPr>
-              <w:t>-1.17 (-2.65 to 0.31)</w:t>
-            </w:r>
-          </w:p>
-        </w:tc>
-      </w:tr>
-      <w:tr>
-        <w:trPr>
-          <w:cantSplit/>
-        </w:trPr>
-        <w:tc>
-          <w:tcPr>
-            <w:tcW w:type="dxa" w:w="4248"/>
-            <w:vAlign w:val="center"/>
-          </w:tcPr>
-          <w:p>
-            <w:pPr>
-              <w:keepNext w:val="0"/>
-              <w:spacing w:after="0" w:before="0" w:line="252" w:lineRule="auto"/>
-            </w:pPr>
-            <w:r>
-              <w:rPr>
-                <w:b w:val="0"/>
-                <w:sz w:val="21"/>
-              </w:rPr>
-              <w:t>Equal total weight per state-year</w:t>
-            </w:r>
-          </w:p>
-        </w:tc>
-        <w:tc>
-          <w:tcPr>
-            <w:tcW w:type="dxa" w:w="1512"/>
-            <w:vAlign w:val="center"/>
-          </w:tcPr>
-          <w:p>
-            <w:pPr>
-              <w:keepNext w:val="0"/>
-              <w:spacing w:after="0" w:before="0" w:line="252" w:lineRule="auto"/>
-            </w:pPr>
-            <w:r>
-              <w:rPr>
-                <w:b w:val="0"/>
-                <w:sz w:val="21"/>
-              </w:rPr>
-              <w:t>193,060</w:t>
-            </w:r>
-          </w:p>
-        </w:tc>
-        <w:tc>
-          <w:tcPr>
-            <w:tcW w:type="dxa" w:w="3600"/>
-            <w:vAlign w:val="center"/>
-          </w:tcPr>
-          <w:p>
-            <w:pPr>
-              <w:keepNext w:val="0"/>
-              <w:spacing w:after="0" w:before="0" w:line="252" w:lineRule="auto"/>
-            </w:pPr>
-            <w:r>
-              <w:rPr>
-                <w:b w:val="0"/>
-                <w:sz w:val="21"/>
-              </w:rPr>
-              <w:t>-0.43 (-1.88 to 1.02)</w:t>
-            </w:r>
-          </w:p>
-        </w:tc>
-      </w:tr>
-      <w:tr>
-        <w:trPr>
-          <w:cantSplit/>
-        </w:trPr>
-        <w:tc>
-          <w:tcPr>
-            <w:tcW w:type="dxa" w:w="4248"/>
-            <w:vAlign w:val="center"/>
-          </w:tcPr>
-          <w:p>
-            <w:pPr>
-              <w:keepNext w:val="0"/>
-              <w:spacing w:after="0" w:before="0" w:line="252" w:lineRule="auto"/>
-            </w:pPr>
-            <w:r>
-              <w:rPr>
-                <w:b w:val="0"/>
-                <w:sz w:val="21"/>
-              </w:rPr>
-              <w:t>46 continuously observed states</w:t>
-            </w:r>
-          </w:p>
-        </w:tc>
-        <w:tc>
-          <w:tcPr>
-            <w:tcW w:type="dxa" w:w="1512"/>
-            <w:vAlign w:val="center"/>
-          </w:tcPr>
-          <w:p>
-            <w:pPr>
-              <w:keepNext w:val="0"/>
-              <w:spacing w:after="0" w:before="0" w:line="252" w:lineRule="auto"/>
-            </w:pPr>
-            <w:r>
-              <w:rPr>
-                <w:b w:val="0"/>
-                <w:sz w:val="21"/>
-              </w:rPr>
-              <w:t>171,237</w:t>
-            </w:r>
-          </w:p>
-        </w:tc>
-        <w:tc>
-          <w:tcPr>
-            <w:tcW w:type="dxa" w:w="3600"/>
-            <w:vAlign w:val="center"/>
-          </w:tcPr>
-          <w:p>
-            <w:pPr>
-              <w:keepNext w:val="0"/>
-              <w:spacing w:after="0" w:before="0" w:line="252" w:lineRule="auto"/>
-            </w:pPr>
-            <w:r>
-              <w:rPr>
-                <w:b w:val="0"/>
-                <w:sz w:val="21"/>
-              </w:rPr>
-              <w:t>-0.78 (-2.27 to 0.72)</w:t>
-            </w:r>
-          </w:p>
-        </w:tc>
-      </w:tr>
-      <w:tr>
-        <w:trPr>
-          <w:cantSplit/>
-        </w:trPr>
-        <w:tc>
-          <w:tcPr>
-            <w:tcW w:type="dxa" w:w="4248"/>
-            <w:vAlign w:val="center"/>
-          </w:tcPr>
-          <w:p>
-            <w:pPr>
-              <w:keepNext w:val="0"/>
-              <w:spacing w:after="0" w:before="0" w:line="252" w:lineRule="auto"/>
-            </w:pPr>
-            <w:r>
-              <w:rPr>
-                <w:b w:val="0"/>
-                <w:sz w:val="21"/>
-              </w:rPr>
-              <w:t>Out of work &lt;1 year</w:t>
-            </w:r>
-          </w:p>
-        </w:tc>
-        <w:tc>
-          <w:tcPr>
-            <w:tcW w:type="dxa" w:w="1512"/>
-            <w:vAlign w:val="center"/>
-          </w:tcPr>
-          <w:p>
-            <w:pPr>
-              <w:keepNext w:val="0"/>
-              <w:spacing w:after="0" w:before="0" w:line="252" w:lineRule="auto"/>
-            </w:pPr>
-            <w:r>
-              <w:rPr>
-                <w:b w:val="0"/>
-                <w:sz w:val="21"/>
-              </w:rPr>
-              <w:t>103,820</w:t>
-            </w:r>
-          </w:p>
-        </w:tc>
-        <w:tc>
-          <w:tcPr>
-            <w:tcW w:type="dxa" w:w="3600"/>
-            <w:vAlign w:val="center"/>
-          </w:tcPr>
-          <w:p>
-            <w:pPr>
-              <w:keepNext w:val="0"/>
-              <w:spacing w:after="0" w:before="0" w:line="252" w:lineRule="auto"/>
-            </w:pPr>
-            <w:r>
-              <w:rPr>
-                <w:b w:val="0"/>
-                <w:sz w:val="21"/>
-              </w:rPr>
-              <w:t>-1.64 (-3.14 to -0.13)</w:t>
-            </w:r>
-          </w:p>
-        </w:tc>
-      </w:tr>
-      <w:tr>
-        <w:trPr>
-          <w:cantSplit/>
-        </w:trPr>
-        <w:tc>
-          <w:tcPr>
-            <w:tcW w:type="dxa" w:w="4248"/>
-            <w:vAlign w:val="center"/>
-          </w:tcPr>
-          <w:p>
-            <w:pPr>
-              <w:keepNext w:val="0"/>
-              <w:spacing w:after="0" w:before="0" w:line="252" w:lineRule="auto"/>
-            </w:pPr>
-            <w:r>
-              <w:rPr>
-                <w:b w:val="0"/>
-                <w:sz w:val="21"/>
-              </w:rPr>
-              <w:t>Out of work ≥1 year</w:t>
-            </w:r>
-          </w:p>
-        </w:tc>
-        <w:tc>
-          <w:tcPr>
-            <w:tcW w:type="dxa" w:w="1512"/>
-            <w:vAlign w:val="center"/>
-          </w:tcPr>
-          <w:p>
-            <w:pPr>
-              <w:keepNext w:val="0"/>
-              <w:spacing w:after="0" w:before="0" w:line="252" w:lineRule="auto"/>
-            </w:pPr>
-            <w:r>
-              <w:rPr>
-                <w:b w:val="0"/>
-                <w:sz w:val="21"/>
-              </w:rPr>
-              <w:t>89,240</w:t>
-            </w:r>
-          </w:p>
-        </w:tc>
-        <w:tc>
-          <w:tcPr>
-            <w:tcW w:type="dxa" w:w="3600"/>
-            <w:vAlign w:val="center"/>
-          </w:tcPr>
-          <w:p>
-            <w:pPr>
-              <w:keepNext w:val="0"/>
-              <w:spacing w:after="0" w:before="0" w:line="252" w:lineRule="auto"/>
-            </w:pPr>
-            <w:r>
-              <w:rPr>
-                <w:b w:val="0"/>
-                <w:sz w:val="21"/>
-              </w:rPr>
-              <w:t>0.65 (-1.50 to 2.79)</w:t>
-            </w:r>
-          </w:p>
-        </w:tc>
-      </w:tr>
-      <w:tr>
-        <w:trPr>
-          <w:cantSplit/>
-        </w:trPr>
-        <w:tc>
-          <w:tcPr>
-            <w:tcW w:type="dxa" w:w="4248"/>
-            <w:vAlign w:val="center"/>
-          </w:tcPr>
-          <w:p>
-            <w:pPr>
-              <w:keepNext w:val="0"/>
-              <w:spacing w:after="0" w:before="0" w:line="252" w:lineRule="auto"/>
-            </w:pPr>
-            <w:r>
-              <w:rPr>
-                <w:b w:val="0"/>
-                <w:sz w:val="21"/>
-              </w:rPr>
-              <w:t>Employed adults</w:t>
-            </w:r>
-          </w:p>
-        </w:tc>
-        <w:tc>
-          <w:tcPr>
-            <w:tcW w:type="dxa" w:w="1512"/>
-            <w:vAlign w:val="center"/>
-          </w:tcPr>
-          <w:p>
-            <w:pPr>
-              <w:keepNext w:val="0"/>
-              <w:spacing w:after="0" w:before="0" w:line="252" w:lineRule="auto"/>
-            </w:pPr>
-            <w:r>
-              <w:rPr>
-                <w:b w:val="0"/>
-                <w:sz w:val="21"/>
-              </w:rPr>
-              <w:t>2,223,024</w:t>
-            </w:r>
-          </w:p>
-        </w:tc>
-        <w:tc>
-          <w:tcPr>
-            <w:tcW w:type="dxa" w:w="3600"/>
-            <w:vAlign w:val="center"/>
-          </w:tcPr>
-          <w:p>
-            <w:pPr>
-              <w:keepNext w:val="0"/>
-              <w:spacing w:after="0" w:before="0" w:line="252" w:lineRule="auto"/>
-            </w:pPr>
-            <w:r>
-              <w:rPr>
-                <w:b w:val="0"/>
-                <w:sz w:val="21"/>
-              </w:rPr>
-              <w:t>0.01 (-0.37 to 0.40)</w:t>
-            </w:r>
-          </w:p>
-        </w:tc>
-      </w:tr>
-      <w:tr>
-        <w:trPr>
-          <w:cantSplit/>
-        </w:trPr>
-        <w:tc>
-          <w:tcPr>
-            <w:tcW w:type="dxa" w:w="4248"/>
-            <w:vAlign w:val="center"/>
-          </w:tcPr>
-          <w:p>
-            <w:pPr>
-              <w:keepNext w:val="0"/>
-              <w:spacing w:after="0" w:before="0" w:line="252" w:lineRule="auto"/>
-            </w:pPr>
-            <w:r>
-              <w:rPr>
-                <w:b w:val="0"/>
-                <w:sz w:val="21"/>
-              </w:rPr>
-              <w:t>Through 2025: 11-month unemployment input</w:t>
-            </w:r>
-          </w:p>
-        </w:tc>
-        <w:tc>
-          <w:tcPr>
-            <w:tcW w:type="dxa" w:w="1512"/>
-            <w:vAlign w:val="center"/>
-          </w:tcPr>
-          <w:p>
-            <w:pPr>
-              <w:keepNext w:val="0"/>
-              <w:spacing w:after="0" w:before="0" w:line="252" w:lineRule="auto"/>
-            </w:pPr>
-            <w:r>
-              <w:rPr>
-                <w:b w:val="0"/>
-                <w:sz w:val="21"/>
-              </w:rPr>
-              <w:t>205,592</w:t>
-            </w:r>
-          </w:p>
-        </w:tc>
-        <w:tc>
-          <w:tcPr>
-            <w:tcW w:type="dxa" w:w="3600"/>
-            <w:vAlign w:val="center"/>
-          </w:tcPr>
-          <w:p>
-            <w:pPr>
-              <w:keepNext w:val="0"/>
-              <w:spacing w:after="0" w:before="0" w:line="252" w:lineRule="auto"/>
-            </w:pPr>
-            <w:r>
-              <w:rPr>
-                <w:b w:val="0"/>
-                <w:sz w:val="21"/>
-              </w:rPr>
-              <w:t>-0.40 (-1.86 to 1.07)</w:t>
-            </w:r>
-          </w:p>
-        </w:tc>
-      </w:tr>
-      <w:tr>
-        <w:trPr>
-          <w:cantSplit/>
-        </w:trPr>
-        <w:tc>
-          <w:tcPr>
-            <w:tcW w:type="dxa" w:w="4248"/>
-            <w:vAlign w:val="center"/>
-          </w:tcPr>
-          <w:p>
-            <w:pPr>
-              <w:keepNext w:val="0"/>
-              <w:spacing w:after="0" w:before="0" w:line="252" w:lineRule="auto"/>
-            </w:pPr>
-            <w:r>
-              <w:rPr>
-                <w:b w:val="0"/>
-                <w:sz w:val="21"/>
-              </w:rPr>
-              <w:t>Logistic average marginal association (post hoc)</w:t>
-            </w:r>
-          </w:p>
-        </w:tc>
-        <w:tc>
-          <w:tcPr>
-            <w:tcW w:type="dxa" w:w="1512"/>
-            <w:vAlign w:val="center"/>
-          </w:tcPr>
-          <w:p>
-            <w:pPr>
-              <w:keepNext w:val="0"/>
-              <w:spacing w:after="0" w:before="0" w:line="252" w:lineRule="auto"/>
-            </w:pPr>
-            <w:r>
-              <w:rPr>
-                <w:b w:val="0"/>
-                <w:sz w:val="21"/>
-              </w:rPr>
-              <w:t>193,060</w:t>
-            </w:r>
-          </w:p>
-        </w:tc>
-        <w:tc>
-          <w:tcPr>
-            <w:tcW w:type="dxa" w:w="3600"/>
-            <w:vAlign w:val="center"/>
-          </w:tcPr>
-          <w:p>
-            <w:pPr>
-              <w:keepNext w:val="0"/>
-              <w:spacing w:after="0" w:before="0" w:line="252" w:lineRule="auto"/>
-            </w:pPr>
-            <w:r>
-              <w:rPr>
-                <w:b w:val="0"/>
-                <w:sz w:val="21"/>
-              </w:rPr>
-              <w:t>-0.65 (-1.88 to 0.59)</w:t>
-            </w:r>
-          </w:p>
-        </w:tc>
-      </w:tr>
-    </w:tbl>
-    <w:p>
-      <w:pPr>
-        <w:spacing w:line="252" w:lineRule="auto" w:after="180"/>
-      </w:pPr>
-      <w:r>
-        <w:rPr>
-          <w:sz w:val="20"/>
-        </w:rPr>
-        <w:t>All rows use a one-percentage-point lower hiring rate; all except the explicitly unadjusted-for-unemployment row include unemployment. The continuous-days check gave -0.19 (-0.58 to 0.20) mentally unhealthy days per month. The outcome units in this last estimate are days, not percentage points. Full coefficients, including the unemployment term in every model, are in results/models.csv.</w:t>
-      </w:r>
-    </w:p>
-    <w:p>
-      <w:r>
-        <w:t>The main linear model’s predicted probabilities were outside zero to one for 0.009% of the weighted out-of-work sample. The logistic check uses the same covariates and state-clustered delta-method uncertainty for the average marginal association. It was added after inspecting the initial model diagnostics and is therefore labeled post hoc. All other checks above were specified before fitting. Leave-one-state-out hiring estimates ranged from -1.07 to -0.33 percentage points; omitting one state did not turn the primary estimate into a positive point estimate.</w:t>
+        <w:t>Jacob E. Thomas is affiliated with Results Generation, a recruitment-marketing firm in Austin, Texas. This industry relationship is relevant to the argument. The views expressed are his own. Correspondence: jacob.thomas@resultsgeneration.com. No external funding supported this work. The analysis used deidentified, publicly released records; no participants were recruited and no proprietary applicant data were used.</w:t>
       </w:r>
     </w:p>
     <w:p>
@@ -2185,7 +237,7 @@
         </w:rPr>
         <w:t xml:space="preserve">1. Rugaber C. “No hire” job market leaves unemployed in limbo as threats to economy multiply. Associated Press. November 7, 2025. </w:t>
       </w:r>
-      <w:hyperlink r:id="rId11">
+      <w:hyperlink r:id="rId10">
         <w:r>
           <w:rPr>
             <w:color w:val="244D5B"/>
@@ -2207,7 +259,7 @@
         </w:rPr>
         <w:t xml:space="preserve">2. Paul KI, Moser K. Unemployment impairs mental health: Meta-analyses. Journal of Vocational Behavior. 2009;74(3):264–282. </w:t>
       </w:r>
-      <w:hyperlink r:id="rId12">
+      <w:hyperlink r:id="rId11">
         <w:r>
           <w:rPr>
             <w:color w:val="244D5B"/>
@@ -2229,7 +281,7 @@
         </w:rPr>
         <w:t xml:space="preserve">3. Charles KK, DeCicca P. Local labor market fluctuations and health: Is there a connection and for whom? Journal of Health Economics. 2008;27(6):1532–1550. </w:t>
       </w:r>
-      <w:hyperlink r:id="rId13">
+      <w:hyperlink r:id="rId12">
         <w:r>
           <w:rPr>
             <w:color w:val="244D5B"/>
@@ -2251,7 +303,7 @@
         </w:rPr>
         <w:t xml:space="preserve">4. Farré L, Fasani F, Mueller H. Feeling useless: The effect of unemployment on mental health in the Great Recession. IZA Journal of Labor Economics. 2018;7:8. </w:t>
       </w:r>
-      <w:hyperlink r:id="rId14">
+      <w:hyperlink r:id="rId13">
         <w:r>
           <w:rPr>
             <w:color w:val="244D5B"/>
@@ -2271,9 +323,273 @@
         <w:rPr>
           <w:sz w:val="21"/>
         </w:rPr>
-        <w:t xml:space="preserve">5. Clark AE. Unemployment as a social norm: Psychological evidence from panel data. Journal of Labor Economics. 2003;21(2):323–351. </w:t>
+        <w:t xml:space="preserve">5. Song Z, Uy MA, Zhang S, Shi K. Daily job search and psychological distress: Evidence from China. Human Relations. 2009;62(8):1171–1197. </w:t>
+      </w:r>
+      <w:hyperlink r:id="rId14">
+        <w:r>
+          <w:rPr>
+            <w:color w:val="244D5B"/>
+            <w:sz w:val="21"/>
+          </w:rPr>
+          <w:t>https://doi.org/10.1177/0018726709334883</w:t>
+        </w:r>
+      </w:hyperlink>
+    </w:p>
+    <w:p>
+      <w:pPr>
+        <w:keepLines/>
+        <w:spacing w:line="252" w:lineRule="auto" w:after="120"/>
+        <w:ind w:left="331" w:hanging="331"/>
+      </w:pPr>
+      <w:r>
+        <w:rPr>
+          <w:sz w:val="21"/>
+        </w:rPr>
+        <w:t xml:space="preserve">6. Price RH, Choi JN, Vinokur AD. Links in the chain of adversity following job loss: How financial strain and loss of personal control lead to depression, impaired functioning, and poor health. Journal of Occupational Health Psychology. 2002;7(4):302–312. </w:t>
       </w:r>
       <w:hyperlink r:id="rId15">
+        <w:r>
+          <w:rPr>
+            <w:color w:val="244D5B"/>
+            <w:sz w:val="21"/>
+          </w:rPr>
+          <w:t>https://doi.org/10.1037/1076-8998.7.4.302</w:t>
+        </w:r>
+      </w:hyperlink>
+    </w:p>
+    <w:p>
+      <w:pPr>
+        <w:keepLines/>
+        <w:spacing w:line="252" w:lineRule="auto" w:after="120"/>
+        <w:ind w:left="331" w:hanging="331"/>
+      </w:pPr>
+      <w:r>
+        <w:rPr>
+          <w:sz w:val="21"/>
+        </w:rPr>
+        <w:t xml:space="preserve">7. Wanberg CR, van Hooft EAJ, Dossinger K, van Vianen AEM, Klehe UC. How strong is my safety net? Perceived unemployment insurance generosity and implications for job search, mental health, and reemployment. Journal of Applied Psychology. 2020;105(3):209–229. </w:t>
+      </w:r>
+      <w:hyperlink r:id="rId16">
+        <w:r>
+          <w:rPr>
+            <w:color w:val="244D5B"/>
+            <w:sz w:val="21"/>
+          </w:rPr>
+          <w:t>https://doi.org/10.1037/apl0000435</w:t>
+        </w:r>
+      </w:hyperlink>
+    </w:p>
+    <w:p>
+      <w:pPr>
+        <w:keepLines/>
+        <w:spacing w:line="252" w:lineRule="auto" w:after="120"/>
+        <w:ind w:left="331" w:hanging="331"/>
+      </w:pPr>
+      <w:r>
+        <w:rPr>
+          <w:sz w:val="21"/>
+        </w:rPr>
+        <w:t xml:space="preserve">8. Bjørnshagen V. The mark of mental health problems. A field experiment on hiring discrimination before and during COVID-19. Social Science &amp; Medicine. 2021;283:114181. </w:t>
+      </w:r>
+      <w:hyperlink r:id="rId17">
+        <w:r>
+          <w:rPr>
+            <w:color w:val="244D5B"/>
+            <w:sz w:val="21"/>
+          </w:rPr>
+          <w:t>https://doi.org/10.1016/j.socscimed.2021.114181</w:t>
+        </w:r>
+      </w:hyperlink>
+    </w:p>
+    <w:p>
+      <w:pPr>
+        <w:keepLines/>
+        <w:spacing w:line="252" w:lineRule="auto" w:after="120"/>
+        <w:ind w:left="331" w:hanging="331"/>
+      </w:pPr>
+      <w:r>
+        <w:rPr>
+          <w:sz w:val="21"/>
+        </w:rPr>
+        <w:t xml:space="preserve">9. Chan E. 2024 Job Seeker Insights Report: 1,000 candidates weigh in on the job search. Resume Genius. 2024. </w:t>
+      </w:r>
+      <w:hyperlink r:id="rId18">
+        <w:r>
+          <w:rPr>
+            <w:color w:val="244D5B"/>
+            <w:sz w:val="21"/>
+          </w:rPr>
+          <w:t>https://resumegenius.com/blog/job-hunting/job-seeker-insights-survey</w:t>
+        </w:r>
+      </w:hyperlink>
+    </w:p>
+    <w:p>
+      <w:pPr>
+        <w:keepLines/>
+        <w:spacing w:line="252" w:lineRule="auto" w:after="120"/>
+        <w:ind w:left="331" w:hanging="331"/>
+      </w:pPr>
+      <w:r>
+        <w:rPr>
+          <w:sz w:val="21"/>
+        </w:rPr>
+        <w:t xml:space="preserve">10. Robinson B. 72% of applicants say the job search has harmed their mental health. Forbes. September 20, 2024. </w:t>
+      </w:r>
+      <w:hyperlink r:id="rId19">
+        <w:r>
+          <w:rPr>
+            <w:color w:val="244D5B"/>
+            <w:sz w:val="21"/>
+          </w:rPr>
+          <w:t>https://www.forbes.com/sites/bryanrobinson/2024/09/20/72-of-applicants-say-the-job-search-has-harmed-their-mental-health/</w:t>
+        </w:r>
+      </w:hyperlink>
+    </w:p>
+    <w:p>
+      <w:pPr>
+        <w:keepLines/>
+        <w:spacing w:line="252" w:lineRule="auto" w:after="120"/>
+        <w:ind w:left="331" w:hanging="331"/>
+      </w:pPr>
+      <w:r>
+        <w:rPr>
+          <w:sz w:val="21"/>
+        </w:rPr>
+        <w:t xml:space="preserve">11. Alobeid D. Ghosting, ghost jobs and bots: Candidates reveal their top challenges in the Greenhouse 2024 State of Job Hunting report. Greenhouse. December 10, 2024. </w:t>
+      </w:r>
+      <w:hyperlink r:id="rId20">
+        <w:r>
+          <w:rPr>
+            <w:color w:val="244D5B"/>
+            <w:sz w:val="21"/>
+          </w:rPr>
+          <w:t>https://www.greenhouse.com/blog/greenhouse-2024-state-of-job-hunting-report</w:t>
+        </w:r>
+      </w:hyperlink>
+    </w:p>
+    <w:p>
+      <w:pPr>
+        <w:keepLines/>
+        <w:spacing w:line="252" w:lineRule="auto" w:after="120"/>
+        <w:ind w:left="331" w:hanging="331"/>
+      </w:pPr>
+      <w:r>
+        <w:rPr>
+          <w:sz w:val="21"/>
+        </w:rPr>
+        <w:t xml:space="preserve">12. Wright S. The Q1 2026 Job Search Trends Report. Huntr. 2026. </w:t>
+      </w:r>
+      <w:hyperlink r:id="rId21">
+        <w:r>
+          <w:rPr>
+            <w:color w:val="244D5B"/>
+            <w:sz w:val="21"/>
+          </w:rPr>
+          <w:t>https://huntr.co/research/job-search-trends-q1-2026</w:t>
+        </w:r>
+      </w:hyperlink>
+    </w:p>
+    <w:p>
+      <w:pPr>
+        <w:keepLines/>
+        <w:spacing w:line="252" w:lineRule="auto" w:after="120"/>
+        <w:ind w:left="331" w:hanging="331"/>
+      </w:pPr>
+      <w:r>
+        <w:rPr>
+          <w:sz w:val="21"/>
+        </w:rPr>
+        <w:t xml:space="preserve">13. Miller S, Piazza M, Bogue Simpson E, Broady K. Worker perspectives: When every dollar counts—inside the economic struggles of workers who earn low to moderate incomes. Federal Reserve; Fed Communities. June 24, 2026. </w:t>
+      </w:r>
+      <w:hyperlink r:id="rId22">
+        <w:r>
+          <w:rPr>
+            <w:color w:val="244D5B"/>
+            <w:sz w:val="21"/>
+          </w:rPr>
+          <w:t>https://doi.org/10.59695/20260624</w:t>
+        </w:r>
+      </w:hyperlink>
+    </w:p>
+    <w:p>
+      <w:pPr>
+        <w:keepLines/>
+        <w:spacing w:line="252" w:lineRule="auto" w:after="120"/>
+        <w:ind w:left="331" w:hanging="331"/>
+      </w:pPr>
+      <w:r>
+        <w:rPr>
+          <w:sz w:val="21"/>
+        </w:rPr>
+        <w:t xml:space="preserve">14. Ng H. Why is it so hard to find a job now? Enter Ghost Jobs. arXiv:2410.21771v1 [preprint]. October 29, 2024. </w:t>
+      </w:r>
+      <w:hyperlink r:id="rId23">
+        <w:r>
+          <w:rPr>
+            <w:color w:val="244D5B"/>
+            <w:sz w:val="21"/>
+          </w:rPr>
+          <w:t>https://arxiv.org/abs/2410.21771v1</w:t>
+        </w:r>
+      </w:hyperlink>
+    </w:p>
+    <w:p>
+      <w:pPr>
+        <w:keepLines/>
+        <w:spacing w:line="252" w:lineRule="auto" w:after="120"/>
+        <w:ind w:left="331" w:hanging="331"/>
+      </w:pPr>
+      <w:r>
+        <w:rPr>
+          <w:sz w:val="21"/>
+        </w:rPr>
+        <w:t xml:space="preserve">15. Centers for Disease Control and Prevention. Behavioral Risk Factor Surveillance System: Annual survey data and documentation, 2013–2025. Accessed September 29, 2026. </w:t>
+      </w:r>
+      <w:hyperlink r:id="rId24">
+        <w:r>
+          <w:rPr>
+            <w:color w:val="244D5B"/>
+            <w:sz w:val="21"/>
+          </w:rPr>
+          <w:t>https://www.cdc.gov/brfss/annual_data/annual_data.htm</w:t>
+        </w:r>
+      </w:hyperlink>
+    </w:p>
+    <w:p>
+      <w:pPr>
+        <w:keepLines/>
+        <w:spacing w:line="252" w:lineRule="auto" w:after="120"/>
+        <w:ind w:left="331" w:hanging="331"/>
+      </w:pPr>
+      <w:r>
+        <w:rPr>
+          <w:sz w:val="21"/>
+        </w:rPr>
+        <w:t xml:space="preserve">16. Centers for Disease Control and Prevention. FAQs about health-related quality-of-life measures: Frequent mental distress. Archived resource. Accessed September 29, 2026. </w:t>
+      </w:r>
+      <w:hyperlink r:id="rId25">
+        <w:r>
+          <w:rPr>
+            <w:color w:val="244D5B"/>
+            <w:sz w:val="21"/>
+          </w:rPr>
+          <w:t>https://archive.cdc.gov/www_cdc_gov/hrqol/faqs.htm</w:t>
+        </w:r>
+      </w:hyperlink>
+    </w:p>
+    <w:p>
+      <w:pPr>
+        <w:keepLines/>
+        <w:spacing w:line="252" w:lineRule="auto" w:after="120"/>
+        <w:ind w:left="331" w:hanging="331"/>
+      </w:pPr>
+      <w:r>
+        <w:rPr>
+          <w:sz w:val="21"/>
+        </w:rPr>
+        <w:t xml:space="preserve">17. Clark AE. Unemployment as a social norm: Psychological evidence from panel data. Journal of Labor Economics. 2003;21(2):323–351. </w:t>
+      </w:r>
+      <w:hyperlink r:id="rId26">
         <w:r>
           <w:rPr>
             <w:color w:val="244D5B"/>
@@ -2293,15 +609,15 @@
         <w:rPr>
           <w:sz w:val="21"/>
         </w:rPr>
-        <w:t xml:space="preserve">6. Gagné T, Schoon I, Sacker A. Trends in young adults’ mental distress and its association with employment: Evidence from the Behavioral Risk Factor Surveillance System, 1993–2019. Preventive Medicine. 2021;150:106691. </w:t>
+        <w:t xml:space="preserve">18. Vinokur AD, Schul Y, Vuori J, Price RH. Two years after a job loss: Long-term impact of the JOBS program on reemployment and mental health. Journal of Occupational Health Psychology. 2000;5(1):32–47. </w:t>
       </w:r>
-      <w:hyperlink r:id="rId16">
+      <w:hyperlink r:id="rId27">
         <w:r>
           <w:rPr>
             <w:color w:val="244D5B"/>
             <w:sz w:val="21"/>
           </w:rPr>
-          <w:t>https://doi.org/10.1016/j.ypmed.2021.106691</w:t>
+          <w:t>https://doi.org/10.1037/1076-8998.5.1.32</w:t>
         </w:r>
       </w:hyperlink>
     </w:p>
@@ -2315,295 +631,9 @@
         <w:rPr>
           <w:sz w:val="21"/>
         </w:rPr>
-        <w:t xml:space="preserve">7. Song Z, Uy MA, Zhang S, Shi K. Daily job search and psychological distress: Evidence from China. Human Relations. 2009;62(8):1171–1197. </w:t>
-      </w:r>
-      <w:hyperlink r:id="rId17">
-        <w:r>
-          <w:rPr>
-            <w:color w:val="244D5B"/>
-            <w:sz w:val="21"/>
-          </w:rPr>
-          <w:t>https://doi.org/10.1177/0018726709334883</w:t>
-        </w:r>
-      </w:hyperlink>
-    </w:p>
-    <w:p>
-      <w:pPr>
-        <w:keepLines/>
-        <w:spacing w:line="252" w:lineRule="auto" w:after="120"/>
-        <w:ind w:left="331" w:hanging="331"/>
-      </w:pPr>
-      <w:r>
-        <w:rPr>
-          <w:sz w:val="21"/>
-        </w:rPr>
-        <w:t xml:space="preserve">8. Price RH, Choi JN, Vinokur AD. Links in the chain of adversity following job loss: How financial strain and loss of personal control lead to depression, impaired functioning, and poor health. Journal of Occupational Health Psychology. 2002;7(4):302–312. </w:t>
-      </w:r>
-      <w:hyperlink r:id="rId18">
-        <w:r>
-          <w:rPr>
-            <w:color w:val="244D5B"/>
-            <w:sz w:val="21"/>
-          </w:rPr>
-          <w:t>https://doi.org/10.1037/1076-8998.7.4.302</w:t>
-        </w:r>
-      </w:hyperlink>
-    </w:p>
-    <w:p>
-      <w:pPr>
-        <w:keepLines/>
-        <w:spacing w:line="252" w:lineRule="auto" w:after="120"/>
-        <w:ind w:left="331" w:hanging="331"/>
-      </w:pPr>
-      <w:r>
-        <w:rPr>
-          <w:sz w:val="21"/>
-        </w:rPr>
-        <w:t xml:space="preserve">9. Wanberg CR, van Hooft EAJ, Dossinger K, van Vianen AEM, Klehe UC. How strong is my safety net? Perceived unemployment insurance generosity and implications for job search, mental health, and reemployment. Journal of Applied Psychology. 2020;105(3):209–229. </w:t>
-      </w:r>
-      <w:hyperlink r:id="rId19">
-        <w:r>
-          <w:rPr>
-            <w:color w:val="244D5B"/>
-            <w:sz w:val="21"/>
-          </w:rPr>
-          <w:t>https://doi.org/10.1037/apl0000435</w:t>
-        </w:r>
-      </w:hyperlink>
-    </w:p>
-    <w:p>
-      <w:pPr>
-        <w:keepLines/>
-        <w:spacing w:line="252" w:lineRule="auto" w:after="120"/>
-        <w:ind w:left="331" w:hanging="331"/>
-      </w:pPr>
-      <w:r>
-        <w:rPr>
-          <w:sz w:val="21"/>
-        </w:rPr>
-        <w:t xml:space="preserve">10. Bjørnshagen V. The mark of mental health problems. A field experiment on hiring discrimination before and during COVID-19. Social Science &amp; Medicine. 2021;283:114181. </w:t>
-      </w:r>
-      <w:hyperlink r:id="rId20">
-        <w:r>
-          <w:rPr>
-            <w:color w:val="244D5B"/>
-            <w:sz w:val="21"/>
-          </w:rPr>
-          <w:t>https://doi.org/10.1016/j.socscimed.2021.114181</w:t>
-        </w:r>
-      </w:hyperlink>
-    </w:p>
-    <w:p>
-      <w:pPr>
-        <w:keepLines/>
-        <w:spacing w:line="252" w:lineRule="auto" w:after="120"/>
-        <w:ind w:left="331" w:hanging="331"/>
-      </w:pPr>
-      <w:r>
-        <w:rPr>
-          <w:sz w:val="21"/>
-        </w:rPr>
-        <w:t xml:space="preserve">11. Hershbein BJ, Lim K, Webber D, Zabek M. Local labor market tightness and job quality: Evidence from job changers. Upjohn Institute Working Paper 26-433 [working paper]. July 2026. </w:t>
-      </w:r>
-      <w:hyperlink r:id="rId21">
-        <w:r>
-          <w:rPr>
-            <w:color w:val="244D5B"/>
-            <w:sz w:val="21"/>
-          </w:rPr>
-          <w:t>https://doi.org/10.17848/wp26-433</w:t>
-        </w:r>
-      </w:hyperlink>
-    </w:p>
-    <w:p>
-      <w:pPr>
-        <w:keepLines/>
-        <w:spacing w:line="252" w:lineRule="auto" w:after="120"/>
-        <w:ind w:left="331" w:hanging="331"/>
-      </w:pPr>
-      <w:r>
-        <w:rPr>
-          <w:sz w:val="21"/>
-        </w:rPr>
-        <w:t xml:space="preserve">12. Chan E. 2024 Job Seeker Insights Report: 1,000 candidates weigh in on the job search. Resume Genius. 2024. </w:t>
-      </w:r>
-      <w:hyperlink r:id="rId22">
-        <w:r>
-          <w:rPr>
-            <w:color w:val="244D5B"/>
-            <w:sz w:val="21"/>
-          </w:rPr>
-          <w:t>https://resumegenius.com/blog/job-hunting/job-seeker-insights-survey</w:t>
-        </w:r>
-      </w:hyperlink>
-    </w:p>
-    <w:p>
-      <w:pPr>
-        <w:keepLines/>
-        <w:spacing w:line="252" w:lineRule="auto" w:after="120"/>
-        <w:ind w:left="331" w:hanging="331"/>
-      </w:pPr>
-      <w:r>
-        <w:rPr>
-          <w:sz w:val="21"/>
-        </w:rPr>
-        <w:t xml:space="preserve">13. Robinson B. 72% of applicants say the job search has harmed their mental health. Forbes. September 20, 2024. </w:t>
-      </w:r>
-      <w:hyperlink r:id="rId23">
-        <w:r>
-          <w:rPr>
-            <w:color w:val="244D5B"/>
-            <w:sz w:val="21"/>
-          </w:rPr>
-          <w:t>https://www.forbes.com/sites/bryanrobinson/2024/09/20/72-of-applicants-say-the-job-search-has-harmed-their-mental-health/</w:t>
-        </w:r>
-      </w:hyperlink>
-    </w:p>
-    <w:p>
-      <w:pPr>
-        <w:keepLines/>
-        <w:spacing w:line="252" w:lineRule="auto" w:after="120"/>
-        <w:ind w:left="331" w:hanging="331"/>
-      </w:pPr>
-      <w:r>
-        <w:rPr>
-          <w:sz w:val="21"/>
-        </w:rPr>
-        <w:t xml:space="preserve">14. Alobeid D. Ghosting, ghost jobs and bots: Candidates reveal their top challenges in the Greenhouse 2024 State of Job Hunting report. Greenhouse. December 10, 2024. </w:t>
-      </w:r>
-      <w:hyperlink r:id="rId24">
-        <w:r>
-          <w:rPr>
-            <w:color w:val="244D5B"/>
-            <w:sz w:val="21"/>
-          </w:rPr>
-          <w:t>https://www.greenhouse.com/blog/greenhouse-2024-state-of-job-hunting-report</w:t>
-        </w:r>
-      </w:hyperlink>
-    </w:p>
-    <w:p>
-      <w:pPr>
-        <w:keepLines/>
-        <w:spacing w:line="252" w:lineRule="auto" w:after="120"/>
-        <w:ind w:left="331" w:hanging="331"/>
-      </w:pPr>
-      <w:r>
-        <w:rPr>
-          <w:sz w:val="21"/>
-        </w:rPr>
-        <w:t xml:space="preserve">15. Wright S. The Q1 2026 Job Search Trends Report. Huntr. 2026. </w:t>
-      </w:r>
-      <w:hyperlink r:id="rId25">
-        <w:r>
-          <w:rPr>
-            <w:color w:val="244D5B"/>
-            <w:sz w:val="21"/>
-          </w:rPr>
-          <w:t>https://huntr.co/research/job-search-trends-q1-2026</w:t>
-        </w:r>
-      </w:hyperlink>
-    </w:p>
-    <w:p>
-      <w:pPr>
-        <w:keepLines/>
-        <w:spacing w:line="252" w:lineRule="auto" w:after="120"/>
-        <w:ind w:left="331" w:hanging="331"/>
-      </w:pPr>
-      <w:r>
-        <w:rPr>
-          <w:sz w:val="21"/>
-        </w:rPr>
-        <w:t xml:space="preserve">16. Miller S, Piazza M, Bogue Simpson E, Broady K. Worker perspectives: When every dollar counts—inside the economic struggles of workers who earn low to moderate incomes. Federal Reserve; Fed Communities. June 24, 2026. </w:t>
-      </w:r>
-      <w:hyperlink r:id="rId26">
-        <w:r>
-          <w:rPr>
-            <w:color w:val="244D5B"/>
-            <w:sz w:val="21"/>
-          </w:rPr>
-          <w:t>https://doi.org/10.59695/20260624</w:t>
-        </w:r>
-      </w:hyperlink>
-    </w:p>
-    <w:p>
-      <w:pPr>
-        <w:keepLines/>
-        <w:spacing w:line="252" w:lineRule="auto" w:after="120"/>
-        <w:ind w:left="331" w:hanging="331"/>
-      </w:pPr>
-      <w:r>
-        <w:rPr>
-          <w:sz w:val="21"/>
-        </w:rPr>
-        <w:t xml:space="preserve">17. Ng H. Why is it so hard to find a job now? Enter Ghost Jobs. arXiv:2410.21771v1 [preprint]. October 29, 2024. </w:t>
-      </w:r>
-      <w:hyperlink r:id="rId27">
-        <w:r>
-          <w:rPr>
-            <w:color w:val="244D5B"/>
-            <w:sz w:val="21"/>
-          </w:rPr>
-          <w:t>https://arxiv.org/abs/2410.21771v1</w:t>
-        </w:r>
-      </w:hyperlink>
-    </w:p>
-    <w:p>
-      <w:pPr>
-        <w:keepLines/>
-        <w:spacing w:line="252" w:lineRule="auto" w:after="120"/>
-        <w:ind w:left="331" w:hanging="331"/>
-      </w:pPr>
-      <w:r>
-        <w:rPr>
-          <w:sz w:val="21"/>
-        </w:rPr>
-        <w:t xml:space="preserve">18. Centers for Disease Control and Prevention. Behavioral Risk Factor Surveillance System: Annual survey data and documentation, 2013–2025. Accessed September 29, 2026. </w:t>
+        <w:t xml:space="preserve">19. Bureau of Labor Statistics. JOLTS state estimates: Methodology. Accessed September 29, 2026. </w:t>
       </w:r>
       <w:hyperlink r:id="rId28">
-        <w:r>
-          <w:rPr>
-            <w:color w:val="244D5B"/>
-            <w:sz w:val="21"/>
-          </w:rPr>
-          <w:t>https://www.cdc.gov/brfss/annual_data/annual_data.htm</w:t>
-        </w:r>
-      </w:hyperlink>
-    </w:p>
-    <w:p>
-      <w:pPr>
-        <w:keepLines/>
-        <w:spacing w:line="252" w:lineRule="auto" w:after="120"/>
-        <w:ind w:left="331" w:hanging="331"/>
-      </w:pPr>
-      <w:r>
-        <w:rPr>
-          <w:sz w:val="21"/>
-        </w:rPr>
-        <w:t xml:space="preserve">19. Centers for Disease Control and Prevention. FAQs about health-related quality-of-life measures: Frequent mental distress. Archived resource. Accessed September 29, 2026. </w:t>
-      </w:r>
-      <w:hyperlink r:id="rId29">
-        <w:r>
-          <w:rPr>
-            <w:color w:val="244D5B"/>
-            <w:sz w:val="21"/>
-          </w:rPr>
-          <w:t>https://archive.cdc.gov/www_cdc_gov/hrqol/faqs.htm</w:t>
-        </w:r>
-      </w:hyperlink>
-    </w:p>
-    <w:p>
-      <w:pPr>
-        <w:keepLines/>
-        <w:spacing w:line="252" w:lineRule="auto" w:after="120"/>
-        <w:ind w:left="331" w:hanging="331"/>
-      </w:pPr>
-      <w:r>
-        <w:rPr>
-          <w:sz w:val="21"/>
-        </w:rPr>
-        <w:t xml:space="preserve">20. Bureau of Labor Statistics. JOLTS state estimates: Methodology. Accessed September 29, 2026. </w:t>
-      </w:r>
-      <w:hyperlink r:id="rId30">
         <w:r>
           <w:rPr>
             <w:color w:val="244D5B"/>
@@ -2623,9 +653,9 @@
         <w:rPr>
           <w:sz w:val="21"/>
         </w:rPr>
-        <w:t xml:space="preserve">21. Bureau of Labor Statistics. Local Area Unemployment Statistics: Overview. Accessed September 29, 2026. </w:t>
+        <w:t xml:space="preserve">20. Bureau of Labor Statistics. Local Area Unemployment Statistics: Overview. Accessed September 29, 2026. </w:t>
       </w:r>
-      <w:hyperlink r:id="rId31">
+      <w:hyperlink r:id="rId29">
         <w:r>
           <w:rPr>
             <w:color w:val="244D5B"/>
@@ -2645,15 +675,15 @@
         <w:rPr>
           <w:sz w:val="21"/>
         </w:rPr>
-        <w:t xml:space="preserve">22. Bureau of Labor Statistics. State employment and unemployment—January 2026. April 8, 2026. </w:t>
+        <w:t xml:space="preserve">21. Thomas JE. PsychologicalRecession. Public data, analysis code, manuscript, and audit records. GitHub repository. Revision dated September 30, 2026. </w:t>
       </w:r>
-      <w:hyperlink r:id="rId32">
+      <w:hyperlink r:id="rId30">
         <w:r>
           <w:rPr>
             <w:color w:val="244D5B"/>
             <w:sz w:val="21"/>
           </w:rPr>
-          <w:t>https://www.bls.gov/news.release/archives/laus_04082026.htm</w:t>
+          <w:t>https://github.com/jethomasphd/PsychologicalRecession</w:t>
         </w:r>
       </w:hyperlink>
     </w:p>
@@ -2667,37 +697,15 @@
         <w:rPr>
           <w:sz w:val="21"/>
         </w:rPr>
-        <w:t xml:space="preserve">23. Vinokur AD, Schul Y, Vuori J, Price RH. Two years after a job loss: Long-term impact of the JOBS program on reemployment and mental health. Journal of Occupational Health Psychology. 2000;5(1):32–47. </w:t>
+        <w:t xml:space="preserve">22. Bureau of Labor Statistics. State employment and unemployment—January 2026. April 8, 2026. </w:t>
       </w:r>
-      <w:hyperlink r:id="rId33">
+      <w:hyperlink r:id="rId31">
         <w:r>
           <w:rPr>
             <w:color w:val="244D5B"/>
             <w:sz w:val="21"/>
           </w:rPr>
-          <w:t>https://doi.org/10.1037/1076-8998.5.1.32</w:t>
-        </w:r>
-      </w:hyperlink>
-    </w:p>
-    <w:p>
-      <w:pPr>
-        <w:keepLines/>
-        <w:spacing w:line="252" w:lineRule="auto" w:after="120"/>
-        <w:ind w:left="331" w:hanging="331"/>
-      </w:pPr>
-      <w:r>
-        <w:rPr>
-          <w:sz w:val="21"/>
-        </w:rPr>
-        <w:t xml:space="preserve">24. Thomas JE. PsychologicalRecession. Public data, analysis code, manuscript, and audit records. GitHub repository. Revision dated September 29, 2026. </w:t>
-      </w:r>
-      <w:hyperlink r:id="rId34">
-        <w:r>
-          <w:rPr>
-            <w:color w:val="244D5B"/>
-            <w:sz w:val="21"/>
-          </w:rPr>
-          <w:t>https://github.com/jethomasphd/PsychologicalRecession</w:t>
+          <w:t>https://www.bls.gov/news.release/archives/laus_04082026.htm</w:t>
         </w:r>
       </w:hyperlink>
     </w:p>
@@ -3089,7 +1097,7 @@
     <w:rsid w:val="00FC693F"/>
     <w:pPr>
       <w:widowControl/>
-      <w:spacing w:line="274" w:lineRule="auto" w:after="140"/>
+      <w:spacing w:line="274" w:lineRule="auto" w:after="160"/>
     </w:pPr>
     <w:rPr>
       <w:rFonts w:ascii="Times New Roman" w:hAnsi="Times New Roman"/>
@@ -3152,7 +1160,7 @@
     <w:pPr>
       <w:keepNext/>
       <w:keepLines/>
-      <w:spacing w:before="240" w:after="120"/>
+      <w:spacing w:before="240" w:after="140"/>
       <w:outlineLvl w:val="0"/>
     </w:pPr>
     <w:rPr>
@@ -3161,7 +1169,7 @@
       <w:bCs/>
       <w:i w:val="0"/>
       <w:color w:val="111111"/>
-      <w:sz w:val="28"/>
+      <w:sz w:val="26"/>
       <w:szCs w:val="28"/>
     </w:rPr>
   </w:style>
@@ -3177,16 +1185,15 @@
     <w:pPr>
       <w:keepNext/>
       <w:keepLines/>
-      <w:spacing w:before="240" w:after="120"/>
+      <w:spacing w:before="200" w:after="0"/>
       <w:outlineLvl w:val="1"/>
     </w:pPr>
     <w:rPr>
-      <w:rFonts w:cstheme="majorBidi" w:ascii="Times New Roman" w:hAnsi="Times New Roman"/>
+      <w:rFonts w:cstheme="majorBidi"/>
       <w:b/>
       <w:bCs/>
-      <w:i w:val="0"/>
-      <w:color w:val="111111"/>
-      <w:sz w:val="24"/>
+      <w:color w:val="4F81BD" w:themeColor="accent1"/>
+      <w:sz w:val="26"/>
       <w:szCs w:val="26"/>
     </w:rPr>
   </w:style>
@@ -3441,7 +1448,7 @@
     <w:rsid w:val="00FC693F"/>
     <w:pPr>
       <w:keepNext/>
-      <w:spacing w:after="120" w:line="240" w:lineRule="auto" w:before="0"/>
+      <w:spacing w:after="140" w:line="240" w:lineRule="auto" w:before="0"/>
       <w:contextualSpacing/>
     </w:pPr>
     <w:rPr>
@@ -3449,6 +1456,7 @@
       <w:b/>
       <w:i w:val="0"/>
       <w:color w:val="111111"/>
+      <w:spacing w:val="5"/>
       <w:kern w:val="28"/>
       <w:sz w:val="46"/>
       <w:szCs w:val="52"/>
@@ -3463,6 +1471,7 @@
     <w:rPr>
       <w:rFonts w:cstheme="majorBidi"/>
       <w:color w:val="17365D" w:themeColor="text2" w:themeShade="BF"/>
+      <w:spacing w:val="5"/>
       <w:kern w:val="28"/>
       <w:sz w:val="52"/>
       <w:szCs w:val="52"/>
@@ -3481,7 +1490,7 @@
       <w:numPr>
         <w:ilvl w:val="1"/>
       </w:numPr>
-      <w:spacing w:before="0" w:after="120"/>
+      <w:spacing w:before="0" w:after="140"/>
     </w:pPr>
     <w:rPr>
       <w:rFonts w:cstheme="majorBidi" w:ascii="Times New Roman" w:hAnsi="Times New Roman"/>
@@ -3489,6 +1498,7 @@
       <w:i w:val="0"/>
       <w:iCs/>
       <w:color w:val="111111"/>
+      <w:spacing w:val="15"/>
       <w:sz w:val="26"/>
       <w:szCs w:val="24"/>
     </w:rPr>
@@ -3504,6 +1514,7 @@
       <w:i/>
       <w:iCs/>
       <w:color w:val="4F81BD" w:themeColor="accent1"/>
+      <w:spacing w:val="15"/>
       <w:sz w:val="24"/>
       <w:szCs w:val="24"/>
     </w:rPr>
@@ -3885,16 +1896,13 @@
     <w:qFormat/>
     <w:rsid w:val="00FC693F"/>
     <w:pPr>
-      <w:keepNext/>
-      <w:spacing w:line="240" w:lineRule="auto" w:before="0" w:after="120"/>
+      <w:spacing w:line="240" w:lineRule="auto"/>
     </w:pPr>
     <w:rPr>
-      <w:rFonts w:ascii="Times New Roman" w:hAnsi="Times New Roman"/>
       <w:b/>
       <w:bCs/>
-      <w:i w:val="0"/>
-      <w:color w:val="111111"/>
-      <w:sz w:val="22"/>
+      <w:color w:val="4F81BD" w:themeColor="accent1"/>
+      <w:sz w:val="18"/>
       <w:szCs w:val="18"/>
     </w:rPr>
   </w:style>
@@ -4003,6 +2011,7 @@
       <w:bCs/>
       <w:smallCaps/>
       <w:color w:val="C0504D" w:themeColor="accent2"/>
+      <w:spacing w:val="5"/>
       <w:u w:val="single"/>
     </w:rPr>
   </w:style>
@@ -4016,6 +2025,7 @@
       <w:b/>
       <w:bCs/>
       <w:smallCaps/>
+      <w:spacing w:val="5"/>
     </w:rPr>
   </w:style>
   <w:style w:type="paragraph" w:styleId="TOCHeading">

</xml_diff>